<commit_message>
Postman directo a la app de Vercel y documento unico de la IE2
- vercel.json reenvia /api/... al backend en Render, asi la API se prueba directo
  desde https://sistema-gestion-elsur.vercel.app.
- Entorno de Postman "GestaPro - Vercel"; se quitan el entorno local, el script
  para levantar el backend de prueba y el documento viejo de la guia.
- Un solo documento con el mapa comparativo, el paso a paso, el guion de la
  demostracion, las preguntas y la guia de estudio.
</commit_message>
<xml_diff>
--- a/docs/ie2/IE2_Equipo5_Mapa_Comparativo_y_Pruebas.docx
+++ b/docs/ie2/IE2_Equipo5_Mapa_Comparativo_y_Pruebas.docx
@@ -58,7 +58,7 @@
           <w:i w:val="0"/>
           <w:sz w:val="26"/>
         </w:rPr>
-        <w:t>Mapa comparativo y guía para probar el caso en vivo</w:t>
+        <w:t>Mapa comparativo, guía para probar el caso en vivo y guion de la demostración</w:t>
       </w:r>
     </w:p>
     <w:p>
@@ -798,7 +798,7 @@
                 <w:b w:val="0"/>
                 <w:sz w:val="18"/>
               </w:rPr>
-              <w:t>Cambia de entorno con un clic (Local / Publicado), pero necesita que el servidor ya esté prendido.</w:t>
+              <w:t>Le pega directo a la app publicada en Vercel (https://sistema-gestion-elsur.vercel.app/api/...), con un usuario real del sistema.</w:t>
             </w:r>
           </w:p>
         </w:tc>
@@ -1907,7 +1907,7 @@
                 <w:b w:val="0"/>
                 <w:sz w:val="18"/>
               </w:rPr>
-              <w:t>Backend en ejecución (local de prueba o publicado) y un usuario habilitado para obtener el token JWT.</w:t>
+              <w:t>App publicada en línea (Vercel / Render) y un usuario habilitado del sistema para obtener el token JWT.</w:t>
             </w:r>
           </w:p>
         </w:tc>
@@ -3410,13 +3410,37 @@
         <w:rPr>
           <w:b/>
         </w:rPr>
-        <w:t>GestaPro - Local (H2 de prueba)</w:t>
+        <w:t>GestaPro - Vercel (app publicada)</w:t>
       </w:r>
       <w:r>
         <w:rPr>
           <w:b w:val="0"/>
         </w:rPr>
-        <w:t>.</w:t>
+        <w:t xml:space="preserve"> → ícono del ojo → </w:t>
+      </w:r>
+      <w:r>
+        <w:rPr>
+          <w:b/>
+        </w:rPr>
+        <w:t>Edit</w:t>
+      </w:r>
+      <w:r>
+        <w:rPr>
+          <w:b w:val="0"/>
+        </w:rPr>
+        <w:t xml:space="preserve"> → cargar su usuario y contraseña del sistema </w:t>
+      </w:r>
+      <w:r>
+        <w:rPr>
+          <w:b/>
+        </w:rPr>
+        <w:t>solo en "Current value"</w:t>
+      </w:r>
+      <w:r>
+        <w:rPr>
+          <w:b w:val="0"/>
+        </w:rPr>
+        <w:t xml:space="preserve"> (así no se exportan ni se suben) → Save.</w:t>
       </w:r>
     </w:p>
     <w:p>
@@ -3484,43 +3508,19 @@
         <w:rPr>
           <w:b w:val="0"/>
         </w:rPr>
-        <w:t xml:space="preserve">Ir a </w:t>
+        <w:t xml:space="preserve">Unos minutos antes, abrir </w:t>
       </w:r>
       <w:r>
         <w:rPr>
           <w:b/>
         </w:rPr>
-        <w:t>docs/ie2</w:t>
+        <w:t>https://sistema-gestion-elsur.vercel.app</w:t>
       </w:r>
       <w:r>
         <w:rPr>
           <w:b w:val="0"/>
         </w:rPr>
-        <w:t xml:space="preserve"> y hacer doble clic en </w:t>
-      </w:r>
-      <w:r>
-        <w:rPr>
-          <w:b/>
-        </w:rPr>
-        <w:t>iniciar_backend_pruebas.cmd</w:t>
-      </w:r>
-      <w:r>
-        <w:rPr>
-          <w:b w:val="0"/>
-        </w:rPr>
-        <w:t xml:space="preserve">. Dejar abierta la ventana negra hasta que diga </w:t>
-      </w:r>
-      <w:r>
-        <w:rPr>
-          <w:b/>
-        </w:rPr>
-        <w:t>"[API de prueba] Usuario 'admin.api' listo"</w:t>
-      </w:r>
-      <w:r>
-        <w:rPr>
-          <w:b w:val="0"/>
-        </w:rPr>
-        <w:t xml:space="preserve"> (unos 30 segundos). Es el backend real con una base en memoria: no toca datos de El Sur.</w:t>
+        <w:t xml:space="preserve"> para despertar el servidor (en el plan gratis de Render tarda casi un minuto la primera vez).</w:t>
       </w:r>
     </w:p>
     <w:p>
@@ -3930,139 +3930,47 @@
         <w:pStyle w:val="Heading2"/>
       </w:pPr>
       <w:r>
-        <w:t>6.3 Postman: probar contra la app publicada (Render / Vercel)</w:t>
+        <w:t>6.3 ¿Cómo llega la petición de Vercel al backend?</w:t>
       </w:r>
     </w:p>
     <w:p>
       <w:pPr>
-        <w:spacing w:after="40"/>
-        <w:ind w:left="510" w:hanging="340"/>
+        <w:spacing w:after="80"/>
       </w:pPr>
       <w:r>
         <w:rPr>
+          <w:b w:val="0"/>
+          <w:i w:val="0"/>
+        </w:rPr>
+        <w:t xml:space="preserve">Vercel sirve el frontend y, por una regla de frontend/vercel.json, reenvía todo lo que empieza con </w:t>
+      </w:r>
+      <w:r>
+        <w:rPr>
           <w:b/>
+          <w:i w:val="0"/>
         </w:rPr>
-        <w:t xml:space="preserve">1. </w:t>
+        <w:t>/api/</w:t>
       </w:r>
       <w:r>
         <w:rPr>
           <w:b w:val="0"/>
+          <w:i w:val="0"/>
         </w:rPr>
-        <w:t>Unos minutos antes, abrir https://sistema-gestion-elsur.vercel.app para despertar el servidor de Render (en el plan gratis tarda casi un minuto la primera vez).</w:t>
+        <w:t xml:space="preserve"> al backend en Render. Así Postman le pega directo a </w:t>
       </w:r>
-    </w:p>
-    <w:p>
-      <w:pPr>
-        <w:spacing w:after="40"/>
-        <w:ind w:left="510" w:hanging="340"/>
-      </w:pPr>
       <w:r>
         <w:rPr>
           <w:b/>
+          <w:i w:val="0"/>
         </w:rPr>
-        <w:t xml:space="preserve">2. </w:t>
+        <w:t>https://sistema-gestion-elsur.vercel.app/api/clientes</w:t>
       </w:r>
       <w:r>
         <w:rPr>
           <w:b w:val="0"/>
+          <w:i w:val="0"/>
         </w:rPr>
-        <w:t xml:space="preserve">Elegir el entorno </w:t>
-      </w:r>
-      <w:r>
-        <w:rPr>
-          <w:b/>
-        </w:rPr>
-        <w:t>GestaPro - Publicado (Render / Vercel)</w:t>
-      </w:r>
-      <w:r>
-        <w:rPr>
-          <w:b w:val="0"/>
-        </w:rPr>
-        <w:t xml:space="preserve"> → ícono del ojo al lado del desplegable → </w:t>
-      </w:r>
-      <w:r>
-        <w:rPr>
-          <w:b/>
-        </w:rPr>
-        <w:t>Edit</w:t>
-      </w:r>
-      <w:r>
-        <w:rPr>
-          <w:b w:val="0"/>
-        </w:rPr>
-        <w:t>.</w:t>
-      </w:r>
-    </w:p>
-    <w:p>
-      <w:pPr>
-        <w:spacing w:after="40"/>
-        <w:ind w:left="510" w:hanging="340"/>
-      </w:pPr>
-      <w:r>
-        <w:rPr>
-          <w:b/>
-        </w:rPr>
-        <w:t xml:space="preserve">3. </w:t>
-      </w:r>
-      <w:r>
-        <w:rPr>
-          <w:b w:val="0"/>
-        </w:rPr>
-        <w:t xml:space="preserve">Cargar el usuario y la contraseña reales </w:t>
-      </w:r>
-      <w:r>
-        <w:rPr>
-          <w:b/>
-        </w:rPr>
-        <w:t>solo en "Current value"</w:t>
-      </w:r>
-      <w:r>
-        <w:rPr>
-          <w:b w:val="0"/>
-        </w:rPr>
-        <w:t xml:space="preserve"> (así no se exportan ni se suben). Guardar.</w:t>
-      </w:r>
-    </w:p>
-    <w:p>
-      <w:pPr>
-        <w:spacing w:after="40"/>
-        <w:ind w:left="510" w:hanging="340"/>
-      </w:pPr>
-      <w:r>
-        <w:rPr>
-          <w:b/>
-        </w:rPr>
-        <w:t xml:space="preserve">4. </w:t>
-      </w:r>
-      <w:r>
-        <w:rPr>
-          <w:b w:val="0"/>
-        </w:rPr>
-        <w:t xml:space="preserve">Mandar la misma petición con </w:t>
-      </w:r>
-      <w:r>
-        <w:rPr>
-          <w:b/>
-        </w:rPr>
-        <w:t>Send</w:t>
-      </w:r>
-      <w:r>
-        <w:rPr>
-          <w:b w:val="0"/>
-        </w:rPr>
-        <w:t xml:space="preserve">: tiene que dar </w:t>
-      </w:r>
-      <w:r>
-        <w:rPr>
-          <w:b/>
-        </w:rPr>
-        <w:t>201 Created</w:t>
-      </w:r>
-      <w:r>
-        <w:rPr>
-          <w:b w:val="0"/>
-        </w:rPr>
-        <w:t xml:space="preserve"> (con el backend ya desplegado con el último commit) y el cliente de prueba se borra solo.</w:t>
+        <w:t>. Como Vercel y Render se despliegan solos con cada push a la rama lucas, Postman siempre prueba la última versión publicada.</w:t>
       </w:r>
     </w:p>
     <w:p>
@@ -4377,7 +4285,7 @@
           <w:b w:val="0"/>
           <w:i w:val="0"/>
         </w:rPr>
-        <w:t xml:space="preserve"> (desde docs/ie2/postman, con el backend de prueba levantado):</w:t>
+        <w:t xml:space="preserve"> (desde docs/ie2/postman, contra la app de Vercel):</w:t>
       </w:r>
     </w:p>
     <w:tbl>
@@ -4403,7 +4311,7 @@
                 <w:rFonts w:ascii="Consolas" w:hAnsi="Consolas" w:eastAsia="Consolas"/>
                 <w:sz w:val="17"/>
               </w:rPr>
-              <w:t>npx newman run GestaPro_Registrar_Cliente.postman_collection.json -e GestaPro_Local.postman_environment.json</w:t>
+              <w:t>npx newman run GestaPro_Registrar_Cliente.postman_collection.json -e GestaPro_Vercel.postman_environment.json --env-var usuario=SU_USUARIO --env-var password=SU_CONTRASEÑA</w:t>
             </w:r>
           </w:p>
         </w:tc>
@@ -4481,7 +4389,7 @@
                 <w:rFonts w:ascii="Consolas" w:hAnsi="Consolas" w:eastAsia="Consolas"/>
                 <w:sz w:val="17"/>
               </w:rPr>
-              <w:t>.\mvnw.cmd test -Dtest=RegistrarClienteRestAssuredTest "-Dapi.url=https://sistema-gestion-elsur.onrender.com"</w:t>
+              <w:t>.\mvnw.cmd test -Dtest=RegistrarClienteRestAssuredTest "-Dapi.url=https://sistema-gestion-elsur.vercel.app"</w:t>
             </w:r>
           </w:p>
         </w:tc>
@@ -4728,7 +4636,7 @@
                 <w:b/>
                 <w:sz w:val="18"/>
               </w:rPr>
-              <w:t>Postman: "Could not get response"</w:t>
+              <w:t>La petición tarda o da error 502 / 504</w:t>
             </w:r>
           </w:p>
         </w:tc>
@@ -4742,7 +4650,7 @@
                 <w:b w:val="0"/>
                 <w:sz w:val="18"/>
               </w:rPr>
-              <w:t>El backend de prueba no está levantado o todavía arranca: abrir iniciar_backend_pruebas.cmd y esperar el mensaje "listo".</w:t>
+              <w:t>El servidor de Render estaba dormido: abrir la app de Vercel, esperar un minuto y volver a mandar.</w:t>
             </w:r>
           </w:p>
         </w:tc>
@@ -4772,7 +4680,7 @@
                 <w:b w:val="0"/>
                 <w:sz w:val="18"/>
               </w:rPr>
-              <w:t>El login falló: revisar usuario y contraseña del entorno (en Local: admin.api / ApiTest2026).</w:t>
+              <w:t>El login falló: revisar el usuario y la contraseña cargados en el entorno GestaPro - Vercel.</w:t>
             </w:r>
           </w:p>
         </w:tc>
@@ -4788,7 +4696,7 @@
                 <w:b/>
                 <w:sz w:val="18"/>
               </w:rPr>
-              <w:t>200 en vez de 201 contra la app publicada</w:t>
+              <w:t>200 en vez de 201</w:t>
             </w:r>
           </w:p>
         </w:tc>
@@ -4802,7 +4710,7 @@
                 <w:b w:val="0"/>
                 <w:sz w:val="18"/>
               </w:rPr>
-              <w:t>Render todavía no tiene el último commit desplegado: usar el entorno Local o esperar al deploy.</w:t>
+              <w:t>Render todavía no terminó de desplegar el último commit: esperar el deploy y repetir.</w:t>
             </w:r>
           </w:p>
         </w:tc>
@@ -4818,7 +4726,7 @@
                 <w:b/>
                 <w:sz w:val="18"/>
               </w:rPr>
-              <w:t>La app publicada tarda o da timeout</w:t>
+              <w:t>Sin internet en el aula</w:t>
             </w:r>
           </w:p>
         </w:tc>
@@ -4832,37 +4740,7 @@
                 <w:b w:val="0"/>
                 <w:sz w:val="18"/>
               </w:rPr>
-              <w:t>Render estaba dormido: esperar un minuto y repetir, o usar el entorno Local.</w:t>
-            </w:r>
-          </w:p>
-        </w:tc>
-      </w:tr>
-      <w:tr>
-        <w:tc>
-          <w:tcPr>
-            <w:tcW w:type="dxa" w:w="3061"/>
-          </w:tcPr>
-          <w:p>
-            <w:r>
-              <w:rPr>
-                <w:b/>
-                <w:sz w:val="18"/>
-              </w:rPr>
-              <w:t>El puerto 8080 está ocupado</w:t>
-            </w:r>
-          </w:p>
-        </w:tc>
-        <w:tc>
-          <w:tcPr>
-            <w:tcW w:type="dxa" w:w="6690"/>
-          </w:tcPr>
-          <w:p>
-            <w:r>
-              <w:rPr>
-                <w:b w:val="0"/>
-                <w:sz w:val="18"/>
-              </w:rPr>
-              <w:t>Cerrar el otro backend, o cambiar --server.port en el .cmd y baseUrl en el entorno Local.</w:t>
+              <w:t>Postman no puede llegar a Vercel: mostrar REST Assured, que levanta su propio backend sin internet.</w:t>
             </w:r>
           </w:p>
         </w:tc>
@@ -5187,6 +5065,2006 @@
           <w:i w:val="0"/>
         </w:rPr>
         <w:t xml:space="preserve"> con Postman entendemos y mostramos la API; con REST Assured, el alta de clientes queda verificada en cada build y cualquier cambio que la rompa se detecta antes de llegar a producción.</w:t>
+      </w:r>
+    </w:p>
+    <w:p>
+      <w:pPr>
+        <w:pStyle w:val="Heading1"/>
+      </w:pPr>
+      <w:r>
+        <w:t>8. Guion de los 10 minutos (los dos participan)</w:t>
+      </w:r>
+    </w:p>
+    <w:tbl>
+      <w:tblPr>
+        <w:tblStyle w:val="TableGrid"/>
+        <w:tblW w:type="auto" w:w="0"/>
+        <w:jc w:val="center"/>
+        <w:tblLook w:firstColumn="1" w:firstRow="1" w:lastColumn="0" w:lastRow="0" w:noHBand="0" w:noVBand="1" w:val="04A0"/>
+      </w:tblPr>
+      <w:tblGrid>
+        <w:gridCol w:w="3324"/>
+        <w:gridCol w:w="3324"/>
+        <w:gridCol w:w="3324"/>
+      </w:tblGrid>
+      <w:tr>
+        <w:tc>
+          <w:tcPr>
+            <w:tcW w:type="dxa" w:w="907"/>
+            <w:shd w:val="clear" w:fill="5B3FA8"/>
+          </w:tcPr>
+          <w:p>
+            <w:r>
+              <w:rPr>
+                <w:b/>
+                <w:color w:val="FFFFFF"/>
+                <w:sz w:val="19"/>
+              </w:rPr>
+              <w:t>Minuto</w:t>
+            </w:r>
+          </w:p>
+        </w:tc>
+        <w:tc>
+          <w:tcPr>
+            <w:tcW w:type="dxa" w:w="1134"/>
+            <w:shd w:val="clear" w:fill="5B3FA8"/>
+          </w:tcPr>
+          <w:p>
+            <w:r>
+              <w:rPr>
+                <w:b/>
+                <w:color w:val="FFFFFF"/>
+                <w:sz w:val="19"/>
+              </w:rPr>
+              <w:t>Quién</w:t>
+            </w:r>
+          </w:p>
+        </w:tc>
+        <w:tc>
+          <w:tcPr>
+            <w:tcW w:type="dxa" w:w="7483"/>
+            <w:shd w:val="clear" w:fill="5B3FA8"/>
+          </w:tcPr>
+          <w:p>
+            <w:r>
+              <w:rPr>
+                <w:b/>
+                <w:color w:val="FFFFFF"/>
+                <w:sz w:val="19"/>
+              </w:rPr>
+              <w:t>Qué se hace y qué se dice</w:t>
+            </w:r>
+          </w:p>
+        </w:tc>
+      </w:tr>
+      <w:tr>
+        <w:tc>
+          <w:tcPr>
+            <w:tcW w:type="dxa" w:w="907"/>
+          </w:tcPr>
+          <w:p>
+            <w:r>
+              <w:rPr>
+                <w:b/>
+                <w:sz w:val="18"/>
+              </w:rPr>
+              <w:t>1–2</w:t>
+            </w:r>
+          </w:p>
+        </w:tc>
+        <w:tc>
+          <w:tcPr>
+            <w:tcW w:type="dxa" w:w="1134"/>
+          </w:tcPr>
+          <w:p>
+            <w:r>
+              <w:rPr>
+                <w:b w:val="0"/>
+                <w:sz w:val="18"/>
+              </w:rPr>
+              <w:t>Lucas</w:t>
+            </w:r>
+          </w:p>
+        </w:tc>
+        <w:tc>
+          <w:tcPr>
+            <w:tcW w:type="dxa" w:w="7483"/>
+          </w:tcPr>
+          <w:p>
+            <w:r>
+              <w:rPr>
+                <w:b/>
+                <w:sz w:val="18"/>
+              </w:rPr>
+              <w:t>Flujo de negocio:</w:t>
+            </w:r>
+            <w:r>
+              <w:rPr>
+                <w:b w:val="0"/>
+                <w:sz w:val="18"/>
+              </w:rPr>
+              <w:t xml:space="preserve"> el Dueño registra a un cliente habitual con cuenta corriente y límite de $15.000; el frontend lo hace con POST /api/clientes y el token del login. </w:t>
+            </w:r>
+            <w:r>
+              <w:rPr>
+                <w:b/>
+                <w:sz w:val="18"/>
+              </w:rPr>
+              <w:t>Clasificación:</w:t>
+            </w:r>
+            <w:r>
+              <w:rPr>
+                <w:b w:val="0"/>
+                <w:sz w:val="18"/>
+              </w:rPr>
+              <w:t xml:space="preserve"> es Verificación (¿el endpoint cumple su especificación?). Presenta los criterios del mapa comparativo.</w:t>
+            </w:r>
+          </w:p>
+        </w:tc>
+      </w:tr>
+      <w:tr>
+        <w:tc>
+          <w:tcPr>
+            <w:tcW w:type="dxa" w:w="907"/>
+          </w:tcPr>
+          <w:p>
+            <w:r>
+              <w:rPr>
+                <w:b/>
+                <w:sz w:val="18"/>
+              </w:rPr>
+              <w:t>3–4</w:t>
+            </w:r>
+          </w:p>
+        </w:tc>
+        <w:tc>
+          <w:tcPr>
+            <w:tcW w:type="dxa" w:w="1134"/>
+          </w:tcPr>
+          <w:p>
+            <w:r>
+              <w:rPr>
+                <w:b w:val="0"/>
+                <w:sz w:val="18"/>
+              </w:rPr>
+              <w:t>Lisandro</w:t>
+            </w:r>
+          </w:p>
+        </w:tc>
+        <w:tc>
+          <w:tcPr>
+            <w:tcW w:type="dxa" w:w="7483"/>
+          </w:tcPr>
+          <w:p>
+            <w:r>
+              <w:rPr>
+                <w:b/>
+                <w:sz w:val="18"/>
+              </w:rPr>
+              <w:t>Postman.</w:t>
+            </w:r>
+            <w:r>
+              <w:rPr>
+                <w:b w:val="0"/>
+                <w:sz w:val="18"/>
+              </w:rPr>
+              <w:t xml:space="preserve"> Abre la petición "Registrar cliente": muestra la pestaña </w:t>
+            </w:r>
+            <w:r>
+              <w:rPr>
+                <w:b/>
+                <w:sz w:val="18"/>
+              </w:rPr>
+              <w:t>Headers</w:t>
+            </w:r>
+            <w:r>
+              <w:rPr>
+                <w:b w:val="0"/>
+                <w:sz w:val="18"/>
+              </w:rPr>
+              <w:t xml:space="preserve"> (Authorization: Bearer y Content-Type), la pestaña </w:t>
+            </w:r>
+            <w:r>
+              <w:rPr>
+                <w:b/>
+                <w:sz w:val="18"/>
+              </w:rPr>
+              <w:t>Body</w:t>
+            </w:r>
+            <w:r>
+              <w:rPr>
+                <w:b w:val="0"/>
+                <w:sz w:val="18"/>
+              </w:rPr>
+              <w:t xml:space="preserve"> (el JSON del cliente) → </w:t>
+            </w:r>
+            <w:r>
+              <w:rPr>
+                <w:b/>
+                <w:sz w:val="18"/>
+              </w:rPr>
+              <w:t>Send</w:t>
+            </w:r>
+            <w:r>
+              <w:rPr>
+                <w:b w:val="0"/>
+                <w:sz w:val="18"/>
+              </w:rPr>
+              <w:t xml:space="preserve"> → muestra el </w:t>
+            </w:r>
+            <w:r>
+              <w:rPr>
+                <w:b/>
+                <w:sz w:val="18"/>
+              </w:rPr>
+              <w:t>Status 201 Created</w:t>
+            </w:r>
+            <w:r>
+              <w:rPr>
+                <w:b w:val="0"/>
+                <w:sz w:val="18"/>
+              </w:rPr>
+              <w:t xml:space="preserve">, el tiempo, el JSON de respuesta (id_cliente, estado, límite) y </w:t>
+            </w:r>
+            <w:r>
+              <w:rPr>
+                <w:b/>
+                <w:sz w:val="18"/>
+              </w:rPr>
+              <w:t>Test Results</w:t>
+            </w:r>
+            <w:r>
+              <w:rPr>
+                <w:b w:val="0"/>
+                <w:sz w:val="18"/>
+              </w:rPr>
+              <w:t xml:space="preserve"> con las 10 comprobaciones en verde. Muestra la pestaña </w:t>
+            </w:r>
+            <w:r>
+              <w:rPr>
+                <w:b/>
+                <w:sz w:val="18"/>
+              </w:rPr>
+              <w:t>Scripts</w:t>
+            </w:r>
+            <w:r>
+              <w:rPr>
+                <w:b w:val="0"/>
+                <w:sz w:val="18"/>
+              </w:rPr>
+              <w:t>: en Pre-request está el login (seguridad) y en Post-response las comprobaciones y la limpieza. Todo está en la misma petición.</w:t>
+            </w:r>
+          </w:p>
+        </w:tc>
+      </w:tr>
+      <w:tr>
+        <w:tc>
+          <w:tcPr>
+            <w:tcW w:type="dxa" w:w="907"/>
+          </w:tcPr>
+          <w:p>
+            <w:r>
+              <w:rPr>
+                <w:b/>
+                <w:sz w:val="18"/>
+              </w:rPr>
+              <w:t>5–6</w:t>
+            </w:r>
+          </w:p>
+        </w:tc>
+        <w:tc>
+          <w:tcPr>
+            <w:tcW w:type="dxa" w:w="1134"/>
+          </w:tcPr>
+          <w:p>
+            <w:r>
+              <w:rPr>
+                <w:b w:val="0"/>
+                <w:sz w:val="18"/>
+              </w:rPr>
+              <w:t>Lucas</w:t>
+            </w:r>
+          </w:p>
+        </w:tc>
+        <w:tc>
+          <w:tcPr>
+            <w:tcW w:type="dxa" w:w="7483"/>
+          </w:tcPr>
+          <w:p>
+            <w:r>
+              <w:rPr>
+                <w:b/>
+                <w:sz w:val="18"/>
+              </w:rPr>
+              <w:t>REST Assured en IntelliJ.</w:t>
+            </w:r>
+            <w:r>
+              <w:rPr>
+                <w:b w:val="0"/>
+                <w:sz w:val="18"/>
+              </w:rPr>
+              <w:t xml:space="preserve"> Abre RegistrarClienteRestAssuredTest y muestra que es el mismo caso: given (las mismas cabeceras y el mismo JSON), when (el mismo POST), then (las mismas 10 comprobaciones). Lo corre con el triángulo verde: el test levanta el backend y da verde.</w:t>
+            </w:r>
+          </w:p>
+        </w:tc>
+      </w:tr>
+      <w:tr>
+        <w:tc>
+          <w:tcPr>
+            <w:tcW w:type="dxa" w:w="907"/>
+          </w:tcPr>
+          <w:p>
+            <w:r>
+              <w:rPr>
+                <w:b/>
+                <w:sz w:val="18"/>
+              </w:rPr>
+              <w:t>7–8</w:t>
+            </w:r>
+          </w:p>
+        </w:tc>
+        <w:tc>
+          <w:tcPr>
+            <w:tcW w:type="dxa" w:w="1134"/>
+          </w:tcPr>
+          <w:p>
+            <w:r>
+              <w:rPr>
+                <w:b w:val="0"/>
+                <w:sz w:val="18"/>
+              </w:rPr>
+              <w:t>Los dos</w:t>
+            </w:r>
+          </w:p>
+        </w:tc>
+        <w:tc>
+          <w:tcPr>
+            <w:tcW w:type="dxa" w:w="7483"/>
+          </w:tcPr>
+          <w:p>
+            <w:r>
+              <w:rPr>
+                <w:b/>
+                <w:sz w:val="18"/>
+              </w:rPr>
+              <w:t>Lectura de resultados:</w:t>
+            </w:r>
+            <w:r>
+              <w:rPr>
+                <w:b w:val="0"/>
+                <w:sz w:val="18"/>
+              </w:rPr>
+              <w:t xml:space="preserve"> Lisandro, el Test Results de Postman (y, si quieren, el Runner o Newman por consola). Lucas, el árbol de JUnit en verde y la consola con la petición y la respuesta (el token aparece oculto como [ BLACKLISTED ]). Opcional: cambiar el 201 por 200 en las dos para mostrar cómo informa el error cada una.</w:t>
+            </w:r>
+          </w:p>
+        </w:tc>
+      </w:tr>
+      <w:tr>
+        <w:tc>
+          <w:tcPr>
+            <w:tcW w:type="dxa" w:w="907"/>
+          </w:tcPr>
+          <w:p>
+            <w:r>
+              <w:rPr>
+                <w:b/>
+                <w:sz w:val="18"/>
+              </w:rPr>
+              <w:t>9–10</w:t>
+            </w:r>
+          </w:p>
+        </w:tc>
+        <w:tc>
+          <w:tcPr>
+            <w:tcW w:type="dxa" w:w="1134"/>
+          </w:tcPr>
+          <w:p>
+            <w:r>
+              <w:rPr>
+                <w:b w:val="0"/>
+                <w:sz w:val="18"/>
+              </w:rPr>
+              <w:t>Los dos</w:t>
+            </w:r>
+          </w:p>
+        </w:tc>
+        <w:tc>
+          <w:tcPr>
+            <w:tcW w:type="dxa" w:w="7483"/>
+          </w:tcPr>
+          <w:p>
+            <w:r>
+              <w:rPr>
+                <w:b/>
+                <w:sz w:val="18"/>
+              </w:rPr>
+              <w:t>Comparación y cierre:</w:t>
+            </w:r>
+            <w:r>
+              <w:rPr>
+                <w:b w:val="0"/>
+                <w:sz w:val="18"/>
+              </w:rPr>
+              <w:t xml:space="preserve"> facilidad de uso (Postman), mantenibilidad y versionado (REST Assured), integración en automatizaciones (mvn test vs. Newman). Valor para la calidad: el alta de clientes queda verificada en cada build y cualquier cambio que la rompa se detecta antes de llegar a producción.</w:t>
+            </w:r>
+          </w:p>
+        </w:tc>
+      </w:tr>
+    </w:tbl>
+    <w:p>
+      <w:pPr>
+        <w:spacing w:after="80"/>
+      </w:pPr>
+    </w:p>
+    <w:p>
+      <w:pPr>
+        <w:pStyle w:val="Heading1"/>
+      </w:pPr>
+      <w:r>
+        <w:t>9. Preguntas que nos pueden hacer</w:t>
+      </w:r>
+    </w:p>
+    <w:p>
+      <w:pPr>
+        <w:spacing w:after="20"/>
+      </w:pPr>
+      <w:r>
+        <w:rPr>
+          <w:b/>
+          <w:i w:val="0"/>
+        </w:rPr>
+        <w:t>¿Por qué es Verificación y no Validación?</w:t>
+      </w:r>
+    </w:p>
+    <w:p>
+      <w:pPr>
+        <w:spacing w:after="120"/>
+      </w:pPr>
+      <w:r>
+        <w:rPr>
+          <w:b w:val="0"/>
+          <w:i w:val="0"/>
+        </w:rPr>
+        <w:t>Porque comparamos la respuesta del endpoint contra su especificación (status, cabeceras, JSON). No evaluamos con el usuario si la funcionalidad le resuelve su necesidad.</w:t>
+      </w:r>
+    </w:p>
+    <w:p>
+      <w:pPr>
+        <w:spacing w:after="20"/>
+      </w:pPr>
+      <w:r>
+        <w:rPr>
+          <w:b/>
+          <w:i w:val="0"/>
+        </w:rPr>
+        <w:t>¿Es exactamente el mismo caso en las dos?</w:t>
+      </w:r>
+    </w:p>
+    <w:p>
+      <w:pPr>
+        <w:spacing w:after="120"/>
+      </w:pPr>
+      <w:r>
+        <w:rPr>
+          <w:b w:val="0"/>
+          <w:i w:val="0"/>
+        </w:rPr>
+        <w:t>Sí: el mismo POST, las mismas cabeceras, el mismo body JSON y las mismas 10 comprobaciones. Cambia solo cómo se escribe: formularios y JavaScript en Postman, Java en REST Assured.</w:t>
+      </w:r>
+    </w:p>
+    <w:p>
+      <w:pPr>
+        <w:spacing w:after="20"/>
+      </w:pPr>
+      <w:r>
+        <w:rPr>
+          <w:b/>
+          <w:i w:val="0"/>
+        </w:rPr>
+        <w:t>¿Por qué 201 y no 200?</w:t>
+      </w:r>
+    </w:p>
+    <w:p>
+      <w:pPr>
+        <w:spacing w:after="120"/>
+      </w:pPr>
+      <w:r>
+        <w:rPr>
+          <w:b w:val="0"/>
+          <w:i w:val="0"/>
+        </w:rPr>
+        <w:t>Por convención REST, un POST que crea un recurso responde 201 Created. En GestaPro, el mismo POST /api/clientes también modifica un cliente si el JSON trae el id, y en ese caso responde 200 OK. Si alguien cambiara el código de respuesta, el test lo detectaría.</w:t>
+      </w:r>
+    </w:p>
+    <w:p>
+      <w:pPr>
+        <w:spacing w:after="20"/>
+      </w:pPr>
+      <w:r>
+        <w:rPr>
+          <w:b/>
+          <w:i w:val="0"/>
+        </w:rPr>
+        <w:t>¿De dónde sale el token?</w:t>
+      </w:r>
+    </w:p>
+    <w:p>
+      <w:pPr>
+        <w:spacing w:after="120"/>
+      </w:pPr>
+      <w:r>
+        <w:rPr>
+          <w:b w:val="0"/>
+          <w:i w:val="0"/>
+        </w:rPr>
+        <w:t>De un login previo (POST /api/usuarios/login). En Postman lo hace el script Pre-request de la misma petición; en REST Assured, el @BeforeEach. Es preparación, no parte del caso.</w:t>
+      </w:r>
+    </w:p>
+    <w:p>
+      <w:pPr>
+        <w:spacing w:after="20"/>
+      </w:pPr>
+      <w:r>
+        <w:rPr>
+          <w:b/>
+          <w:i w:val="0"/>
+        </w:rPr>
+        <w:t>¿Por qué se borra el cliente al final?</w:t>
+      </w:r>
+    </w:p>
+    <w:p>
+      <w:pPr>
+        <w:spacing w:after="120"/>
+      </w:pPr>
+      <w:r>
+        <w:rPr>
+          <w:b w:val="0"/>
+          <w:i w:val="0"/>
+        </w:rPr>
+        <w:t>Para no dejar datos de prueba: así se puede repetir la prueba todas las veces que haga falta, incluso contra la app publicada.</w:t>
+      </w:r>
+    </w:p>
+    <w:p>
+      <w:pPr>
+        <w:spacing w:after="20"/>
+      </w:pPr>
+      <w:r>
+        <w:rPr>
+          <w:b/>
+          <w:i w:val="0"/>
+        </w:rPr>
+        <w:t>¿Qué ventaja tiene que REST Assured levante su propio servidor?</w:t>
+      </w:r>
+    </w:p>
+    <w:p>
+      <w:pPr>
+        <w:spacing w:after="120"/>
+      </w:pPr>
+      <w:r>
+        <w:rPr>
+          <w:b w:val="0"/>
+          <w:i w:val="0"/>
+        </w:rPr>
+        <w:t>No depende de que alguien deje el backend prendido ni de datos previos: corre en cualquier máquina o en un pipeline de integración continua.</w:t>
+      </w:r>
+    </w:p>
+    <w:p>
+      <w:pPr>
+        <w:spacing w:after="20"/>
+      </w:pPr>
+      <w:r>
+        <w:rPr>
+          <w:b/>
+          <w:i w:val="0"/>
+        </w:rPr>
+        <w:t>¿Se puede automatizar Postman?</w:t>
+      </w:r>
+    </w:p>
+    <w:p>
+      <w:pPr>
+        <w:spacing w:after="120"/>
+      </w:pPr>
+      <w:r>
+        <w:rPr>
+          <w:b w:val="0"/>
+          <w:i w:val="0"/>
+        </w:rPr>
+        <w:t>Sí, con Newman (la CLI de Postman) o con el Collection Runner. Igual, la colección vive fuera del código y versionarla es más incómodo.</w:t>
+      </w:r>
+    </w:p>
+    <w:p>
+      <w:pPr>
+        <w:spacing w:after="20"/>
+      </w:pPr>
+      <w:r>
+        <w:rPr>
+          <w:b/>
+          <w:i w:val="0"/>
+        </w:rPr>
+        <w:t>¿Cuál es la diferencia entre 401 y 403?</w:t>
+      </w:r>
+    </w:p>
+    <w:p>
+      <w:pPr>
+        <w:spacing w:after="120"/>
+      </w:pPr>
+      <w:r>
+        <w:rPr>
+          <w:b w:val="0"/>
+          <w:i w:val="0"/>
+        </w:rPr>
+        <w:t>401: no hay autenticación válida (sin token o token vencido). 403: el usuario está autenticado, pero su perfil no tiene permiso para ese módulo.</w:t>
+      </w:r>
+    </w:p>
+    <w:p>
+      <w:pPr>
+        <w:pStyle w:val="Heading1"/>
+      </w:pPr>
+      <w:r>
+        <w:t>10. Guía de estudio para la Fase 1 (cuestionario individual)</w:t>
+      </w:r>
+    </w:p>
+    <w:p>
+      <w:pPr>
+        <w:spacing w:after="80"/>
+      </w:pPr>
+      <w:r>
+        <w:rPr>
+          <w:b w:val="0"/>
+          <w:i/>
+          <w:color w:val="555555"/>
+        </w:rPr>
+        <w:t>El cuestionario es de opción múltiple y abarca las herramientas de todos los equipos. Repaso de lo más probable:</w:t>
+      </w:r>
+    </w:p>
+    <w:p>
+      <w:pPr>
+        <w:pStyle w:val="Heading2"/>
+      </w:pPr>
+      <w:r>
+        <w:t>Conceptos generales</w:t>
+      </w:r>
+    </w:p>
+    <w:p>
+      <w:pPr>
+        <w:pStyle w:val="ListBullet"/>
+        <w:spacing w:after="40"/>
+      </w:pPr>
+      <w:r>
+        <w:rPr>
+          <w:b/>
+        </w:rPr>
+        <w:t>Verificación:</w:t>
+      </w:r>
+      <w:r>
+        <w:rPr>
+          <w:b w:val="0"/>
+        </w:rPr>
+        <w:t xml:space="preserve"> "¿construimos el producto correctamente?" Compara contra la especificación (revisiones, tests de unidad, integración, contratos de API).</w:t>
+      </w:r>
+    </w:p>
+    <w:p>
+      <w:pPr>
+        <w:pStyle w:val="ListBullet"/>
+        <w:spacing w:after="40"/>
+      </w:pPr>
+      <w:r>
+        <w:rPr>
+          <w:b/>
+        </w:rPr>
+        <w:t>Validación:</w:t>
+      </w:r>
+      <w:r>
+        <w:rPr>
+          <w:b w:val="0"/>
+        </w:rPr>
+        <w:t xml:space="preserve"> "¿construimos el producto correcto?" Compara contra la necesidad del usuario (E2E, pruebas de aceptación, usabilidad).</w:t>
+      </w:r>
+    </w:p>
+    <w:p>
+      <w:pPr>
+        <w:pStyle w:val="ListBullet"/>
+        <w:spacing w:after="40"/>
+      </w:pPr>
+      <w:r>
+        <w:rPr>
+          <w:b/>
+        </w:rPr>
+        <w:t>Niveles de prueba:</w:t>
+      </w:r>
+      <w:r>
+        <w:rPr>
+          <w:b w:val="0"/>
+        </w:rPr>
+        <w:t xml:space="preserve"> unitaria (una clase o método, con mocks), integración (varias capas juntas), sistema / E2E (la app completa desde el navegador), aceptación (el usuario o cliente).</w:t>
+      </w:r>
+    </w:p>
+    <w:p>
+      <w:pPr>
+        <w:pStyle w:val="ListBullet"/>
+        <w:spacing w:after="40"/>
+      </w:pPr>
+      <w:r>
+        <w:rPr>
+          <w:b/>
+        </w:rPr>
+        <w:t>Pruebas no funcionales:</w:t>
+      </w:r>
+      <w:r>
+        <w:rPr>
+          <w:b w:val="0"/>
+        </w:rPr>
+        <w:t xml:space="preserve"> carga y rendimiento (JMeter), seguridad (OWASP ZAP), usabilidad.</w:t>
+      </w:r>
+    </w:p>
+    <w:p>
+      <w:pPr>
+        <w:pStyle w:val="ListBullet"/>
+        <w:spacing w:after="40"/>
+      </w:pPr>
+      <w:r>
+        <w:rPr>
+          <w:b/>
+        </w:rPr>
+        <w:t>Caja negra vs. caja blanca:</w:t>
+      </w:r>
+      <w:r>
+        <w:rPr>
+          <w:b w:val="0"/>
+        </w:rPr>
+        <w:t xml:space="preserve"> caja negra prueba entradas y salidas sin mirar el código (Postman, Cypress, JMeter, ZAP); caja blanca usa el conocimiento del código (tests unitarios, cobertura).</w:t>
+      </w:r>
+    </w:p>
+    <w:p>
+      <w:pPr>
+        <w:pStyle w:val="ListBullet"/>
+        <w:spacing w:after="40"/>
+      </w:pPr>
+      <w:r>
+        <w:rPr>
+          <w:b/>
+        </w:rPr>
+        <w:t>Prueba de regresión:</w:t>
+      </w:r>
+      <w:r>
+        <w:rPr>
+          <w:b w:val="0"/>
+        </w:rPr>
+        <w:t xml:space="preserve"> volver a correr las pruebas después de un cambio para confirmar que no se rompió nada; por eso conviene automatizarlas.</w:t>
+      </w:r>
+    </w:p>
+    <w:p>
+      <w:pPr>
+        <w:pStyle w:val="Heading2"/>
+      </w:pPr>
+      <w:r>
+        <w:t>Códigos de estado HTTP</w:t>
+      </w:r>
+    </w:p>
+    <w:tbl>
+      <w:tblPr>
+        <w:tblStyle w:val="TableGrid"/>
+        <w:tblW w:type="auto" w:w="0"/>
+        <w:jc w:val="center"/>
+        <w:tblLook w:firstColumn="1" w:firstRow="1" w:lastColumn="0" w:lastRow="0" w:noHBand="0" w:noVBand="1" w:val="04A0"/>
+      </w:tblPr>
+      <w:tblGrid>
+        <w:gridCol w:w="3324"/>
+        <w:gridCol w:w="3324"/>
+        <w:gridCol w:w="3324"/>
+      </w:tblGrid>
+      <w:tr>
+        <w:tc>
+          <w:tcPr>
+            <w:tcW w:type="dxa" w:w="1814"/>
+            <w:shd w:val="clear" w:fill="5B3FA8"/>
+          </w:tcPr>
+          <w:p>
+            <w:r>
+              <w:rPr>
+                <w:b/>
+                <w:color w:val="FFFFFF"/>
+                <w:sz w:val="19"/>
+              </w:rPr>
+              <w:t>Código</w:t>
+            </w:r>
+          </w:p>
+        </w:tc>
+        <w:tc>
+          <w:tcPr>
+            <w:tcW w:type="dxa" w:w="3742"/>
+            <w:shd w:val="clear" w:fill="5B3FA8"/>
+          </w:tcPr>
+          <w:p>
+            <w:r>
+              <w:rPr>
+                <w:b/>
+                <w:color w:val="FFFFFF"/>
+                <w:sz w:val="19"/>
+              </w:rPr>
+              <w:t>Significado</w:t>
+            </w:r>
+          </w:p>
+        </w:tc>
+        <w:tc>
+          <w:tcPr>
+            <w:tcW w:type="dxa" w:w="3969"/>
+            <w:shd w:val="clear" w:fill="5B3FA8"/>
+          </w:tcPr>
+          <w:p>
+            <w:r>
+              <w:rPr>
+                <w:b/>
+                <w:color w:val="FFFFFF"/>
+                <w:sz w:val="19"/>
+              </w:rPr>
+              <w:t>Ejemplo</w:t>
+            </w:r>
+          </w:p>
+        </w:tc>
+      </w:tr>
+      <w:tr>
+        <w:tc>
+          <w:tcPr>
+            <w:tcW w:type="dxa" w:w="1814"/>
+          </w:tcPr>
+          <w:p>
+            <w:r>
+              <w:rPr>
+                <w:b/>
+                <w:sz w:val="18"/>
+              </w:rPr>
+              <w:t>200 OK</w:t>
+            </w:r>
+          </w:p>
+        </w:tc>
+        <w:tc>
+          <w:tcPr>
+            <w:tcW w:type="dxa" w:w="3742"/>
+          </w:tcPr>
+          <w:p>
+            <w:r>
+              <w:rPr>
+                <w:b w:val="0"/>
+                <w:sz w:val="18"/>
+              </w:rPr>
+              <w:t>La petición salió bien.</w:t>
+            </w:r>
+          </w:p>
+        </w:tc>
+        <w:tc>
+          <w:tcPr>
+            <w:tcW w:type="dxa" w:w="3969"/>
+          </w:tcPr>
+          <w:p>
+            <w:r>
+              <w:rPr>
+                <w:b w:val="0"/>
+                <w:sz w:val="18"/>
+              </w:rPr>
+              <w:t>GET de una lista; en GestaPro, modificar un cliente.</w:t>
+            </w:r>
+          </w:p>
+        </w:tc>
+      </w:tr>
+      <w:tr>
+        <w:tc>
+          <w:tcPr>
+            <w:tcW w:type="dxa" w:w="1814"/>
+          </w:tcPr>
+          <w:p>
+            <w:r>
+              <w:rPr>
+                <w:b/>
+                <w:sz w:val="18"/>
+              </w:rPr>
+              <w:t>201 Created</w:t>
+            </w:r>
+          </w:p>
+        </w:tc>
+        <w:tc>
+          <w:tcPr>
+            <w:tcW w:type="dxa" w:w="3742"/>
+          </w:tcPr>
+          <w:p>
+            <w:r>
+              <w:rPr>
+                <w:b w:val="0"/>
+                <w:sz w:val="18"/>
+              </w:rPr>
+              <w:t>Se creó un recurso nuevo.</w:t>
+            </w:r>
+          </w:p>
+        </w:tc>
+        <w:tc>
+          <w:tcPr>
+            <w:tcW w:type="dxa" w:w="3969"/>
+          </w:tcPr>
+          <w:p>
+            <w:r>
+              <w:rPr>
+                <w:b w:val="0"/>
+                <w:sz w:val="18"/>
+              </w:rPr>
+              <w:t>POST que crea: el alta de cliente en GestaPro (nuestro caso).</w:t>
+            </w:r>
+          </w:p>
+        </w:tc>
+      </w:tr>
+      <w:tr>
+        <w:tc>
+          <w:tcPr>
+            <w:tcW w:type="dxa" w:w="1814"/>
+          </w:tcPr>
+          <w:p>
+            <w:r>
+              <w:rPr>
+                <w:b/>
+                <w:sz w:val="18"/>
+              </w:rPr>
+              <w:t>204 No Content</w:t>
+            </w:r>
+          </w:p>
+        </w:tc>
+        <w:tc>
+          <w:tcPr>
+            <w:tcW w:type="dxa" w:w="3742"/>
+          </w:tcPr>
+          <w:p>
+            <w:r>
+              <w:rPr>
+                <w:b w:val="0"/>
+                <w:sz w:val="18"/>
+              </w:rPr>
+              <w:t>Salió bien y no hay cuerpo.</w:t>
+            </w:r>
+          </w:p>
+        </w:tc>
+        <w:tc>
+          <w:tcPr>
+            <w:tcW w:type="dxa" w:w="3969"/>
+          </w:tcPr>
+          <w:p>
+            <w:r>
+              <w:rPr>
+                <w:b w:val="0"/>
+                <w:sz w:val="18"/>
+              </w:rPr>
+              <w:t>DELETE exitoso.</w:t>
+            </w:r>
+          </w:p>
+        </w:tc>
+      </w:tr>
+      <w:tr>
+        <w:tc>
+          <w:tcPr>
+            <w:tcW w:type="dxa" w:w="1814"/>
+          </w:tcPr>
+          <w:p>
+            <w:r>
+              <w:rPr>
+                <w:b/>
+                <w:sz w:val="18"/>
+              </w:rPr>
+              <w:t>400 Bad Request</w:t>
+            </w:r>
+          </w:p>
+        </w:tc>
+        <w:tc>
+          <w:tcPr>
+            <w:tcW w:type="dxa" w:w="3742"/>
+          </w:tcPr>
+          <w:p>
+            <w:r>
+              <w:rPr>
+                <w:b w:val="0"/>
+                <w:sz w:val="18"/>
+              </w:rPr>
+              <w:t>Datos inválidos o mal formados.</w:t>
+            </w:r>
+          </w:p>
+        </w:tc>
+        <w:tc>
+          <w:tcPr>
+            <w:tcW w:type="dxa" w:w="3969"/>
+          </w:tcPr>
+          <w:p>
+            <w:r>
+              <w:rPr>
+                <w:b w:val="0"/>
+                <w:sz w:val="18"/>
+              </w:rPr>
+              <w:t>Límite de crédito negativo; fecha inválida (consigna del Equipo 2).</w:t>
+            </w:r>
+          </w:p>
+        </w:tc>
+      </w:tr>
+      <w:tr>
+        <w:tc>
+          <w:tcPr>
+            <w:tcW w:type="dxa" w:w="1814"/>
+          </w:tcPr>
+          <w:p>
+            <w:r>
+              <w:rPr>
+                <w:b/>
+                <w:sz w:val="18"/>
+              </w:rPr>
+              <w:t>401 Unauthorized</w:t>
+            </w:r>
+          </w:p>
+        </w:tc>
+        <w:tc>
+          <w:tcPr>
+            <w:tcW w:type="dxa" w:w="3742"/>
+          </w:tcPr>
+          <w:p>
+            <w:r>
+              <w:rPr>
+                <w:b w:val="0"/>
+                <w:sz w:val="18"/>
+              </w:rPr>
+              <w:t>No autenticado: falta el token o es inválido / vencido.</w:t>
+            </w:r>
+          </w:p>
+        </w:tc>
+        <w:tc>
+          <w:tcPr>
+            <w:tcW w:type="dxa" w:w="3969"/>
+          </w:tcPr>
+          <w:p>
+            <w:r>
+              <w:rPr>
+                <w:b w:val="0"/>
+                <w:sz w:val="18"/>
+              </w:rPr>
+              <w:t>POST /api/clientes sin token; GET /api/contratos sin sesión (Equipo 4).</w:t>
+            </w:r>
+          </w:p>
+        </w:tc>
+      </w:tr>
+      <w:tr>
+        <w:tc>
+          <w:tcPr>
+            <w:tcW w:type="dxa" w:w="1814"/>
+          </w:tcPr>
+          <w:p>
+            <w:r>
+              <w:rPr>
+                <w:b/>
+                <w:sz w:val="18"/>
+              </w:rPr>
+              <w:t>403 Forbidden</w:t>
+            </w:r>
+          </w:p>
+        </w:tc>
+        <w:tc>
+          <w:tcPr>
+            <w:tcW w:type="dxa" w:w="3742"/>
+          </w:tcPr>
+          <w:p>
+            <w:r>
+              <w:rPr>
+                <w:b w:val="0"/>
+                <w:sz w:val="18"/>
+              </w:rPr>
+              <w:t>Autenticado, pero sin permiso.</w:t>
+            </w:r>
+          </w:p>
+        </w:tc>
+        <w:tc>
+          <w:tcPr>
+            <w:tcW w:type="dxa" w:w="3969"/>
+          </w:tcPr>
+          <w:p>
+            <w:r>
+              <w:rPr>
+                <w:b w:val="0"/>
+                <w:sz w:val="18"/>
+              </w:rPr>
+              <w:t>Un operario sin permiso de Informes.</w:t>
+            </w:r>
+          </w:p>
+        </w:tc>
+      </w:tr>
+      <w:tr>
+        <w:tc>
+          <w:tcPr>
+            <w:tcW w:type="dxa" w:w="1814"/>
+          </w:tcPr>
+          <w:p>
+            <w:r>
+              <w:rPr>
+                <w:b/>
+                <w:sz w:val="18"/>
+              </w:rPr>
+              <w:t>404 Not Found</w:t>
+            </w:r>
+          </w:p>
+        </w:tc>
+        <w:tc>
+          <w:tcPr>
+            <w:tcW w:type="dxa" w:w="3742"/>
+          </w:tcPr>
+          <w:p>
+            <w:r>
+              <w:rPr>
+                <w:b w:val="0"/>
+                <w:sz w:val="18"/>
+              </w:rPr>
+              <w:t>El recurso no existe.</w:t>
+            </w:r>
+          </w:p>
+        </w:tc>
+        <w:tc>
+          <w:tcPr>
+            <w:tcW w:type="dxa" w:w="3969"/>
+          </w:tcPr>
+          <w:p>
+            <w:r>
+              <w:rPr>
+                <w:b w:val="0"/>
+                <w:sz w:val="18"/>
+              </w:rPr>
+              <w:t>Cliente con un id inexistente.</w:t>
+            </w:r>
+          </w:p>
+        </w:tc>
+      </w:tr>
+      <w:tr>
+        <w:tc>
+          <w:tcPr>
+            <w:tcW w:type="dxa" w:w="1814"/>
+          </w:tcPr>
+          <w:p>
+            <w:r>
+              <w:rPr>
+                <w:b/>
+                <w:sz w:val="18"/>
+              </w:rPr>
+              <w:t>409 Conflict</w:t>
+            </w:r>
+          </w:p>
+        </w:tc>
+        <w:tc>
+          <w:tcPr>
+            <w:tcW w:type="dxa" w:w="3742"/>
+          </w:tcPr>
+          <w:p>
+            <w:r>
+              <w:rPr>
+                <w:b w:val="0"/>
+                <w:sz w:val="18"/>
+              </w:rPr>
+              <w:t>Choca con el estado actual (duplicado).</w:t>
+            </w:r>
+          </w:p>
+        </w:tc>
+        <w:tc>
+          <w:tcPr>
+            <w:tcW w:type="dxa" w:w="3969"/>
+          </w:tcPr>
+          <w:p>
+            <w:r>
+              <w:rPr>
+                <w:b w:val="0"/>
+                <w:sz w:val="18"/>
+              </w:rPr>
+              <w:t>Cliente o documento repetido.</w:t>
+            </w:r>
+          </w:p>
+        </w:tc>
+      </w:tr>
+      <w:tr>
+        <w:tc>
+          <w:tcPr>
+            <w:tcW w:type="dxa" w:w="1814"/>
+          </w:tcPr>
+          <w:p>
+            <w:r>
+              <w:rPr>
+                <w:b/>
+                <w:sz w:val="18"/>
+              </w:rPr>
+              <w:t>422 Unprocessable Entity</w:t>
+            </w:r>
+          </w:p>
+        </w:tc>
+        <w:tc>
+          <w:tcPr>
+            <w:tcW w:type="dxa" w:w="3742"/>
+          </w:tcPr>
+          <w:p>
+            <w:r>
+              <w:rPr>
+                <w:b w:val="0"/>
+                <w:sz w:val="18"/>
+              </w:rPr>
+              <w:t>Formato correcto, pero no cumple reglas de negocio (lo usan algunas APIs).</w:t>
+            </w:r>
+          </w:p>
+        </w:tc>
+        <w:tc>
+          <w:tcPr>
+            <w:tcW w:type="dxa" w:w="3969"/>
+          </w:tcPr>
+          <w:p>
+            <w:r>
+              <w:rPr>
+                <w:b w:val="0"/>
+                <w:sz w:val="18"/>
+              </w:rPr>
+              <w:t>Validaciones semánticas.</w:t>
+            </w:r>
+          </w:p>
+        </w:tc>
+      </w:tr>
+      <w:tr>
+        <w:tc>
+          <w:tcPr>
+            <w:tcW w:type="dxa" w:w="1814"/>
+          </w:tcPr>
+          <w:p>
+            <w:r>
+              <w:rPr>
+                <w:b/>
+                <w:sz w:val="18"/>
+              </w:rPr>
+              <w:t>429 Too Many Requests</w:t>
+            </w:r>
+          </w:p>
+        </w:tc>
+        <w:tc>
+          <w:tcPr>
+            <w:tcW w:type="dxa" w:w="3742"/>
+          </w:tcPr>
+          <w:p>
+            <w:r>
+              <w:rPr>
+                <w:b w:val="0"/>
+                <w:sz w:val="18"/>
+              </w:rPr>
+              <w:t>Demasiadas peticiones (límite de intentos).</w:t>
+            </w:r>
+          </w:p>
+        </w:tc>
+        <w:tc>
+          <w:tcPr>
+            <w:tcW w:type="dxa" w:w="3969"/>
+          </w:tcPr>
+          <w:p>
+            <w:r>
+              <w:rPr>
+                <w:b w:val="0"/>
+                <w:sz w:val="18"/>
+              </w:rPr>
+              <w:t>Muchos logins fallidos seguidos.</w:t>
+            </w:r>
+          </w:p>
+        </w:tc>
+      </w:tr>
+      <w:tr>
+        <w:tc>
+          <w:tcPr>
+            <w:tcW w:type="dxa" w:w="1814"/>
+          </w:tcPr>
+          <w:p>
+            <w:r>
+              <w:rPr>
+                <w:b/>
+                <w:sz w:val="18"/>
+              </w:rPr>
+              <w:t>500 / 503</w:t>
+            </w:r>
+          </w:p>
+        </w:tc>
+        <w:tc>
+          <w:tcPr>
+            <w:tcW w:type="dxa" w:w="3742"/>
+          </w:tcPr>
+          <w:p>
+            <w:r>
+              <w:rPr>
+                <w:b w:val="0"/>
+                <w:sz w:val="18"/>
+              </w:rPr>
+              <w:t>Error del servidor / servicio no disponible.</w:t>
+            </w:r>
+          </w:p>
+        </w:tc>
+        <w:tc>
+          <w:tcPr>
+            <w:tcW w:type="dxa" w:w="3969"/>
+          </w:tcPr>
+          <w:p>
+            <w:r>
+              <w:rPr>
+                <w:b w:val="0"/>
+                <w:sz w:val="18"/>
+              </w:rPr>
+              <w:t>Backend caído o saturado (prueba de carga).</w:t>
+            </w:r>
+          </w:p>
+        </w:tc>
+      </w:tr>
+    </w:tbl>
+    <w:p>
+      <w:pPr>
+        <w:spacing w:after="80"/>
+      </w:pPr>
+    </w:p>
+    <w:p>
+      <w:pPr>
+        <w:pStyle w:val="Heading2"/>
+      </w:pPr>
+      <w:r>
+        <w:t>Herramientas de cada equipo</w:t>
+      </w:r>
+    </w:p>
+    <w:tbl>
+      <w:tblPr>
+        <w:tblStyle w:val="TableGrid"/>
+        <w:tblW w:type="auto" w:w="0"/>
+        <w:jc w:val="center"/>
+        <w:tblLook w:firstColumn="1" w:firstRow="1" w:lastColumn="0" w:lastRow="0" w:noHBand="0" w:noVBand="1" w:val="04A0"/>
+      </w:tblPr>
+      <w:tblGrid>
+        <w:gridCol w:w="3324"/>
+        <w:gridCol w:w="3324"/>
+        <w:gridCol w:w="3324"/>
+      </w:tblGrid>
+      <w:tr>
+        <w:tc>
+          <w:tcPr>
+            <w:tcW w:type="dxa" w:w="2041"/>
+            <w:shd w:val="clear" w:fill="5B3FA8"/>
+          </w:tcPr>
+          <w:p>
+            <w:r>
+              <w:rPr>
+                <w:b/>
+                <w:color w:val="FFFFFF"/>
+                <w:sz w:val="19"/>
+              </w:rPr>
+              <w:t>Herramienta</w:t>
+            </w:r>
+          </w:p>
+        </w:tc>
+        <w:tc>
+          <w:tcPr>
+            <w:tcW w:type="dxa" w:w="2268"/>
+            <w:shd w:val="clear" w:fill="5B3FA8"/>
+          </w:tcPr>
+          <w:p>
+            <w:r>
+              <w:rPr>
+                <w:b/>
+                <w:color w:val="FFFFFF"/>
+                <w:sz w:val="19"/>
+              </w:rPr>
+              <w:t>Tipo de prueba</w:t>
+            </w:r>
+          </w:p>
+        </w:tc>
+        <w:tc>
+          <w:tcPr>
+            <w:tcW w:type="dxa" w:w="5216"/>
+            <w:shd w:val="clear" w:fill="5B3FA8"/>
+          </w:tcPr>
+          <w:p>
+            <w:r>
+              <w:rPr>
+                <w:b/>
+                <w:color w:val="FFFFFF"/>
+                <w:sz w:val="19"/>
+              </w:rPr>
+              <w:t>Claves para el cuestionario</w:t>
+            </w:r>
+          </w:p>
+        </w:tc>
+      </w:tr>
+      <w:tr>
+        <w:tc>
+          <w:tcPr>
+            <w:tcW w:type="dxa" w:w="2041"/>
+          </w:tcPr>
+          <w:p>
+            <w:r>
+              <w:rPr>
+                <w:b/>
+                <w:sz w:val="18"/>
+              </w:rPr>
+              <w:t>Cypress (Equipo 1)</w:t>
+            </w:r>
+          </w:p>
+        </w:tc>
+        <w:tc>
+          <w:tcPr>
+            <w:tcW w:type="dxa" w:w="2268"/>
+          </w:tcPr>
+          <w:p>
+            <w:r>
+              <w:rPr>
+                <w:b w:val="0"/>
+                <w:sz w:val="18"/>
+              </w:rPr>
+              <w:t>E2E / Validación desde el navegador (frontend React).</w:t>
+            </w:r>
+          </w:p>
+        </w:tc>
+        <w:tc>
+          <w:tcPr>
+            <w:tcW w:type="dxa" w:w="5216"/>
+          </w:tcPr>
+          <w:p>
+            <w:r>
+              <w:rPr>
+                <w:b w:val="0"/>
+                <w:sz w:val="18"/>
+              </w:rPr>
+              <w:t>Test Runner, selectores estables data-testid, Time-Travel (snapshots de cada paso), cy.intercept para ver la respuesta del login con el JWT, credenciales en variables de entorno (cypress.env.json / Cypress.env()), nunca en el código.</w:t>
+            </w:r>
+          </w:p>
+        </w:tc>
+      </w:tr>
+      <w:tr>
+        <w:tc>
+          <w:tcPr>
+            <w:tcW w:type="dxa" w:w="2041"/>
+          </w:tcPr>
+          <w:p>
+            <w:r>
+              <w:rPr>
+                <w:b/>
+                <w:sz w:val="18"/>
+              </w:rPr>
+              <w:t>REST Assured + JUnit 5 (Equipos 2 y 5)</w:t>
+            </w:r>
+          </w:p>
+        </w:tc>
+        <w:tc>
+          <w:tcPr>
+            <w:tcW w:type="dxa" w:w="2268"/>
+          </w:tcPr>
+          <w:p>
+            <w:r>
+              <w:rPr>
+                <w:b w:val="0"/>
+                <w:sz w:val="18"/>
+              </w:rPr>
+              <w:t>Verificación de API como código (Java / Maven).</w:t>
+            </w:r>
+          </w:p>
+        </w:tc>
+        <w:tc>
+          <w:tcPr>
+            <w:tcW w:type="dxa" w:w="5216"/>
+          </w:tcPr>
+          <w:p>
+            <w:r>
+              <w:rPr>
+                <w:b w:val="0"/>
+                <w:sz w:val="18"/>
+              </w:rPr>
+              <w:t>given().header().body().when().post().then().statusCode(); aserciones sobre el JSON con Hamcrest (equalTo, notNullValue); @Test, @DisplayName; se corre con mvn test.</w:t>
+            </w:r>
+          </w:p>
+        </w:tc>
+      </w:tr>
+      <w:tr>
+        <w:tc>
+          <w:tcPr>
+            <w:tcW w:type="dxa" w:w="2041"/>
+          </w:tcPr>
+          <w:p>
+            <w:r>
+              <w:rPr>
+                <w:b/>
+                <w:sz w:val="18"/>
+              </w:rPr>
+              <w:t>Apache JMeter (Equipo 3)</w:t>
+            </w:r>
+          </w:p>
+        </w:tc>
+        <w:tc>
+          <w:tcPr>
+            <w:tcW w:type="dxa" w:w="2268"/>
+          </w:tcPr>
+          <w:p>
+            <w:r>
+              <w:rPr>
+                <w:b w:val="0"/>
+                <w:sz w:val="18"/>
+              </w:rPr>
+              <w:t>Carga y rendimiento (no funcional).</w:t>
+            </w:r>
+          </w:p>
+        </w:tc>
+        <w:tc>
+          <w:tcPr>
+            <w:tcW w:type="dxa" w:w="5216"/>
+          </w:tcPr>
+          <w:p>
+            <w:r>
+              <w:rPr>
+                <w:b w:val="0"/>
+                <w:sz w:val="18"/>
+              </w:rPr>
+              <w:t>Plan de pruebas .jmx; Thread Group = usuarios virtuales (ej. 50) + ramp-up; listeners Summary Report / Ver Árbol de Resultados; métricas: tiempo de respuesta promedio (ms), percentiles 90/95, throughput (peticiones/seg) y % de error. Se busca el punto donde el sistema se degrada.</w:t>
+            </w:r>
+          </w:p>
+        </w:tc>
+      </w:tr>
+      <w:tr>
+        <w:tc>
+          <w:tcPr>
+            <w:tcW w:type="dxa" w:w="2041"/>
+          </w:tcPr>
+          <w:p>
+            <w:r>
+              <w:rPr>
+                <w:b/>
+                <w:sz w:val="18"/>
+              </w:rPr>
+              <w:t>MockMvc (Equipo 4)</w:t>
+            </w:r>
+          </w:p>
+        </w:tc>
+        <w:tc>
+          <w:tcPr>
+            <w:tcW w:type="dxa" w:w="2268"/>
+          </w:tcPr>
+          <w:p>
+            <w:r>
+              <w:rPr>
+                <w:b w:val="0"/>
+                <w:sz w:val="18"/>
+              </w:rPr>
+              <w:t>Verificación de controladores y seguridad (Spring Boot Test).</w:t>
+            </w:r>
+          </w:p>
+        </w:tc>
+        <w:tc>
+          <w:tcPr>
+            <w:tcW w:type="dxa" w:w="5216"/>
+          </w:tcPr>
+          <w:p>
+            <w:r>
+              <w:rPr>
+                <w:b w:val="0"/>
+                <w:sz w:val="18"/>
+              </w:rPr>
+              <w:t>mockMvc.perform(get("/api/contratos")) sin servidor real; .andExpect(status().isUnauthorized()) o isForbidden(); con token válido, isOk() y el JSON. Más liviano que levantar el servidor.</w:t>
+            </w:r>
+          </w:p>
+        </w:tc>
+      </w:tr>
+      <w:tr>
+        <w:tc>
+          <w:tcPr>
+            <w:tcW w:type="dxa" w:w="2041"/>
+          </w:tcPr>
+          <w:p>
+            <w:r>
+              <w:rPr>
+                <w:b/>
+                <w:sz w:val="18"/>
+              </w:rPr>
+              <w:t>Postman (Equipo 5)</w:t>
+            </w:r>
+          </w:p>
+        </w:tc>
+        <w:tc>
+          <w:tcPr>
+            <w:tcW w:type="dxa" w:w="2268"/>
+          </w:tcPr>
+          <w:p>
+            <w:r>
+              <w:rPr>
+                <w:b w:val="0"/>
+                <w:sz w:val="18"/>
+              </w:rPr>
+              <w:t>Pruebas de API manuales o automatizadas (GUI).</w:t>
+            </w:r>
+          </w:p>
+        </w:tc>
+        <w:tc>
+          <w:tcPr>
+            <w:tcW w:type="dxa" w:w="5216"/>
+          </w:tcPr>
+          <w:p>
+            <w:r>
+              <w:rPr>
+                <w:b w:val="0"/>
+                <w:sz w:val="18"/>
+              </w:rPr>
+              <w:t>Colecciones, entornos y variables ({{baseUrl}}, {{token}}), scripts Pre-request y Tests (pm.test, pm.expect), Collection Runner y Newman (CLI) para automatizar.</w:t>
+            </w:r>
+          </w:p>
+        </w:tc>
+      </w:tr>
+      <w:tr>
+        <w:tc>
+          <w:tcPr>
+            <w:tcW w:type="dxa" w:w="2041"/>
+          </w:tcPr>
+          <w:p>
+            <w:r>
+              <w:rPr>
+                <w:b/>
+                <w:sz w:val="18"/>
+              </w:rPr>
+              <w:t>OWASP ZAP (Equipo 6)</w:t>
+            </w:r>
+          </w:p>
+        </w:tc>
+        <w:tc>
+          <w:tcPr>
+            <w:tcW w:type="dxa" w:w="2268"/>
+          </w:tcPr>
+          <w:p>
+            <w:r>
+              <w:rPr>
+                <w:b w:val="0"/>
+                <w:sz w:val="18"/>
+              </w:rPr>
+              <w:t>DAST: seguridad dinámica sobre la app en ejecución.</w:t>
+            </w:r>
+          </w:p>
+        </w:tc>
+        <w:tc>
+          <w:tcPr>
+            <w:tcW w:type="dxa" w:w="5216"/>
+          </w:tcPr>
+          <w:p>
+            <w:r>
+              <w:rPr>
+                <w:b w:val="0"/>
+                <w:sz w:val="18"/>
+              </w:rPr>
+              <w:t>Spider (descubre URLs) y Active Scan (ataca formularios); árbol de alertas por riesgo (alto / medio / bajo / informativo); hallazgos típicos: falta de Content-Security-Policy y X-Frame-Options (clickjacking), cookies sin HttpOnly ni Secure. DAST = app corriendo; SAST = análisis del código fuente sin ejecutarlo.</w:t>
+            </w:r>
+          </w:p>
+        </w:tc>
+      </w:tr>
+    </w:tbl>
+    <w:p>
+      <w:pPr>
+        <w:spacing w:after="80"/>
+      </w:pPr>
+    </w:p>
+    <w:p>
+      <w:pPr>
+        <w:pStyle w:val="Heading2"/>
+      </w:pPr>
+      <w:r>
+        <w:t>Seguridad (aparece en varias consignas)</w:t>
+      </w:r>
+    </w:p>
+    <w:p>
+      <w:pPr>
+        <w:pStyle w:val="ListBullet"/>
+        <w:spacing w:after="40"/>
+      </w:pPr>
+      <w:r>
+        <w:rPr>
+          <w:b/>
+        </w:rPr>
+        <w:t>JWT (JSON Web Token):</w:t>
+      </w:r>
+      <w:r>
+        <w:rPr>
+          <w:b w:val="0"/>
+        </w:rPr>
+        <w:t xml:space="preserve"> token firmado que el backend entrega en el login; el cliente lo manda en cada petición en la cabecera </w:t>
+      </w:r>
+      <w:r>
+        <w:rPr>
+          <w:b/>
+        </w:rPr>
+        <w:t>Authorization: Bearer &lt;token&gt;</w:t>
+      </w:r>
+      <w:r>
+        <w:rPr>
+          <w:b w:val="0"/>
+        </w:rPr>
+        <w:t>. Tiene vencimiento.</w:t>
+      </w:r>
+    </w:p>
+    <w:p>
+      <w:pPr>
+        <w:pStyle w:val="ListBullet"/>
+        <w:spacing w:after="40"/>
+      </w:pPr>
+      <w:r>
+        <w:rPr>
+          <w:b/>
+        </w:rPr>
+        <w:t>Autenticación vs. autorización:</w:t>
+      </w:r>
+      <w:r>
+        <w:rPr>
+          <w:b w:val="0"/>
+        </w:rPr>
+        <w:t xml:space="preserve"> quién sos (login → 401 si falla) vs. qué podés hacer (permisos → 403 si no tenés).</w:t>
+      </w:r>
+    </w:p>
+    <w:p>
+      <w:pPr>
+        <w:pStyle w:val="ListBullet"/>
+        <w:spacing w:after="40"/>
+      </w:pPr>
+      <w:r>
+        <w:rPr>
+          <w:b/>
+        </w:rPr>
+        <w:t>Cabeceras de seguridad:</w:t>
+      </w:r>
+      <w:r>
+        <w:rPr>
+          <w:b w:val="0"/>
+        </w:rPr>
+        <w:t xml:space="preserve"> Content-Security-Policy (qué recursos puede cargar la página, frena XSS), X-Frame-Options (evita que te metan en un iframe: clickjacking), Strict-Transport-Security (fuerza HTTPS).</w:t>
+      </w:r>
+    </w:p>
+    <w:p>
+      <w:pPr>
+        <w:pStyle w:val="ListBullet"/>
+        <w:spacing w:after="40"/>
+      </w:pPr>
+      <w:r>
+        <w:rPr>
+          <w:b/>
+        </w:rPr>
+        <w:t>Cookies:</w:t>
+      </w:r>
+      <w:r>
+        <w:rPr>
+          <w:b w:val="0"/>
+        </w:rPr>
+        <w:t xml:space="preserve"> HttpOnly (JavaScript no la puede leer, mitiga robo por XSS), Secure (solo por HTTPS), SameSite (mitiga CSRF).</w:t>
+      </w:r>
+    </w:p>
+    <w:p>
+      <w:pPr>
+        <w:pStyle w:val="ListBullet"/>
+        <w:spacing w:after="40"/>
+      </w:pPr>
+      <w:r>
+        <w:rPr>
+          <w:b/>
+        </w:rPr>
+        <w:t>Credenciales fuera del código:</w:t>
+      </w:r>
+      <w:r>
+        <w:rPr>
+          <w:b w:val="0"/>
+        </w:rPr>
+        <w:t xml:space="preserve"> variables de entorno o archivos ignorados por Git (en GestaPro, las claves van en variables de entorno, no en el repositorio).</w:t>
+      </w:r>
+    </w:p>
+    <w:p>
+      <w:pPr>
+        <w:pStyle w:val="Heading2"/>
+      </w:pPr>
+      <w:r>
+        <w:t>Preguntas de práctica</w:t>
+      </w:r>
+    </w:p>
+    <w:p>
+      <w:pPr>
+        <w:pStyle w:val="ListBullet"/>
+        <w:spacing w:after="40"/>
+      </w:pPr>
+      <w:r>
+        <w:rPr>
+          <w:b/>
+        </w:rPr>
+        <w:t>Un endpoint protegido responde cuando lo llamás sin token. ¿Qué código esperás?</w:t>
+      </w:r>
+      <w:r>
+        <w:rPr>
+          <w:b w:val="0"/>
+        </w:rPr>
+        <w:t xml:space="preserve"> 401 Unauthorized.</w:t>
+      </w:r>
+    </w:p>
+    <w:p>
+      <w:pPr>
+        <w:pStyle w:val="ListBullet"/>
+        <w:spacing w:after="40"/>
+      </w:pPr>
+      <w:r>
+        <w:rPr>
+          <w:b/>
+        </w:rPr>
+        <w:t>Un usuario logueado sin permiso intenta entrar a un módulo. ¿Qué código?</w:t>
+      </w:r>
+      <w:r>
+        <w:rPr>
+          <w:b w:val="0"/>
+        </w:rPr>
+        <w:t xml:space="preserve"> 403 Forbidden.</w:t>
+      </w:r>
+    </w:p>
+    <w:p>
+      <w:pPr>
+        <w:pStyle w:val="ListBullet"/>
+        <w:spacing w:after="40"/>
+      </w:pPr>
+      <w:r>
+        <w:rPr>
+          <w:b/>
+        </w:rPr>
+        <w:t>¿Qué herramienta usarías para medir cuántos usuarios simultáneos soporta el backend?</w:t>
+      </w:r>
+      <w:r>
+        <w:rPr>
+          <w:b w:val="0"/>
+        </w:rPr>
+        <w:t xml:space="preserve"> Apache JMeter.</w:t>
+      </w:r>
+    </w:p>
+    <w:p>
+      <w:pPr>
+        <w:pStyle w:val="ListBullet"/>
+        <w:spacing w:after="40"/>
+      </w:pPr>
+      <w:r>
+        <w:rPr>
+          <w:b/>
+        </w:rPr>
+        <w:t>¿Qué métrica de JMeter indica cuántas peticiones por segundo procesa el sistema?</w:t>
+      </w:r>
+      <w:r>
+        <w:rPr>
+          <w:b w:val="0"/>
+        </w:rPr>
+        <w:t xml:space="preserve"> Throughput.</w:t>
+      </w:r>
+    </w:p>
+    <w:p>
+      <w:pPr>
+        <w:pStyle w:val="ListBullet"/>
+        <w:spacing w:after="40"/>
+      </w:pPr>
+      <w:r>
+        <w:rPr>
+          <w:b/>
+        </w:rPr>
+        <w:t>¿Qué tipo de prueba es OWASP ZAP sobre la app levantada?</w:t>
+      </w:r>
+      <w:r>
+        <w:rPr>
+          <w:b w:val="0"/>
+        </w:rPr>
+        <w:t xml:space="preserve"> DAST (prueba dinámica de seguridad).</w:t>
+      </w:r>
+    </w:p>
+    <w:p>
+      <w:pPr>
+        <w:pStyle w:val="ListBullet"/>
+        <w:spacing w:after="40"/>
+      </w:pPr>
+      <w:r>
+        <w:rPr>
+          <w:b/>
+        </w:rPr>
+        <w:t>¿Para qué sirve data-testid en Cypress?</w:t>
+      </w:r>
+      <w:r>
+        <w:rPr>
+          <w:b w:val="0"/>
+        </w:rPr>
+        <w:t xml:space="preserve"> Para tener selectores estables que no se rompen si cambia el estilo o el texto.</w:t>
+      </w:r>
+    </w:p>
+    <w:p>
+      <w:pPr>
+        <w:pStyle w:val="ListBullet"/>
+        <w:spacing w:after="40"/>
+      </w:pPr>
+      <w:r>
+        <w:rPr>
+          <w:b/>
+        </w:rPr>
+        <w:t>En REST Assured, ¿en qué bloque van las aserciones?</w:t>
+      </w:r>
+      <w:r>
+        <w:rPr>
+          <w:b w:val="0"/>
+        </w:rPr>
+        <w:t xml:space="preserve"> En then().</w:t>
+      </w:r>
+    </w:p>
+    <w:p>
+      <w:pPr>
+        <w:pStyle w:val="ListBullet"/>
+        <w:spacing w:after="40"/>
+      </w:pPr>
+      <w:r>
+        <w:rPr>
+          <w:b/>
+        </w:rPr>
+        <w:t>¿Cómo se corre una colección de Postman desde la consola o un pipeline?</w:t>
+      </w:r>
+      <w:r>
+        <w:rPr>
+          <w:b w:val="0"/>
+        </w:rPr>
+        <w:t xml:space="preserve"> Con Newman.</w:t>
+      </w:r>
+    </w:p>
+    <w:p>
+      <w:pPr>
+        <w:pStyle w:val="ListBullet"/>
+        <w:spacing w:after="40"/>
+      </w:pPr>
+      <w:r>
+        <w:rPr>
+          <w:b/>
+        </w:rPr>
+        <w:t>¿MockMvc levanta un servidor HTTP real?</w:t>
+      </w:r>
+      <w:r>
+        <w:rPr>
+          <w:b w:val="0"/>
+        </w:rPr>
+        <w:t xml:space="preserve"> No: simula las peticiones contra el contexto de Spring, sin abrir un puerto.</w:t>
+      </w:r>
+    </w:p>
+    <w:p>
+      <w:pPr>
+        <w:pStyle w:val="ListBullet"/>
+        <w:spacing w:after="40"/>
+      </w:pPr>
+      <w:r>
+        <w:rPr>
+          <w:b/>
+        </w:rPr>
+        <w:t>Probar que la API devuelve el JSON con la estructura acordada, ¿es verificación o validación?</w:t>
+      </w:r>
+      <w:r>
+        <w:rPr>
+          <w:b w:val="0"/>
+        </w:rPr>
+        <w:t xml:space="preserve"> Verificación.</w:t>
+      </w:r>
+    </w:p>
+    <w:p>
+      <w:pPr>
+        <w:pStyle w:val="ListBullet"/>
+        <w:spacing w:after="40"/>
+      </w:pPr>
+      <w:r>
+        <w:rPr>
+          <w:b/>
+        </w:rPr>
+        <w:t>Una prueba E2E desde el navegador que confirma que el usuario puede loguearse y llegar al dashboard, ¿qué es principalmente?</w:t>
+      </w:r>
+      <w:r>
+        <w:rPr>
+          <w:b w:val="0"/>
+        </w:rPr>
+        <w:t xml:space="preserve"> Validación (experiencia del usuario).</w:t>
+      </w:r>
+    </w:p>
+    <w:p>
+      <w:pPr>
+        <w:pStyle w:val="ListBullet"/>
+        <w:spacing w:after="40"/>
+      </w:pPr>
+      <w:r>
+        <w:rPr>
+          <w:b/>
+        </w:rPr>
+        <w:t>¿Qué cabecera evita el clickjacking?</w:t>
+      </w:r>
+      <w:r>
+        <w:rPr>
+          <w:b w:val="0"/>
+        </w:rPr>
+        <w:t xml:space="preserve"> X-Frame-Options (o frame-ancestors en la CSP).</w:t>
       </w:r>
     </w:p>
     <w:sectPr>

</xml_diff>

<commit_message>
REST Assured solo en local, comentado para la demo, y guia de la IE2 para el equipo
- RegistrarClienteRestAssuredTest corre solo contra el backend que levanta el test
  (sin opcion de apuntar a la app publicada) y tiene comentarios PASO 1 a 6 para
  leerlos en la demostracion.
- Documento de la IE2 reorganizado: que pide la actividad y como se evalua, chequeo
  de cumplimiento, preparacion de la compu paso a paso, cuadros comparativos,
  pruebas en vivo, guion, preguntas y guia de estudio.
</commit_message>
<xml_diff>
--- a/docs/ie2/IE2_Equipo5_Mapa_Comparativo_y_Pruebas.docx
+++ b/docs/ie2/IE2_Equipo5_Mapa_Comparativo_y_Pruebas.docx
@@ -120,7 +120,237 @@
         <w:pStyle w:val="Heading1"/>
       </w:pPr>
       <w:r>
-        <w:t>Consigna</w:t>
+        <w:t>1. Cómo usar este documento (Lisandro, leé esto primero)</w:t>
+      </w:r>
+    </w:p>
+    <w:p>
+      <w:pPr>
+        <w:spacing w:after="80"/>
+      </w:pPr>
+      <w:r>
+        <w:rPr>
+          <w:b w:val="0"/>
+          <w:i w:val="0"/>
+        </w:rPr>
+        <w:t>Todo lo que necesitamos para la Instancia Evaluativa 2 está acá. Orden recomendado:</w:t>
+      </w:r>
+    </w:p>
+    <w:p>
+      <w:pPr>
+        <w:spacing w:after="40"/>
+        <w:ind w:left="510" w:hanging="340"/>
+      </w:pPr>
+      <w:r>
+        <w:rPr>
+          <w:b/>
+        </w:rPr>
+        <w:t xml:space="preserve">1. </w:t>
+      </w:r>
+      <w:r>
+        <w:rPr>
+          <w:b/>
+        </w:rPr>
+        <w:t>Sección 2:</w:t>
+      </w:r>
+      <w:r>
+        <w:rPr>
+          <w:b w:val="0"/>
+        </w:rPr>
+        <w:t xml:space="preserve"> qué pide la actividad, cómo nos evalúan y el chequeo de que cumplimos todo.</w:t>
+      </w:r>
+    </w:p>
+    <w:p>
+      <w:pPr>
+        <w:spacing w:after="40"/>
+        <w:ind w:left="510" w:hanging="340"/>
+      </w:pPr>
+      <w:r>
+        <w:rPr>
+          <w:b/>
+        </w:rPr>
+        <w:t xml:space="preserve">2. </w:t>
+      </w:r>
+      <w:r>
+        <w:rPr>
+          <w:b/>
+        </w:rPr>
+        <w:t>Sección 3:</w:t>
+      </w:r>
+      <w:r>
+        <w:rPr>
+          <w:b w:val="0"/>
+        </w:rPr>
+        <w:t xml:space="preserve"> preparar tu compu, una sola vez (Postman e IntelliJ). Hacelo antes de la clase y no el mismo día.</w:t>
+      </w:r>
+    </w:p>
+    <w:p>
+      <w:pPr>
+        <w:spacing w:after="40"/>
+        <w:ind w:left="510" w:hanging="340"/>
+      </w:pPr>
+      <w:r>
+        <w:rPr>
+          <w:b/>
+        </w:rPr>
+        <w:t xml:space="preserve">3. </w:t>
+      </w:r>
+      <w:r>
+        <w:rPr>
+          <w:b/>
+        </w:rPr>
+        <w:t>Sección 4:</w:t>
+      </w:r>
+      <w:r>
+        <w:rPr>
+          <w:b w:val="0"/>
+        </w:rPr>
+        <w:t xml:space="preserve"> el caso de prueba y los cuadros del mapa comparativo (lo que presentamos en los minutos 1–2 y 9–10).</w:t>
+      </w:r>
+    </w:p>
+    <w:p>
+      <w:pPr>
+        <w:spacing w:after="40"/>
+        <w:ind w:left="510" w:hanging="340"/>
+      </w:pPr>
+      <w:r>
+        <w:rPr>
+          <w:b/>
+        </w:rPr>
+        <w:t xml:space="preserve">4. </w:t>
+      </w:r>
+      <w:r>
+        <w:rPr>
+          <w:b/>
+        </w:rPr>
+        <w:t>Sección 5:</w:t>
+      </w:r>
+      <w:r>
+        <w:rPr>
+          <w:b w:val="0"/>
+        </w:rPr>
+        <w:t xml:space="preserve"> el paso a paso de cada prueba en vivo. Ensayalo hasta que te salga sin mirar.</w:t>
+      </w:r>
+    </w:p>
+    <w:p>
+      <w:pPr>
+        <w:spacing w:after="40"/>
+        <w:ind w:left="510" w:hanging="340"/>
+      </w:pPr>
+      <w:r>
+        <w:rPr>
+          <w:b/>
+        </w:rPr>
+        <w:t xml:space="preserve">5. </w:t>
+      </w:r>
+      <w:r>
+        <w:rPr>
+          <w:b/>
+        </w:rPr>
+        <w:t>Sección 7:</w:t>
+      </w:r>
+      <w:r>
+        <w:rPr>
+          <w:b w:val="0"/>
+        </w:rPr>
+        <w:t xml:space="preserve"> el guion de los 10 minutos: quién dice y hace qué.</w:t>
+      </w:r>
+    </w:p>
+    <w:p>
+      <w:pPr>
+        <w:spacing w:after="40"/>
+        <w:ind w:left="510" w:hanging="340"/>
+      </w:pPr>
+      <w:r>
+        <w:rPr>
+          <w:b/>
+        </w:rPr>
+        <w:t xml:space="preserve">6. </w:t>
+      </w:r>
+      <w:r>
+        <w:rPr>
+          <w:b/>
+        </w:rPr>
+        <w:t>Secciones 8 y 9:</w:t>
+      </w:r>
+      <w:r>
+        <w:rPr>
+          <w:b w:val="0"/>
+        </w:rPr>
+        <w:t xml:space="preserve"> preguntas que nos pueden hacer y la guía de estudio para el cuestionario individual (Fase 1).</w:t>
+      </w:r>
+    </w:p>
+    <w:p>
+      <w:pPr>
+        <w:spacing w:after="160"/>
+      </w:pPr>
+      <w:r>
+        <w:rPr>
+          <w:b/>
+          <w:i w:val="0"/>
+        </w:rPr>
+        <w:t>Reparto:</w:t>
+      </w:r>
+      <w:r>
+        <w:rPr>
+          <w:b w:val="0"/>
+          <w:i w:val="0"/>
+        </w:rPr>
+        <w:t xml:space="preserve"> Lisandro muestra </w:t>
+      </w:r>
+      <w:r>
+        <w:rPr>
+          <w:b/>
+          <w:i w:val="0"/>
+        </w:rPr>
+        <w:t>Postman</w:t>
+      </w:r>
+      <w:r>
+        <w:rPr>
+          <w:b w:val="0"/>
+          <w:i w:val="0"/>
+        </w:rPr>
+        <w:t xml:space="preserve">; Lucas muestra </w:t>
+      </w:r>
+      <w:r>
+        <w:rPr>
+          <w:b/>
+          <w:i w:val="0"/>
+        </w:rPr>
+        <w:t>REST Assured</w:t>
+      </w:r>
+      <w:r>
+        <w:rPr>
+          <w:b w:val="0"/>
+          <w:i w:val="0"/>
+        </w:rPr>
+        <w:t>. Los dos hablan en la introducción, en la lectura de resultados y en el cierre.</w:t>
+      </w:r>
+    </w:p>
+    <w:p>
+      <w:pPr>
+        <w:pStyle w:val="Heading1"/>
+      </w:pPr>
+      <w:r>
+        <w:t>2. La actividad y cómo nos evalúan</w:t>
+      </w:r>
+    </w:p>
+    <w:p>
+      <w:pPr>
+        <w:spacing w:after="40"/>
+      </w:pPr>
+      <w:r>
+        <w:rPr>
+          <w:b/>
+          <w:i w:val="0"/>
+        </w:rPr>
+        <w:t>Consigna del Equipo 5:</w:t>
+      </w:r>
+      <w:r>
+        <w:rPr>
+          <w:b w:val="0"/>
+          <w:i w:val="0"/>
+        </w:rPr>
+        <w:t xml:space="preserve"> Demostración comparativa de API Testing (Postman vs. REST Assured).</w:t>
       </w:r>
     </w:p>
     <w:p>
@@ -132,19 +362,7 @@
         <w:rPr>
           <w:b w:val="0"/>
         </w:rPr>
-        <w:t xml:space="preserve">Presentar los criterios del mapa comparativo para seleccionar entre herramientas visuales (GUI) y librerías de código nativo. → </w:t>
-      </w:r>
-      <w:r>
-        <w:rPr>
-          <w:b/>
-        </w:rPr>
-        <w:t>Cuadros 1 y 2</w:t>
-      </w:r>
-      <w:r>
-        <w:rPr>
-          <w:b w:val="0"/>
-        </w:rPr>
-        <w:t>.</w:t>
+        <w:t>Presentar los criterios del mapa comparativo para seleccionar entre herramientas visuales (GUI) y librerías de código nativo.</w:t>
       </w:r>
     </w:p>
     <w:p>
@@ -156,19 +374,7 @@
         <w:rPr>
           <w:b w:val="0"/>
         </w:rPr>
-        <w:t xml:space="preserve">Ejecutar en directo una petición HTTP POST en Postman, mostrando la inspección de cabeceras, body JSON y estado HTTP. → </w:t>
-      </w:r>
-      <w:r>
-        <w:rPr>
-          <w:b/>
-        </w:rPr>
-        <w:t>Sección 6.2</w:t>
-      </w:r>
-      <w:r>
-        <w:rPr>
-          <w:b w:val="0"/>
-        </w:rPr>
-        <w:t>.</w:t>
+        <w:t>Ejecutar en directo una petición HTTP POST en Postman, mostrando la inspección de cabeceras, body JSON y estado HTTP.</w:t>
       </w:r>
     </w:p>
     <w:p>
@@ -180,19 +386,7 @@
         <w:rPr>
           <w:b w:val="0"/>
         </w:rPr>
-        <w:t xml:space="preserve">Ejecutar exactamente el mismo caso de prueba escrito en Java con REST Assured desde el IDE con JUnit 5. → </w:t>
-      </w:r>
-      <w:r>
-        <w:rPr>
-          <w:b/>
-        </w:rPr>
-        <w:t>Cuadro 5 y sección 6.4</w:t>
-      </w:r>
-      <w:r>
-        <w:rPr>
-          <w:b w:val="0"/>
-        </w:rPr>
-        <w:t>.</w:t>
+        <w:t>Ejecutar exactamente el mismo caso de prueba escrito en Java usando REST Assured desde el IDE con JUnit 5.</w:t>
       </w:r>
     </w:p>
     <w:p>
@@ -204,27 +398,1342 @@
         <w:rPr>
           <w:b w:val="0"/>
         </w:rPr>
-        <w:t xml:space="preserve">Comparar ambas herramientas en facilidad de uso, mantenibilidad e integración en automatizaciones. → </w:t>
-      </w:r>
+        <w:t>Comparar ambas herramientas en cuanto a facilidad de uso, mantenibilidad e integración en automatizaciones.</w:t>
+      </w:r>
+    </w:p>
+    <w:p>
+      <w:pPr>
+        <w:spacing w:after="40"/>
+      </w:pPr>
       <w:r>
         <w:rPr>
           <w:b/>
-        </w:rPr>
-        <w:t>Cuadro 1 y sección 7</w:t>
+          <w:i w:val="0"/>
+        </w:rPr>
+        <w:t>Lineamientos generales de la IE2:</w:t>
+      </w:r>
+    </w:p>
+    <w:p>
+      <w:pPr>
+        <w:pStyle w:val="ListBullet"/>
+        <w:spacing w:after="40"/>
+      </w:pPr>
+      <w:r>
+        <w:rPr>
+          <w:b/>
+        </w:rPr>
+        <w:t>Fase 1 — individual:</w:t>
       </w:r>
       <w:r>
         <w:rPr>
           <w:b w:val="0"/>
         </w:rPr>
-        <w:t>.</w:t>
-      </w:r>
+        <w:t xml:space="preserve"> cuestionario de opción múltiple (conceptos, herramientas, códigos HTTP, métricas y seguridad). Para eso está la sección 9.</w:t>
+      </w:r>
+    </w:p>
+    <w:p>
+      <w:pPr>
+        <w:pStyle w:val="ListBullet"/>
+        <w:spacing w:after="40"/>
+      </w:pPr>
+      <w:r>
+        <w:rPr>
+          <w:b/>
+        </w:rPr>
+        <w:t>Fase 2 — grupal en vivo, máximo 10 minutos:</w:t>
+      </w:r>
+      <w:r>
+        <w:rPr>
+          <w:b w:val="0"/>
+        </w:rPr>
+        <w:t xml:space="preserve"> se ejecuta en tiempo real desde el IDE, la consola o el navegador. </w:t>
+      </w:r>
+      <w:r>
+        <w:rPr>
+          <w:b/>
+        </w:rPr>
+        <w:t>Está prohibido usar capturas de pantalla o diapositivas estáticas para la demostración práctica.</w:t>
+      </w:r>
+      <w:r>
+        <w:rPr>
+          <w:b w:val="0"/>
+        </w:rPr>
+        <w:t xml:space="preserve"> Este documento es para prepararnos, no para proyectarlo.</w:t>
+      </w:r>
+    </w:p>
+    <w:p>
+      <w:pPr>
+        <w:pStyle w:val="ListBullet"/>
+        <w:spacing w:after="40"/>
+      </w:pPr>
+      <w:r>
+        <w:rPr>
+          <w:b/>
+        </w:rPr>
+        <w:t>Se evalúa:</w:t>
+      </w:r>
+      <w:r>
+        <w:rPr>
+          <w:b w:val="0"/>
+        </w:rPr>
+        <w:t xml:space="preserve"> reproducibilidad (que corra en vivo sin fallas de configuración), rigurosidad técnica (dominar la herramienta y fundamentar el tipo de prueba) y trabajo colaborativo (que participemos los dos durante los 10 minutos).</w:t>
+      </w:r>
+    </w:p>
+    <w:p>
+      <w:pPr>
+        <w:pStyle w:val="ListBullet"/>
+        <w:spacing w:after="40"/>
+      </w:pPr>
+      <w:r>
+        <w:rPr>
+          <w:b/>
+        </w:rPr>
+        <w:t>Tiempos sugeridos:</w:t>
+      </w:r>
+      <w:r>
+        <w:rPr>
+          <w:b w:val="0"/>
+        </w:rPr>
+        <w:t xml:space="preserve"> minutos 1–2, introducción al flujo de negocio y clasificación ¿Verificación o Validación?; 3–6, ejecución técnica en vivo; 7–8, inspección e interpretación de los reportes y salidas; 9–10, conclusión del valor aportado a la calidad y cierre.</w:t>
+      </w:r>
+    </w:p>
+    <w:p>
+      <w:pPr>
+        <w:pStyle w:val="Heading2"/>
+      </w:pPr>
+      <w:r>
+        <w:t>¿Cumplimos con todo? (chequeo)</w:t>
+      </w:r>
+    </w:p>
+    <w:tbl>
+      <w:tblPr>
+        <w:tblStyle w:val="TableGrid"/>
+        <w:tblW w:type="auto" w:w="0"/>
+        <w:jc w:val="center"/>
+        <w:tblLook w:firstColumn="1" w:firstRow="1" w:lastColumn="0" w:lastRow="0" w:noHBand="0" w:noVBand="1" w:val="04A0"/>
+      </w:tblPr>
+      <w:tblGrid>
+        <w:gridCol w:w="3324"/>
+        <w:gridCol w:w="3324"/>
+        <w:gridCol w:w="3324"/>
+      </w:tblGrid>
+      <w:tr>
+        <w:tc>
+          <w:tcPr>
+            <w:tcW w:type="dxa" w:w="2608"/>
+            <w:shd w:val="clear" w:fill="5B3FA8"/>
+          </w:tcPr>
+          <w:p>
+            <w:r>
+              <w:rPr>
+                <w:b/>
+                <w:color w:val="FFFFFF"/>
+                <w:sz w:val="19"/>
+              </w:rPr>
+              <w:t>Lo que piden</w:t>
+            </w:r>
+          </w:p>
+        </w:tc>
+        <w:tc>
+          <w:tcPr>
+            <w:tcW w:type="dxa" w:w="5329"/>
+            <w:shd w:val="clear" w:fill="5B3FA8"/>
+          </w:tcPr>
+          <w:p>
+            <w:r>
+              <w:rPr>
+                <w:b/>
+                <w:color w:val="FFFFFF"/>
+                <w:sz w:val="19"/>
+              </w:rPr>
+              <w:t>Cómo lo cumplimos</w:t>
+            </w:r>
+          </w:p>
+        </w:tc>
+        <w:tc>
+          <w:tcPr>
+            <w:tcW w:type="dxa" w:w="1814"/>
+            <w:shd w:val="clear" w:fill="5B3FA8"/>
+          </w:tcPr>
+          <w:p>
+            <w:r>
+              <w:rPr>
+                <w:b/>
+                <w:color w:val="FFFFFF"/>
+                <w:sz w:val="19"/>
+              </w:rPr>
+              <w:t>Dónde</w:t>
+            </w:r>
+          </w:p>
+        </w:tc>
+      </w:tr>
+      <w:tr>
+        <w:tc>
+          <w:tcPr>
+            <w:tcW w:type="dxa" w:w="2608"/>
+          </w:tcPr>
+          <w:p>
+            <w:r>
+              <w:rPr>
+                <w:b/>
+                <w:sz w:val="18"/>
+              </w:rPr>
+              <w:t>Criterios del mapa comparativo GUI vs. código</w:t>
+            </w:r>
+          </w:p>
+        </w:tc>
+        <w:tc>
+          <w:tcPr>
+            <w:tcW w:type="dxa" w:w="5329"/>
+          </w:tcPr>
+          <w:p>
+            <w:r>
+              <w:rPr>
+                <w:b w:val="0"/>
+                <w:sz w:val="18"/>
+              </w:rPr>
+              <w:t>Cuadro 1 (13 criterios) y Cuadro 2 (cuándo conviene cada una).</w:t>
+            </w:r>
+          </w:p>
+        </w:tc>
+        <w:tc>
+          <w:tcPr>
+            <w:tcW w:type="dxa" w:w="1814"/>
+          </w:tcPr>
+          <w:p>
+            <w:r>
+              <w:rPr>
+                <w:b w:val="0"/>
+                <w:sz w:val="18"/>
+              </w:rPr>
+              <w:t>Sección 4</w:t>
+            </w:r>
+          </w:p>
+        </w:tc>
+      </w:tr>
+      <w:tr>
+        <w:tc>
+          <w:tcPr>
+            <w:tcW w:type="dxa" w:w="2608"/>
+          </w:tcPr>
+          <w:p>
+            <w:r>
+              <w:rPr>
+                <w:b/>
+                <w:sz w:val="18"/>
+              </w:rPr>
+              <w:t>POST en vivo en Postman con cabeceras, body y estado</w:t>
+            </w:r>
+          </w:p>
+        </w:tc>
+        <w:tc>
+          <w:tcPr>
+            <w:tcW w:type="dxa" w:w="5329"/>
+          </w:tcPr>
+          <w:p>
+            <w:r>
+              <w:rPr>
+                <w:b w:val="0"/>
+                <w:sz w:val="18"/>
+              </w:rPr>
+              <w:t>Una sola petición, POST /api/clientes contra la app publicada en Vercel: pestañas Headers, Body, Status 201 y Test Results.</w:t>
+            </w:r>
+          </w:p>
+        </w:tc>
+        <w:tc>
+          <w:tcPr>
+            <w:tcW w:type="dxa" w:w="1814"/>
+          </w:tcPr>
+          <w:p>
+            <w:r>
+              <w:rPr>
+                <w:b w:val="0"/>
+                <w:sz w:val="18"/>
+              </w:rPr>
+              <w:t>Sección 5.1</w:t>
+            </w:r>
+          </w:p>
+        </w:tc>
+      </w:tr>
+      <w:tr>
+        <w:tc>
+          <w:tcPr>
+            <w:tcW w:type="dxa" w:w="2608"/>
+          </w:tcPr>
+          <w:p>
+            <w:r>
+              <w:rPr>
+                <w:b/>
+                <w:sz w:val="18"/>
+              </w:rPr>
+              <w:t>El mismo caso en Java con REST Assured y JUnit 5 desde el IDE</w:t>
+            </w:r>
+          </w:p>
+        </w:tc>
+        <w:tc>
+          <w:tcPr>
+            <w:tcW w:type="dxa" w:w="5329"/>
+          </w:tcPr>
+          <w:p>
+            <w:r>
+              <w:rPr>
+                <w:b w:val="0"/>
+                <w:sz w:val="18"/>
+              </w:rPr>
+              <w:t>RegistrarClienteRestAssuredTest: mismo POST, mismas cabeceras, mismo JSON y mismas 10 comprobaciones; se corre en IntelliJ.</w:t>
+            </w:r>
+          </w:p>
+        </w:tc>
+        <w:tc>
+          <w:tcPr>
+            <w:tcW w:type="dxa" w:w="1814"/>
+          </w:tcPr>
+          <w:p>
+            <w:r>
+              <w:rPr>
+                <w:b w:val="0"/>
+                <w:sz w:val="18"/>
+              </w:rPr>
+              <w:t>Cuadro 5 y sección 5.3</w:t>
+            </w:r>
+          </w:p>
+        </w:tc>
+      </w:tr>
+      <w:tr>
+        <w:tc>
+          <w:tcPr>
+            <w:tcW w:type="dxa" w:w="2608"/>
+          </w:tcPr>
+          <w:p>
+            <w:r>
+              <w:rPr>
+                <w:b/>
+                <w:sz w:val="18"/>
+              </w:rPr>
+              <w:t>Comparar facilidad de uso, mantenibilidad e integración</w:t>
+            </w:r>
+          </w:p>
+        </w:tc>
+        <w:tc>
+          <w:tcPr>
+            <w:tcW w:type="dxa" w:w="5329"/>
+          </w:tcPr>
+          <w:p>
+            <w:r>
+              <w:rPr>
+                <w:b w:val="0"/>
+                <w:sz w:val="18"/>
+              </w:rPr>
+              <w:t>Cuadro 1 y comparación final con ganador por aspecto; integración mostrada con mvn test y Newman.</w:t>
+            </w:r>
+          </w:p>
+        </w:tc>
+        <w:tc>
+          <w:tcPr>
+            <w:tcW w:type="dxa" w:w="1814"/>
+          </w:tcPr>
+          <w:p>
+            <w:r>
+              <w:rPr>
+                <w:b w:val="0"/>
+                <w:sz w:val="18"/>
+              </w:rPr>
+              <w:t>Secciones 4, 5.4 y 6</w:t>
+            </w:r>
+          </w:p>
+        </w:tc>
+      </w:tr>
+      <w:tr>
+        <w:tc>
+          <w:tcPr>
+            <w:tcW w:type="dxa" w:w="2608"/>
+          </w:tcPr>
+          <w:p>
+            <w:r>
+              <w:rPr>
+                <w:b/>
+                <w:sz w:val="18"/>
+              </w:rPr>
+              <w:t>Clasificación ¿Verificación o Validación?</w:t>
+            </w:r>
+          </w:p>
+        </w:tc>
+        <w:tc>
+          <w:tcPr>
+            <w:tcW w:type="dxa" w:w="5329"/>
+          </w:tcPr>
+          <w:p>
+            <w:r>
+              <w:rPr>
+                <w:b w:val="0"/>
+                <w:sz w:val="18"/>
+              </w:rPr>
+              <w:t>Verificación, fundamentada; además, la prueba clasificada según la Unidad 3.</w:t>
+            </w:r>
+          </w:p>
+        </w:tc>
+        <w:tc>
+          <w:tcPr>
+            <w:tcW w:type="dxa" w:w="1814"/>
+          </w:tcPr>
+          <w:p>
+            <w:r>
+              <w:rPr>
+                <w:b w:val="0"/>
+                <w:sz w:val="18"/>
+              </w:rPr>
+              <w:t>Cuadro 3</w:t>
+            </w:r>
+          </w:p>
+        </w:tc>
+      </w:tr>
+      <w:tr>
+        <w:tc>
+          <w:tcPr>
+            <w:tcW w:type="dxa" w:w="2608"/>
+          </w:tcPr>
+          <w:p>
+            <w:r>
+              <w:rPr>
+                <w:b/>
+                <w:sz w:val="18"/>
+              </w:rPr>
+              <w:t>Inspección e interpretación de reportes y salidas</w:t>
+            </w:r>
+          </w:p>
+        </w:tc>
+        <w:tc>
+          <w:tcPr>
+            <w:tcW w:type="dxa" w:w="5329"/>
+          </w:tcPr>
+          <w:p>
+            <w:r>
+              <w:rPr>
+                <w:b w:val="0"/>
+                <w:sz w:val="18"/>
+              </w:rPr>
+              <w:t>Test Results de Postman; árbol de JUnit y consola con la petición y la respuesta en IntelliJ.</w:t>
+            </w:r>
+          </w:p>
+        </w:tc>
+        <w:tc>
+          <w:tcPr>
+            <w:tcW w:type="dxa" w:w="1814"/>
+          </w:tcPr>
+          <w:p>
+            <w:r>
+              <w:rPr>
+                <w:b w:val="0"/>
+                <w:sz w:val="18"/>
+              </w:rPr>
+              <w:t>Secciones 5.1, 5.3 y 7</w:t>
+            </w:r>
+          </w:p>
+        </w:tc>
+      </w:tr>
+      <w:tr>
+        <w:tc>
+          <w:tcPr>
+            <w:tcW w:type="dxa" w:w="2608"/>
+          </w:tcPr>
+          <w:p>
+            <w:r>
+              <w:rPr>
+                <w:b/>
+                <w:sz w:val="18"/>
+              </w:rPr>
+              <w:t>Reproducibilidad en vivo</w:t>
+            </w:r>
+          </w:p>
+        </w:tc>
+        <w:tc>
+          <w:tcPr>
+            <w:tcW w:type="dxa" w:w="5329"/>
+          </w:tcPr>
+          <w:p>
+            <w:r>
+              <w:rPr>
+                <w:b w:val="0"/>
+                <w:sz w:val="18"/>
+              </w:rPr>
+              <w:t>Postman con un solo entorno; REST Assured levanta su propio backend (no depende de nada externo). Checklist y plan B.</w:t>
+            </w:r>
+          </w:p>
+        </w:tc>
+        <w:tc>
+          <w:tcPr>
+            <w:tcW w:type="dxa" w:w="1814"/>
+          </w:tcPr>
+          <w:p>
+            <w:r>
+              <w:rPr>
+                <w:b w:val="0"/>
+                <w:sz w:val="18"/>
+              </w:rPr>
+              <w:t>Secciones 3 y 5.7</w:t>
+            </w:r>
+          </w:p>
+        </w:tc>
+      </w:tr>
+      <w:tr>
+        <w:tc>
+          <w:tcPr>
+            <w:tcW w:type="dxa" w:w="2608"/>
+          </w:tcPr>
+          <w:p>
+            <w:r>
+              <w:rPr>
+                <w:b/>
+                <w:sz w:val="18"/>
+              </w:rPr>
+              <w:t>Participación de los dos</w:t>
+            </w:r>
+          </w:p>
+        </w:tc>
+        <w:tc>
+          <w:tcPr>
+            <w:tcW w:type="dxa" w:w="5329"/>
+          </w:tcPr>
+          <w:p>
+            <w:r>
+              <w:rPr>
+                <w:b w:val="0"/>
+                <w:sz w:val="18"/>
+              </w:rPr>
+              <w:t>Guion con reparto minuto a minuto.</w:t>
+            </w:r>
+          </w:p>
+        </w:tc>
+        <w:tc>
+          <w:tcPr>
+            <w:tcW w:type="dxa" w:w="1814"/>
+          </w:tcPr>
+          <w:p>
+            <w:r>
+              <w:rPr>
+                <w:b w:val="0"/>
+                <w:sz w:val="18"/>
+              </w:rPr>
+              <w:t>Sección 7</w:t>
+            </w:r>
+          </w:p>
+        </w:tc>
+      </w:tr>
+      <w:tr>
+        <w:tc>
+          <w:tcPr>
+            <w:tcW w:type="dxa" w:w="2608"/>
+          </w:tcPr>
+          <w:p>
+            <w:r>
+              <w:rPr>
+                <w:b/>
+                <w:sz w:val="18"/>
+              </w:rPr>
+              <w:t>Sin capturas ni diapositivas estáticas</w:t>
+            </w:r>
+          </w:p>
+        </w:tc>
+        <w:tc>
+          <w:tcPr>
+            <w:tcW w:type="dxa" w:w="5329"/>
+          </w:tcPr>
+          <w:p>
+            <w:r>
+              <w:rPr>
+                <w:b w:val="0"/>
+                <w:sz w:val="18"/>
+              </w:rPr>
+              <w:t>Todo se muestra en vivo en Postman, IntelliJ y la consola.</w:t>
+            </w:r>
+          </w:p>
+        </w:tc>
+        <w:tc>
+          <w:tcPr>
+            <w:tcW w:type="dxa" w:w="1814"/>
+          </w:tcPr>
+          <w:p>
+            <w:r>
+              <w:rPr>
+                <w:b w:val="0"/>
+                <w:sz w:val="18"/>
+              </w:rPr>
+              <w:t>Sección 7</w:t>
+            </w:r>
+          </w:p>
+        </w:tc>
+      </w:tr>
+      <w:tr>
+        <w:tc>
+          <w:tcPr>
+            <w:tcW w:type="dxa" w:w="2608"/>
+          </w:tcPr>
+          <w:p>
+            <w:r>
+              <w:rPr>
+                <w:b/>
+                <w:sz w:val="18"/>
+              </w:rPr>
+              <w:t>Fase 1 individual</w:t>
+            </w:r>
+          </w:p>
+        </w:tc>
+        <w:tc>
+          <w:tcPr>
+            <w:tcW w:type="dxa" w:w="5329"/>
+          </w:tcPr>
+          <w:p>
+            <w:r>
+              <w:rPr>
+                <w:b w:val="0"/>
+                <w:sz w:val="18"/>
+              </w:rPr>
+              <w:t>Guía de estudio con todas las herramientas de los equipos, códigos HTTP, seguridad y preguntas de práctica.</w:t>
+            </w:r>
+          </w:p>
+        </w:tc>
+        <w:tc>
+          <w:tcPr>
+            <w:tcW w:type="dxa" w:w="1814"/>
+          </w:tcPr>
+          <w:p>
+            <w:r>
+              <w:rPr>
+                <w:b w:val="0"/>
+                <w:sz w:val="18"/>
+              </w:rPr>
+              <w:t>Sección 9</w:t>
+            </w:r>
+          </w:p>
+        </w:tc>
+      </w:tr>
+    </w:tbl>
+    <w:p>
+      <w:pPr>
+        <w:spacing w:after="80"/>
+      </w:pPr>
     </w:p>
     <w:p>
       <w:pPr>
         <w:pStyle w:val="Heading1"/>
       </w:pPr>
       <w:r>
-        <w:t>1. ¿Cómo se prueba un endpoint REST sin abrir el navegador?</w:t>
+        <w:t>3. Preparar tu compu (una sola vez, antes de la clase)</w:t>
+      </w:r>
+    </w:p>
+    <w:p>
+      <w:pPr>
+        <w:pStyle w:val="Heading2"/>
+      </w:pPr>
+      <w:r>
+        <w:t>3.1 Bajar la última versión del proyecto</w:t>
+      </w:r>
+    </w:p>
+    <w:p>
+      <w:pPr>
+        <w:spacing w:after="40"/>
+      </w:pPr>
+      <w:r>
+        <w:rPr>
+          <w:b w:val="0"/>
+          <w:i w:val="0"/>
+        </w:rPr>
+        <w:t xml:space="preserve">En una terminal, dentro de la carpeta del repositorio (o con GitHub Desktop, rama </w:t>
+      </w:r>
+      <w:r>
+        <w:rPr>
+          <w:b/>
+          <w:i w:val="0"/>
+        </w:rPr>
+        <w:t>lucas</w:t>
+      </w:r>
+      <w:r>
+        <w:rPr>
+          <w:b w:val="0"/>
+          <w:i w:val="0"/>
+        </w:rPr>
+        <w:t xml:space="preserve"> → Fetch / Pull):</w:t>
+      </w:r>
+    </w:p>
+    <w:tbl>
+      <w:tblPr>
+        <w:tblW w:type="auto" w:w="0"/>
+        <w:tblLook w:firstColumn="1" w:firstRow="1" w:lastColumn="0" w:lastRow="0" w:noHBand="0" w:noVBand="1" w:val="04A0"/>
+      </w:tblPr>
+      <w:tblGrid>
+        <w:gridCol w:w="9972"/>
+      </w:tblGrid>
+      <w:tr>
+        <w:tc>
+          <w:tcPr>
+            <w:tcW w:type="dxa" w:w="9972"/>
+            <w:shd w:val="clear" w:fill="F3F1F9"/>
+          </w:tcPr>
+          <w:p>
+            <w:pPr>
+              <w:spacing w:after="0"/>
+            </w:pPr>
+            <w:r>
+              <w:rPr>
+                <w:rFonts w:ascii="Consolas" w:hAnsi="Consolas" w:eastAsia="Consolas"/>
+                <w:sz w:val="17"/>
+              </w:rPr>
+              <w:t>git fetch origin</w:t>
+            </w:r>
+          </w:p>
+          <w:p>
+            <w:pPr>
+              <w:spacing w:after="0"/>
+            </w:pPr>
+            <w:r>
+              <w:rPr>
+                <w:rFonts w:ascii="Consolas" w:hAnsi="Consolas" w:eastAsia="Consolas"/>
+                <w:sz w:val="17"/>
+              </w:rPr>
+              <w:t>git checkout lucas</w:t>
+            </w:r>
+          </w:p>
+          <w:p>
+            <w:pPr>
+              <w:spacing w:after="0"/>
+            </w:pPr>
+            <w:r>
+              <w:rPr>
+                <w:rFonts w:ascii="Consolas" w:hAnsi="Consolas" w:eastAsia="Consolas"/>
+                <w:sz w:val="17"/>
+              </w:rPr>
+              <w:t>git pull</w:t>
+            </w:r>
+          </w:p>
+        </w:tc>
+      </w:tr>
+    </w:tbl>
+    <w:p>
+      <w:pPr>
+        <w:spacing w:after="40"/>
+      </w:pPr>
+    </w:p>
+    <w:p>
+      <w:pPr>
+        <w:spacing w:after="80"/>
+      </w:pPr>
+      <w:r>
+        <w:rPr>
+          <w:b w:val="0"/>
+          <w:i/>
+          <w:color w:val="555555"/>
+        </w:rPr>
+        <w:t xml:space="preserve">Tienen que aparecer la carpeta </w:t>
+      </w:r>
+      <w:r>
+        <w:rPr>
+          <w:b/>
+          <w:i/>
+          <w:color w:val="555555"/>
+        </w:rPr>
+        <w:t>docs/ie2</w:t>
+      </w:r>
+      <w:r>
+        <w:rPr>
+          <w:b w:val="0"/>
+          <w:i/>
+          <w:color w:val="555555"/>
+        </w:rPr>
+        <w:t xml:space="preserve"> (este documento y la carpeta postman) y el archivo </w:t>
+      </w:r>
+      <w:r>
+        <w:rPr>
+          <w:b/>
+          <w:i/>
+          <w:color w:val="555555"/>
+        </w:rPr>
+        <w:t>Backend/sistema-gestion-elsur/src/test/java/com/elsur/sistema_gestion/api/RegistrarClienteRestAssuredTest.java</w:t>
+      </w:r>
+      <w:r>
+        <w:rPr>
+          <w:b w:val="0"/>
+          <w:i/>
+          <w:color w:val="555555"/>
+        </w:rPr>
+        <w:t>.</w:t>
+      </w:r>
+    </w:p>
+    <w:p>
+      <w:pPr>
+        <w:pStyle w:val="Heading2"/>
+      </w:pPr>
+      <w:r>
+        <w:t>3.2 Java e IntelliJ (para REST Assured)</w:t>
+      </w:r>
+    </w:p>
+    <w:p>
+      <w:pPr>
+        <w:spacing w:after="40"/>
+        <w:ind w:left="510" w:hanging="340"/>
+      </w:pPr>
+      <w:r>
+        <w:rPr>
+          <w:b/>
+        </w:rPr>
+        <w:t xml:space="preserve">1. </w:t>
+      </w:r>
+      <w:r>
+        <w:rPr>
+          <w:b w:val="0"/>
+        </w:rPr>
+        <w:t xml:space="preserve">El proyecto usa </w:t>
+      </w:r>
+      <w:r>
+        <w:rPr>
+          <w:b/>
+        </w:rPr>
+        <w:t>Java 25</w:t>
+      </w:r>
+      <w:r>
+        <w:rPr>
+          <w:b w:val="0"/>
+        </w:rPr>
+        <w:t xml:space="preserve">. En una terminal, </w:t>
+      </w:r>
+      <w:r>
+        <w:rPr>
+          <w:b/>
+        </w:rPr>
+        <w:t>java -version</w:t>
+      </w:r>
+      <w:r>
+        <w:rPr>
+          <w:b w:val="0"/>
+        </w:rPr>
+        <w:t xml:space="preserve"> tiene que decir 25. Si no, instalar el JDK 25 (por ejemplo, Eclipse Temurin 25).</w:t>
+      </w:r>
+    </w:p>
+    <w:p>
+      <w:pPr>
+        <w:spacing w:after="40"/>
+        <w:ind w:left="510" w:hanging="340"/>
+      </w:pPr>
+      <w:r>
+        <w:rPr>
+          <w:b/>
+        </w:rPr>
+        <w:t xml:space="preserve">2. </w:t>
+      </w:r>
+      <w:r>
+        <w:rPr>
+          <w:b w:val="0"/>
+        </w:rPr>
+        <w:t xml:space="preserve">En </w:t>
+      </w:r>
+      <w:r>
+        <w:rPr>
+          <w:b/>
+        </w:rPr>
+        <w:t>IntelliJ IDEA</w:t>
+      </w:r>
+      <w:r>
+        <w:rPr>
+          <w:b w:val="0"/>
+        </w:rPr>
+        <w:t xml:space="preserve">: File → Open → elegir la carpeta </w:t>
+      </w:r>
+      <w:r>
+        <w:rPr>
+          <w:b/>
+        </w:rPr>
+        <w:t>Backend/sistema-gestion-elsur</w:t>
+      </w:r>
+      <w:r>
+        <w:rPr>
+          <w:b w:val="0"/>
+        </w:rPr>
+        <w:t xml:space="preserve"> (la que tiene el pom.xml) → abrir como proyecto Maven.</w:t>
+      </w:r>
+    </w:p>
+    <w:p>
+      <w:pPr>
+        <w:spacing w:after="40"/>
+        <w:ind w:left="510" w:hanging="340"/>
+      </w:pPr>
+      <w:r>
+        <w:rPr>
+          <w:b/>
+        </w:rPr>
+        <w:t xml:space="preserve">3. </w:t>
+      </w:r>
+      <w:r>
+        <w:rPr>
+          <w:b w:val="0"/>
+        </w:rPr>
+        <w:t>Si pide el SDK: File → Project Structure → Project → SDK → elegir el 25.</w:t>
+      </w:r>
+    </w:p>
+    <w:p>
+      <w:pPr>
+        <w:spacing w:after="40"/>
+        <w:ind w:left="510" w:hanging="340"/>
+      </w:pPr>
+      <w:r>
+        <w:rPr>
+          <w:b/>
+        </w:rPr>
+        <w:t xml:space="preserve">4. </w:t>
+      </w:r>
+      <w:r>
+        <w:rPr>
+          <w:b w:val="0"/>
+        </w:rPr>
+        <w:t>Esperar a que Maven termine de descargar las dependencias (barra de progreso abajo a la derecha). La primera vez necesita internet.</w:t>
+      </w:r>
+    </w:p>
+    <w:p>
+      <w:pPr>
+        <w:spacing w:after="40"/>
+        <w:ind w:left="510" w:hanging="340"/>
+      </w:pPr>
+      <w:r>
+        <w:rPr>
+          <w:b/>
+        </w:rPr>
+        <w:t xml:space="preserve">5. </w:t>
+      </w:r>
+      <w:r>
+        <w:rPr>
+          <w:b w:val="0"/>
+        </w:rPr>
+        <w:t xml:space="preserve">Para que los acentos se vean bien en la consola: arriba a la derecha, desplegable de configuraciones → </w:t>
+      </w:r>
+      <w:r>
+        <w:rPr>
+          <w:b/>
+        </w:rPr>
+        <w:t>Edit Configurations…</w:t>
+      </w:r>
+      <w:r>
+        <w:rPr>
+          <w:b w:val="0"/>
+        </w:rPr>
+        <w:t xml:space="preserve"> → elegir la del test (o la plantilla de JUnit) → </w:t>
+      </w:r>
+      <w:r>
+        <w:rPr>
+          <w:b/>
+        </w:rPr>
+        <w:t>VM options</w:t>
+      </w:r>
+      <w:r>
+        <w:rPr>
+          <w:b w:val="0"/>
+        </w:rPr>
+        <w:t xml:space="preserve">: </w:t>
+      </w:r>
+      <w:r>
+        <w:rPr>
+          <w:b/>
+        </w:rPr>
+        <w:t>-Dstdout.encoding=UTF-8 -Dstderr.encoding=UTF-8</w:t>
+      </w:r>
+      <w:r>
+        <w:rPr>
+          <w:b w:val="0"/>
+        </w:rPr>
+        <w:t xml:space="preserve"> → OK.</w:t>
+      </w:r>
+    </w:p>
+    <w:p>
+      <w:pPr>
+        <w:spacing w:after="40"/>
+        <w:ind w:left="510" w:hanging="340"/>
+      </w:pPr>
+      <w:r>
+        <w:rPr>
+          <w:b/>
+        </w:rPr>
+        <w:t xml:space="preserve">6. </w:t>
+      </w:r>
+      <w:r>
+        <w:rPr>
+          <w:b w:val="0"/>
+        </w:rPr>
+        <w:t xml:space="preserve">Abrir </w:t>
+      </w:r>
+      <w:r>
+        <w:rPr>
+          <w:b/>
+        </w:rPr>
+        <w:t>RegistrarClienteRestAssuredTest</w:t>
+      </w:r>
+      <w:r>
+        <w:rPr>
+          <w:b w:val="0"/>
+        </w:rPr>
+        <w:t xml:space="preserve"> y correrlo una vez con el </w:t>
+      </w:r>
+      <w:r>
+        <w:rPr>
+          <w:b/>
+        </w:rPr>
+        <w:t>triángulo verde</w:t>
+      </w:r>
+      <w:r>
+        <w:rPr>
+          <w:b w:val="0"/>
+        </w:rPr>
+        <w:t xml:space="preserve"> al lado de la clase: tiene que quedar en verde. Si queda en verde en tu compu, en la clase también.</w:t>
+      </w:r>
+    </w:p>
+    <w:p>
+      <w:pPr>
+        <w:pStyle w:val="Heading2"/>
+      </w:pPr>
+      <w:r>
+        <w:t>3.3 Postman</w:t>
+      </w:r>
+    </w:p>
+    <w:p>
+      <w:pPr>
+        <w:spacing w:after="40"/>
+        <w:ind w:left="510" w:hanging="340"/>
+      </w:pPr>
+      <w:r>
+        <w:rPr>
+          <w:b/>
+        </w:rPr>
+        <w:t xml:space="preserve">1. </w:t>
+      </w:r>
+      <w:r>
+        <w:rPr>
+          <w:b w:val="0"/>
+        </w:rPr>
+        <w:t xml:space="preserve">Instalar </w:t>
+      </w:r>
+      <w:r>
+        <w:rPr>
+          <w:b/>
+        </w:rPr>
+        <w:t>Postman</w:t>
+      </w:r>
+      <w:r>
+        <w:rPr>
+          <w:b w:val="0"/>
+        </w:rPr>
+        <w:t xml:space="preserve"> (app de escritorio). Si pide cuenta, crear una gratuita: alcanza.</w:t>
+      </w:r>
+    </w:p>
+    <w:p>
+      <w:pPr>
+        <w:spacing w:after="40"/>
+        <w:ind w:left="510" w:hanging="340"/>
+      </w:pPr>
+      <w:r>
+        <w:rPr>
+          <w:b/>
+        </w:rPr>
+        <w:t xml:space="preserve">2. </w:t>
+      </w:r>
+      <w:r>
+        <w:rPr>
+          <w:b w:val="0"/>
+        </w:rPr>
+        <w:t xml:space="preserve">Botón </w:t>
+      </w:r>
+      <w:r>
+        <w:rPr>
+          <w:b/>
+        </w:rPr>
+        <w:t>Import</w:t>
+      </w:r>
+      <w:r>
+        <w:rPr>
+          <w:b w:val="0"/>
+        </w:rPr>
+        <w:t xml:space="preserve"> (arriba a la izquierda) → arrastrar los </w:t>
+      </w:r>
+      <w:r>
+        <w:rPr>
+          <w:b/>
+        </w:rPr>
+        <w:t>2 archivos</w:t>
+      </w:r>
+      <w:r>
+        <w:rPr>
+          <w:b w:val="0"/>
+        </w:rPr>
+        <w:t xml:space="preserve"> de </w:t>
+      </w:r>
+      <w:r>
+        <w:rPr>
+          <w:b/>
+        </w:rPr>
+        <w:t>docs/ie2/postman</w:t>
+      </w:r>
+      <w:r>
+        <w:rPr>
+          <w:b w:val="0"/>
+        </w:rPr>
+        <w:t xml:space="preserve"> (la colección y el entorno) → </w:t>
+      </w:r>
+      <w:r>
+        <w:rPr>
+          <w:b/>
+        </w:rPr>
+        <w:t>Import</w:t>
+      </w:r>
+      <w:r>
+        <w:rPr>
+          <w:b w:val="0"/>
+        </w:rPr>
+        <w:t>.</w:t>
+      </w:r>
+    </w:p>
+    <w:p>
+      <w:pPr>
+        <w:spacing w:after="40"/>
+        <w:ind w:left="510" w:hanging="340"/>
+      </w:pPr>
+      <w:r>
+        <w:rPr>
+          <w:b/>
+        </w:rPr>
+        <w:t xml:space="preserve">3. </w:t>
+      </w:r>
+      <w:r>
+        <w:rPr>
+          <w:b w:val="0"/>
+        </w:rPr>
+        <w:t xml:space="preserve">Arriba a la derecha, en el desplegable de entornos, elegir </w:t>
+      </w:r>
+      <w:r>
+        <w:rPr>
+          <w:b/>
+        </w:rPr>
+        <w:t>GestaPro - Vercel (app publicada)</w:t>
+      </w:r>
+      <w:r>
+        <w:rPr>
+          <w:b w:val="0"/>
+        </w:rPr>
+        <w:t>.</w:t>
+      </w:r>
+    </w:p>
+    <w:p>
+      <w:pPr>
+        <w:spacing w:after="40"/>
+        <w:ind w:left="510" w:hanging="340"/>
+      </w:pPr>
+      <w:r>
+        <w:rPr>
+          <w:b/>
+        </w:rPr>
+        <w:t xml:space="preserve">4. </w:t>
+      </w:r>
+      <w:r>
+        <w:rPr>
+          <w:b w:val="0"/>
+        </w:rPr>
+        <w:t xml:space="preserve">Ícono del ojo al lado del desplegable → </w:t>
+      </w:r>
+      <w:r>
+        <w:rPr>
+          <w:b/>
+        </w:rPr>
+        <w:t>Edit</w:t>
+      </w:r>
+      <w:r>
+        <w:rPr>
+          <w:b w:val="0"/>
+        </w:rPr>
+        <w:t xml:space="preserve"> → completar </w:t>
+      </w:r>
+      <w:r>
+        <w:rPr>
+          <w:b/>
+        </w:rPr>
+        <w:t>usuario</w:t>
+      </w:r>
+      <w:r>
+        <w:rPr>
+          <w:b w:val="0"/>
+        </w:rPr>
+        <w:t xml:space="preserve"> y </w:t>
+      </w:r>
+      <w:r>
+        <w:rPr>
+          <w:b/>
+        </w:rPr>
+        <w:t>password</w:t>
+      </w:r>
+      <w:r>
+        <w:rPr>
+          <w:b w:val="0"/>
+        </w:rPr>
+        <w:t xml:space="preserve"> con un usuario real del sistema que pueda dar de alta clientes (por ejemplo, el del Dueño). Escribirlos </w:t>
+      </w:r>
+      <w:r>
+        <w:rPr>
+          <w:b/>
+        </w:rPr>
+        <w:t>solo en la columna "Current value"</w:t>
+      </w:r>
+      <w:r>
+        <w:rPr>
+          <w:b w:val="0"/>
+        </w:rPr>
+        <w:t xml:space="preserve">: así no se exportan ni se suben a ningún lado → </w:t>
+      </w:r>
+      <w:r>
+        <w:rPr>
+          <w:b/>
+        </w:rPr>
+        <w:t>Save</w:t>
+      </w:r>
+      <w:r>
+        <w:rPr>
+          <w:b w:val="0"/>
+        </w:rPr>
+        <w:t>.</w:t>
+      </w:r>
+    </w:p>
+    <w:p>
+      <w:pPr>
+        <w:spacing w:after="40"/>
+        <w:ind w:left="510" w:hanging="340"/>
+      </w:pPr>
+      <w:r>
+        <w:rPr>
+          <w:b/>
+        </w:rPr>
+        <w:t xml:space="preserve">5. </w:t>
+      </w:r>
+      <w:r>
+        <w:rPr>
+          <w:b w:val="0"/>
+        </w:rPr>
+        <w:t xml:space="preserve">Abrir la petición </w:t>
+      </w:r>
+      <w:r>
+        <w:rPr>
+          <w:b/>
+        </w:rPr>
+        <w:t>Registrar cliente (POST /api/clientes)</w:t>
+      </w:r>
+      <w:r>
+        <w:rPr>
+          <w:b w:val="0"/>
+        </w:rPr>
+        <w:t xml:space="preserve"> → </w:t>
+      </w:r>
+      <w:r>
+        <w:rPr>
+          <w:b/>
+        </w:rPr>
+        <w:t>Send</w:t>
+      </w:r>
+      <w:r>
+        <w:rPr>
+          <w:b w:val="0"/>
+        </w:rPr>
+        <w:t xml:space="preserve"> → tiene que dar </w:t>
+      </w:r>
+      <w:r>
+        <w:rPr>
+          <w:b/>
+        </w:rPr>
+        <w:t>201 Created</w:t>
+      </w:r>
+      <w:r>
+        <w:rPr>
+          <w:b w:val="0"/>
+        </w:rPr>
+        <w:t xml:space="preserve"> y las 10 comprobaciones en verde.</w:t>
+      </w:r>
+    </w:p>
+    <w:p>
+      <w:pPr>
+        <w:pStyle w:val="Heading2"/>
+      </w:pPr>
+      <w:r>
+        <w:t>3.4 El día de la clase</w:t>
+      </w:r>
+    </w:p>
+    <w:p>
+      <w:pPr>
+        <w:pStyle w:val="ListBullet"/>
+        <w:spacing w:after="40"/>
+      </w:pPr>
+      <w:r>
+        <w:rPr>
+          <w:b w:val="0"/>
+        </w:rPr>
+        <w:t xml:space="preserve">5 minutos antes, abrir </w:t>
+      </w:r>
+      <w:r>
+        <w:rPr>
+          <w:b/>
+        </w:rPr>
+        <w:t>https://sistema-gestion-elsur.vercel.app</w:t>
+      </w:r>
+      <w:r>
+        <w:rPr>
+          <w:b w:val="0"/>
+        </w:rPr>
+        <w:t xml:space="preserve"> para despertar el servidor (en el plan gratis se duerme y la primera vez tarda casi un minuto).</w:t>
+      </w:r>
+    </w:p>
+    <w:p>
+      <w:pPr>
+        <w:pStyle w:val="ListBullet"/>
+        <w:spacing w:after="40"/>
+      </w:pPr>
+      <w:r>
+        <w:rPr>
+          <w:b w:val="0"/>
+        </w:rPr>
+        <w:t>Dejar abiertos: Postman con la petición, IntelliJ con el test, y la consola de IntelliJ visible.</w:t>
+      </w:r>
+    </w:p>
+    <w:p>
+      <w:pPr>
+        <w:pStyle w:val="ListBullet"/>
+        <w:spacing w:after="40"/>
+      </w:pPr>
+      <w:r>
+        <w:rPr>
+          <w:b w:val="0"/>
+        </w:rPr>
+        <w:t>Subir la letra de Postman (Settings → Themes / zoom con Ctrl +) y del editor de IntelliJ (Ctrl + rueda del mouse) para el proyector.</w:t>
+      </w:r>
+    </w:p>
+    <w:p>
+      <w:pPr>
+        <w:pStyle w:val="ListBullet"/>
+        <w:spacing w:after="40"/>
+      </w:pPr>
+      <w:r>
+        <w:rPr>
+          <w:b w:val="0"/>
+        </w:rPr>
+        <w:t>Cerrar la ventana del entorno de Postman: ahí está la contraseña.</w:t>
+      </w:r>
+    </w:p>
+    <w:p>
+      <w:pPr>
+        <w:pStyle w:val="Heading1"/>
+      </w:pPr>
+      <w:r>
+        <w:t>4. El caso de prueba y el mapa comparativo</w:t>
+      </w:r>
+    </w:p>
+    <w:p>
+      <w:pPr>
+        <w:spacing w:after="40"/>
+      </w:pPr>
+      <w:r>
+        <w:rPr>
+          <w:b/>
+          <w:i w:val="0"/>
+        </w:rPr>
+        <w:t>¿Cómo se prueba un endpoint REST sin abrir el navegador?</w:t>
       </w:r>
     </w:p>
     <w:p>
@@ -812,7 +2321,7 @@
                 <w:b w:val="0"/>
                 <w:sz w:val="18"/>
               </w:rPr>
-              <w:t>Autónomo: el test levanta el backend solo, con base en memoria; con -Dapi.url apunta a la app publicada.</w:t>
+              <w:t>Autónomo: el test levanta el backend solo, con base en memoria; no necesita internet ni datos reales.</w:t>
             </w:r>
           </w:p>
         </w:tc>
@@ -1300,7 +2809,7 @@
                 <w:b/>
                 <w:sz w:val="18"/>
               </w:rPr>
-              <w:t>Probar rápido contra la app publicada (Render / Vercel)</w:t>
+              <w:t>Probar rápido contra la app publicada (Vercel)</w:t>
             </w:r>
           </w:p>
         </w:tc>
@@ -1314,7 +2823,7 @@
                 <w:b w:val="0"/>
                 <w:sz w:val="18"/>
               </w:rPr>
-              <w:t>Postman (o REST Assured con -Dapi.url)</w:t>
+              <w:t>Postman</w:t>
             </w:r>
           </w:p>
         </w:tc>
@@ -1328,7 +2837,7 @@
                 <w:b w:val="0"/>
                 <w:sz w:val="18"/>
               </w:rPr>
-              <w:t>Postman cambia de entorno con un clic; REST Assured también puede, pasando la URL y las credenciales por variables de entorno.</w:t>
+              <w:t>Se elige el entorno de Vercel y se manda: prueba lo último que está en línea.</w:t>
             </w:r>
           </w:p>
         </w:tc>
@@ -3264,7 +4773,7 @@
         <w:pStyle w:val="Heading1"/>
       </w:pPr>
       <w:r>
-        <w:t>6. Cómo probar cada cosa (paso a paso)</w:t>
+        <w:t>5. Cómo probar cada cosa en vivo (paso a paso)</w:t>
       </w:r>
     </w:p>
     <w:p>
@@ -3272,7 +4781,7 @@
         <w:pStyle w:val="Heading2"/>
       </w:pPr>
       <w:r>
-        <w:t>6.1 Preparar una sola vez</w:t>
+        <w:t>5.1 Postman (Lisandro): la petición POST con cabeceras, body y estado</w:t>
       </w:r>
     </w:p>
     <w:p>
@@ -3290,19 +4799,19 @@
         <w:rPr>
           <w:b w:val="0"/>
         </w:rPr>
-        <w:t xml:space="preserve">Bajar la última versión del repo: rama </w:t>
+        <w:t xml:space="preserve">Unos minutos antes, abrir </w:t>
       </w:r>
       <w:r>
         <w:rPr>
           <w:b/>
         </w:rPr>
-        <w:t>lucas</w:t>
+        <w:t>https://sistema-gestion-elsur.vercel.app</w:t>
       </w:r>
       <w:r>
         <w:rPr>
           <w:b w:val="0"/>
         </w:rPr>
-        <w:t xml:space="preserve"> (git pull).</w:t>
+        <w:t xml:space="preserve"> para despertar el servidor (en el plan gratis de Render tarda casi un minuto la primera vez).</w:t>
       </w:r>
     </w:p>
     <w:p>
@@ -3320,19 +4829,31 @@
         <w:rPr>
           <w:b w:val="0"/>
         </w:rPr>
-        <w:t xml:space="preserve">Instalar </w:t>
+        <w:t xml:space="preserve">En Postman, abrir la colección </w:t>
       </w:r>
       <w:r>
         <w:rPr>
           <w:b/>
         </w:rPr>
-        <w:t>Postman</w:t>
+        <w:t>GestaPro - Registrar cliente</w:t>
       </w:r>
       <w:r>
         <w:rPr>
           <w:b w:val="0"/>
         </w:rPr>
-        <w:t xml:space="preserve"> (app de escritorio).</w:t>
+        <w:t xml:space="preserve"> y la única petición: </w:t>
+      </w:r>
+      <w:r>
+        <w:rPr>
+          <w:b/>
+        </w:rPr>
+        <w:t>Registrar cliente (POST /api/clientes)</w:t>
+      </w:r>
+      <w:r>
+        <w:rPr>
+          <w:b w:val="0"/>
+        </w:rPr>
+        <w:t>.</w:t>
       </w:r>
     </w:p>
     <w:p>
@@ -3348,45 +4869,27 @@
       </w:r>
       <w:r>
         <w:rPr>
+          <w:b/>
+        </w:rPr>
+        <w:t>Seguridad:</w:t>
+      </w:r>
+      <w:r>
+        <w:rPr>
           <w:b w:val="0"/>
         </w:rPr>
-        <w:t xml:space="preserve">En Postman: botón </w:t>
+        <w:t xml:space="preserve"> pestaña </w:t>
       </w:r>
       <w:r>
         <w:rPr>
           <w:b/>
         </w:rPr>
-        <w:t>Import</w:t>
+        <w:t>Scripts → Pre-request</w:t>
       </w:r>
       <w:r>
         <w:rPr>
           <w:b w:val="0"/>
         </w:rPr>
-        <w:t xml:space="preserve"> (arriba a la izquierda) → arrastrar los 3 archivos de </w:t>
-      </w:r>
-      <w:r>
-        <w:rPr>
-          <w:b/>
-        </w:rPr>
-        <w:t>docs/ie2/postman</w:t>
-      </w:r>
-      <w:r>
-        <w:rPr>
-          <w:b w:val="0"/>
-        </w:rPr>
-        <w:t xml:space="preserve"> → </w:t>
-      </w:r>
-      <w:r>
-        <w:rPr>
-          <w:b/>
-        </w:rPr>
-        <w:t>Import</w:t>
-      </w:r>
-      <w:r>
-        <w:rPr>
-          <w:b w:val="0"/>
-        </w:rPr>
-        <w:t>.</w:t>
+        <w:t>. Ahí está el login: manda usuario y contraseña a /api/usuarios/login y guarda el token en {{token}}.</w:t>
       </w:r>
     </w:p>
     <w:p>
@@ -3402,45 +4905,51 @@
       </w:r>
       <w:r>
         <w:rPr>
+          <w:b/>
+        </w:rPr>
+        <w:t>Cabeceras de la petición:</w:t>
+      </w:r>
+      <w:r>
+        <w:rPr>
           <w:b w:val="0"/>
         </w:rPr>
-        <w:t xml:space="preserve">Arriba a la derecha, en el desplegable de entornos, elegir </w:t>
+        <w:t xml:space="preserve"> pestaña </w:t>
       </w:r>
       <w:r>
         <w:rPr>
           <w:b/>
         </w:rPr>
-        <w:t>GestaPro - Vercel (app publicada)</w:t>
+        <w:t>Headers</w:t>
       </w:r>
       <w:r>
         <w:rPr>
           <w:b w:val="0"/>
         </w:rPr>
-        <w:t xml:space="preserve"> → ícono del ojo → </w:t>
+        <w:t xml:space="preserve">. Mostrar </w:t>
       </w:r>
       <w:r>
         <w:rPr>
           <w:b/>
         </w:rPr>
-        <w:t>Edit</w:t>
+        <w:t>Authorization: Bearer {{token}}</w:t>
       </w:r>
       <w:r>
         <w:rPr>
           <w:b w:val="0"/>
         </w:rPr>
-        <w:t xml:space="preserve"> → cargar su usuario y contraseña del sistema </w:t>
+        <w:t xml:space="preserve"> (el token que pide el backend) y </w:t>
       </w:r>
       <w:r>
         <w:rPr>
           <w:b/>
         </w:rPr>
-        <w:t>solo en "Current value"</w:t>
+        <w:t>Content-Type: application/json</w:t>
       </w:r>
       <w:r>
         <w:rPr>
           <w:b w:val="0"/>
         </w:rPr>
-        <w:t xml:space="preserve"> (así no se exportan ni se suben) → Save.</w:t>
+        <w:t>.</w:t>
       </w:r>
     </w:p>
     <w:p>
@@ -3456,41 +4965,27 @@
       </w:r>
       <w:r>
         <w:rPr>
+          <w:b/>
+        </w:rPr>
+        <w:t>Body JSON:</w:t>
+      </w:r>
+      <w:r>
+        <w:rPr>
           <w:b w:val="0"/>
         </w:rPr>
-        <w:t xml:space="preserve">En </w:t>
+        <w:t xml:space="preserve"> pestaña </w:t>
       </w:r>
       <w:r>
         <w:rPr>
           <w:b/>
         </w:rPr>
-        <w:t>IntelliJ</w:t>
+        <w:t>Body</w:t>
       </w:r>
       <w:r>
         <w:rPr>
           <w:b w:val="0"/>
         </w:rPr>
-        <w:t xml:space="preserve">: abrir la carpeta </w:t>
-      </w:r>
-      <w:r>
-        <w:rPr>
-          <w:b/>
-        </w:rPr>
-        <w:t>Backend/sistema-gestion-elsur</w:t>
-      </w:r>
-      <w:r>
-        <w:rPr>
-          <w:b w:val="0"/>
-        </w:rPr>
-        <w:t xml:space="preserve"> y esperar a que Maven termine de descargar las dependencias.</w:t>
-      </w:r>
-    </w:p>
-    <w:p>
-      <w:pPr>
-        <w:pStyle w:val="Heading2"/>
-      </w:pPr>
-      <w:r>
-        <w:t>6.2 Postman: la petición POST con cabeceras, body y estado (lo que pide la consigna)</w:t>
+        <w:t xml:space="preserve"> (raw, JSON). Es el cliente con su persona y su dirección; {{documento}} se genera al azar en cada envío.</w:t>
       </w:r>
     </w:p>
     <w:p>
@@ -3502,25 +4997,25 @@
         <w:rPr>
           <w:b/>
         </w:rPr>
-        <w:t xml:space="preserve">1. </w:t>
+        <w:t xml:space="preserve">6. </w:t>
       </w:r>
       <w:r>
         <w:rPr>
           <w:b w:val="0"/>
         </w:rPr>
-        <w:t xml:space="preserve">Unos minutos antes, abrir </w:t>
+        <w:t xml:space="preserve">Apretar </w:t>
       </w:r>
       <w:r>
         <w:rPr>
           <w:b/>
         </w:rPr>
-        <w:t>https://sistema-gestion-elsur.vercel.app</w:t>
+        <w:t>Send</w:t>
       </w:r>
       <w:r>
         <w:rPr>
           <w:b w:val="0"/>
         </w:rPr>
-        <w:t xml:space="preserve"> para despertar el servidor (en el plan gratis de Render tarda casi un minuto la primera vez).</w:t>
+        <w:t>.</w:t>
       </w:r>
     </w:p>
     <w:p>
@@ -3532,37 +5027,31 @@
         <w:rPr>
           <w:b/>
         </w:rPr>
-        <w:t xml:space="preserve">2. </w:t>
+        <w:t xml:space="preserve">7. </w:t>
+      </w:r>
+      <w:r>
+        <w:rPr>
+          <w:b/>
+        </w:rPr>
+        <w:t>Estado HTTP:</w:t>
       </w:r>
       <w:r>
         <w:rPr>
           <w:b w:val="0"/>
         </w:rPr>
-        <w:t xml:space="preserve">En Postman, abrir la colección </w:t>
+        <w:t xml:space="preserve"> arriba de la respuesta se ve </w:t>
       </w:r>
       <w:r>
         <w:rPr>
           <w:b/>
         </w:rPr>
-        <w:t>GestaPro - Registrar cliente</w:t>
+        <w:t>201 Created</w:t>
       </w:r>
       <w:r>
         <w:rPr>
           <w:b w:val="0"/>
         </w:rPr>
-        <w:t xml:space="preserve"> y la única petición: </w:t>
-      </w:r>
-      <w:r>
-        <w:rPr>
-          <w:b/>
-        </w:rPr>
-        <w:t>Registrar cliente (POST /api/clientes)</w:t>
-      </w:r>
-      <w:r>
-        <w:rPr>
-          <w:b w:val="0"/>
-        </w:rPr>
-        <w:t>.</w:t>
+        <w:t>, el tiempo en ms y el tamaño.</w:t>
       </w:r>
     </w:p>
     <w:p>
@@ -3574,31 +5063,31 @@
         <w:rPr>
           <w:b/>
         </w:rPr>
-        <w:t xml:space="preserve">3. </w:t>
+        <w:t xml:space="preserve">8. </w:t>
       </w:r>
       <w:r>
         <w:rPr>
           <w:b/>
         </w:rPr>
-        <w:t>Seguridad:</w:t>
+        <w:t>Body de la respuesta:</w:t>
       </w:r>
       <w:r>
         <w:rPr>
           <w:b w:val="0"/>
         </w:rPr>
-        <w:t xml:space="preserve"> pestaña </w:t>
+        <w:t xml:space="preserve"> el JSON del cliente creado con su </w:t>
       </w:r>
       <w:r>
         <w:rPr>
           <w:b/>
         </w:rPr>
-        <w:t>Scripts → Pre-request</w:t>
+        <w:t>id_cliente</w:t>
       </w:r>
       <w:r>
         <w:rPr>
           <w:b w:val="0"/>
         </w:rPr>
-        <w:t>. Ahí está el login: manda usuario y contraseña a /api/usuarios/login y guarda el token en {{token}}.</w:t>
+        <w:t>, estado "Activo", límite 15000 y saldo 0.</w:t>
       </w:r>
     </w:p>
     <w:p>
@@ -3610,13 +5099,13 @@
         <w:rPr>
           <w:b/>
         </w:rPr>
-        <w:t xml:space="preserve">4. </w:t>
+        <w:t xml:space="preserve">9. </w:t>
       </w:r>
       <w:r>
         <w:rPr>
           <w:b/>
         </w:rPr>
-        <w:t>Cabeceras de la petición:</w:t>
+        <w:t>Cabeceras de la respuesta:</w:t>
       </w:r>
       <w:r>
         <w:rPr>
@@ -3634,31 +5123,19 @@
         <w:rPr>
           <w:b w:val="0"/>
         </w:rPr>
-        <w:t xml:space="preserve">. Mostrar </w:t>
+        <w:t xml:space="preserve"> de la respuesta → </w:t>
       </w:r>
       <w:r>
         <w:rPr>
           <w:b/>
         </w:rPr>
-        <w:t>Authorization: Bearer {{token}}</w:t>
+        <w:t>Content-Type: application/json</w:t>
       </w:r>
       <w:r>
         <w:rPr>
           <w:b w:val="0"/>
         </w:rPr>
-        <w:t xml:space="preserve"> (el token que pide el backend) y </w:t>
-      </w:r>
-      <w:r>
-        <w:rPr>
-          <w:b/>
-        </w:rPr>
-        <w:t>Content-Type: application/json</w:t>
-      </w:r>
-      <w:r>
-        <w:rPr>
-          <w:b w:val="0"/>
-        </w:rPr>
-        <w:t>.</w:t>
+        <w:t xml:space="preserve"> (y las cabeceras de seguridad que agrega el backend, como X-Content-Type-Options).</w:t>
       </w:r>
     </w:p>
     <w:p>
@@ -3670,13 +5147,13 @@
         <w:rPr>
           <w:b/>
         </w:rPr>
-        <w:t xml:space="preserve">5. </w:t>
+        <w:t xml:space="preserve">10. </w:t>
       </w:r>
       <w:r>
         <w:rPr>
           <w:b/>
         </w:rPr>
-        <w:t>Body JSON:</w:t>
+        <w:t>Comprobaciones:</w:t>
       </w:r>
       <w:r>
         <w:rPr>
@@ -3688,13 +5165,25 @@
         <w:rPr>
           <w:b/>
         </w:rPr>
-        <w:t>Body</w:t>
+        <w:t>Test Results</w:t>
       </w:r>
       <w:r>
         <w:rPr>
           <w:b w:val="0"/>
         </w:rPr>
-        <w:t xml:space="preserve"> (raw, JSON). Es el cliente con su persona y su dirección; {{documento}} se genera al azar en cada envío.</w:t>
+        <w:t xml:space="preserve"> → las 10 en verde. El código está en </w:t>
+      </w:r>
+      <w:r>
+        <w:rPr>
+          <w:b/>
+        </w:rPr>
+        <w:t>Scripts → Post-response</w:t>
+      </w:r>
+      <w:r>
+        <w:rPr>
+          <w:b w:val="0"/>
+        </w:rPr>
+        <w:t>, que al final borra el cliente de prueba.</w:t>
       </w:r>
     </w:p>
     <w:p>
@@ -3706,25 +5195,81 @@
         <w:rPr>
           <w:b/>
         </w:rPr>
-        <w:t xml:space="preserve">6. </w:t>
+        <w:t xml:space="preserve">11. </w:t>
       </w:r>
       <w:r>
         <w:rPr>
           <w:b w:val="0"/>
         </w:rPr>
-        <w:t xml:space="preserve">Apretar </w:t>
+        <w:t xml:space="preserve">(Opcional) Abrir la </w:t>
       </w:r>
       <w:r>
         <w:rPr>
           <w:b/>
         </w:rPr>
-        <w:t>Send</w:t>
+        <w:t>Console</w:t>
       </w:r>
       <w:r>
         <w:rPr>
           <w:b w:val="0"/>
         </w:rPr>
-        <w:t>.</w:t>
+        <w:t xml:space="preserve"> (abajo a la izquierda) para ver las 3 llamadas: el login, el POST y el DELETE de limpieza.</w:t>
+      </w:r>
+    </w:p>
+    <w:p>
+      <w:pPr>
+        <w:pStyle w:val="Heading2"/>
+      </w:pPr>
+      <w:r>
+        <w:t>5.2 ¿Cómo llega la petición de Vercel al backend?</w:t>
+      </w:r>
+    </w:p>
+    <w:p>
+      <w:pPr>
+        <w:spacing w:after="80"/>
+      </w:pPr>
+      <w:r>
+        <w:rPr>
+          <w:b w:val="0"/>
+          <w:i w:val="0"/>
+        </w:rPr>
+        <w:t xml:space="preserve">Vercel sirve el frontend y, por una regla de frontend/vercel.json, reenvía todo lo que empieza con </w:t>
+      </w:r>
+      <w:r>
+        <w:rPr>
+          <w:b/>
+          <w:i w:val="0"/>
+        </w:rPr>
+        <w:t>/api/</w:t>
+      </w:r>
+      <w:r>
+        <w:rPr>
+          <w:b w:val="0"/>
+          <w:i w:val="0"/>
+        </w:rPr>
+        <w:t xml:space="preserve"> al backend en Render. Así Postman le pega directo a </w:t>
+      </w:r>
+      <w:r>
+        <w:rPr>
+          <w:b/>
+          <w:i w:val="0"/>
+        </w:rPr>
+        <w:t>https://sistema-gestion-elsur.vercel.app/api/clientes</w:t>
+      </w:r>
+      <w:r>
+        <w:rPr>
+          <w:b w:val="0"/>
+          <w:i w:val="0"/>
+        </w:rPr>
+        <w:t>. Como Vercel y Render se despliegan solos con cada push a la rama lucas, Postman siempre prueba la última versión publicada.</w:t>
+      </w:r>
+    </w:p>
+    <w:p>
+      <w:pPr>
+        <w:pStyle w:val="Heading2"/>
+      </w:pPr>
+      <w:r>
+        <w:t>5.3 REST Assured (Lucas): el mismo caso en Java, desde IntelliJ</w:t>
       </w:r>
     </w:p>
     <w:p>
@@ -3736,31 +5281,37 @@
         <w:rPr>
           <w:b/>
         </w:rPr>
-        <w:t xml:space="preserve">7. </w:t>
+        <w:t xml:space="preserve">1. </w:t>
+      </w:r>
+      <w:r>
+        <w:rPr>
+          <w:b w:val="0"/>
+        </w:rPr>
+        <w:t xml:space="preserve">Abrir </w:t>
       </w:r>
       <w:r>
         <w:rPr>
           <w:b/>
         </w:rPr>
-        <w:t>Estado HTTP:</w:t>
+        <w:t>src/test/java/com/elsur/sistema_gestion/api/RegistrarClienteRestAssuredTest.java</w:t>
       </w:r>
       <w:r>
         <w:rPr>
           <w:b w:val="0"/>
         </w:rPr>
-        <w:t xml:space="preserve"> arriba de la respuesta se ve </w:t>
+        <w:t xml:space="preserve">. Está comentado para leerlo en voz alta: seguir los comentarios </w:t>
       </w:r>
       <w:r>
         <w:rPr>
           <w:b/>
         </w:rPr>
-        <w:t>201 Created</w:t>
+        <w:t>PASO 1 a PASO 6</w:t>
       </w:r>
       <w:r>
         <w:rPr>
           <w:b w:val="0"/>
         </w:rPr>
-        <w:t>, el tiempo en ms y el tamaño.</w:t>
+        <w:t>.</w:t>
       </w:r>
     </w:p>
     <w:p>
@@ -3772,31 +5323,61 @@
         <w:rPr>
           <w:b/>
         </w:rPr>
-        <w:t xml:space="preserve">8. </w:t>
+        <w:t xml:space="preserve">2. </w:t>
+      </w:r>
+      <w:r>
+        <w:rPr>
+          <w:b w:val="0"/>
+        </w:rPr>
+        <w:t xml:space="preserve">Mostrar las tres partes: </w:t>
       </w:r>
       <w:r>
         <w:rPr>
           <w:b/>
         </w:rPr>
-        <w:t>Body de la respuesta:</w:t>
+        <w:t>@BeforeEach</w:t>
       </w:r>
       <w:r>
         <w:rPr>
           <w:b w:val="0"/>
         </w:rPr>
-        <w:t xml:space="preserve"> el JSON del cliente creado con su </w:t>
+        <w:t xml:space="preserve"> (login = seguridad), </w:t>
       </w:r>
       <w:r>
         <w:rPr>
           <w:b/>
         </w:rPr>
-        <w:t>id_cliente</w:t>
+        <w:t>given()</w:t>
       </w:r>
       <w:r>
         <w:rPr>
           <w:b w:val="0"/>
         </w:rPr>
-        <w:t>, estado "Activo", límite 15000 y saldo 0.</w:t>
+        <w:t xml:space="preserve"> (cabeceras y body JSON), </w:t>
+      </w:r>
+      <w:r>
+        <w:rPr>
+          <w:b/>
+        </w:rPr>
+        <w:t>when()</w:t>
+      </w:r>
+      <w:r>
+        <w:rPr>
+          <w:b w:val="0"/>
+        </w:rPr>
+        <w:t xml:space="preserve"> (el POST) y </w:t>
+      </w:r>
+      <w:r>
+        <w:rPr>
+          <w:b/>
+        </w:rPr>
+        <w:t>then()</w:t>
+      </w:r>
+      <w:r>
+        <w:rPr>
+          <w:b w:val="0"/>
+        </w:rPr>
+        <w:t xml:space="preserve"> (las 10 comprobaciones).</w:t>
       </w:r>
     </w:p>
     <w:p>
@@ -3808,43 +5389,37 @@
         <w:rPr>
           <w:b/>
         </w:rPr>
-        <w:t xml:space="preserve">9. </w:t>
+        <w:t xml:space="preserve">3. </w:t>
+      </w:r>
+      <w:r>
+        <w:rPr>
+          <w:b w:val="0"/>
+        </w:rPr>
+        <w:t xml:space="preserve">Clic en el </w:t>
       </w:r>
       <w:r>
         <w:rPr>
           <w:b/>
         </w:rPr>
-        <w:t>Cabeceras de la respuesta:</w:t>
+        <w:t>triángulo verde</w:t>
       </w:r>
       <w:r>
         <w:rPr>
           <w:b w:val="0"/>
         </w:rPr>
-        <w:t xml:space="preserve"> pestaña </w:t>
+        <w:t xml:space="preserve"> al lado de la clase → </w:t>
       </w:r>
       <w:r>
         <w:rPr>
           <w:b/>
         </w:rPr>
-        <w:t>Headers</w:t>
+        <w:t>Run</w:t>
       </w:r>
       <w:r>
         <w:rPr>
           <w:b w:val="0"/>
         </w:rPr>
-        <w:t xml:space="preserve"> de la respuesta → </w:t>
-      </w:r>
-      <w:r>
-        <w:rPr>
-          <w:b/>
-        </w:rPr>
-        <w:t>Content-Type: application/json</w:t>
-      </w:r>
-      <w:r>
-        <w:rPr>
-          <w:b w:val="0"/>
-        </w:rPr>
-        <w:t xml:space="preserve"> (y las cabeceras de seguridad que agrega el backend, como X-Content-Type-Options).</w:t>
+        <w:t>. El test levanta su propio backend (se ve el logo de Spring en la consola): no necesita internet ni nada prendido.</w:t>
       </w:r>
     </w:p>
     <w:p>
@@ -3856,43 +5431,25 @@
         <w:rPr>
           <w:b/>
         </w:rPr>
-        <w:t xml:space="preserve">10. </w:t>
+        <w:t xml:space="preserve">4. </w:t>
+      </w:r>
+      <w:r>
+        <w:rPr>
+          <w:b w:val="0"/>
+        </w:rPr>
+        <w:t xml:space="preserve">Abajo aparece el árbol de JUnit con el test en </w:t>
       </w:r>
       <w:r>
         <w:rPr>
           <w:b/>
         </w:rPr>
-        <w:t>Comprobaciones:</w:t>
+        <w:t>verde</w:t>
       </w:r>
       <w:r>
         <w:rPr>
           <w:b w:val="0"/>
         </w:rPr>
-        <w:t xml:space="preserve"> pestaña </w:t>
-      </w:r>
-      <w:r>
-        <w:rPr>
-          <w:b/>
-        </w:rPr>
-        <w:t>Test Results</w:t>
-      </w:r>
-      <w:r>
-        <w:rPr>
-          <w:b w:val="0"/>
-        </w:rPr>
-        <w:t xml:space="preserve"> → las 10 en verde. El código está en </w:t>
-      </w:r>
-      <w:r>
-        <w:rPr>
-          <w:b/>
-        </w:rPr>
-        <w:t>Scripts → Post-response</w:t>
-      </w:r>
-      <w:r>
-        <w:rPr>
-          <w:b w:val="0"/>
-        </w:rPr>
-        <w:t>, que al final borra el cliente de prueba.</w:t>
+        <w:t>.</w:t>
       </w:r>
     </w:p>
     <w:p>
@@ -3904,25 +5461,25 @@
         <w:rPr>
           <w:b/>
         </w:rPr>
-        <w:t xml:space="preserve">11. </w:t>
+        <w:t xml:space="preserve">5. </w:t>
       </w:r>
       <w:r>
         <w:rPr>
           <w:b w:val="0"/>
         </w:rPr>
-        <w:t xml:space="preserve">(Opcional) Abrir la </w:t>
+        <w:t>En la consola se ven la petición (Request method: POST, Request URI, Headers con el token oculto como [ BLACKLISTED ], Body) y la respuesta (</w:t>
       </w:r>
       <w:r>
         <w:rPr>
           <w:b/>
         </w:rPr>
-        <w:t>Console</w:t>
+        <w:t>HTTP/1.1 201</w:t>
       </w:r>
       <w:r>
         <w:rPr>
           <w:b w:val="0"/>
         </w:rPr>
-        <w:t xml:space="preserve"> (abajo a la izquierda) para ver las 3 llamadas: el login, el POST y el DELETE de limpieza.</w:t>
+        <w:t xml:space="preserve"> y el JSON).</w:t>
       </w:r>
     </w:p>
     <w:p>
@@ -3930,261 +5487,7 @@
         <w:pStyle w:val="Heading2"/>
       </w:pPr>
       <w:r>
-        <w:t>6.3 ¿Cómo llega la petición de Vercel al backend?</w:t>
-      </w:r>
-    </w:p>
-    <w:p>
-      <w:pPr>
-        <w:spacing w:after="80"/>
-      </w:pPr>
-      <w:r>
-        <w:rPr>
-          <w:b w:val="0"/>
-          <w:i w:val="0"/>
-        </w:rPr>
-        <w:t xml:space="preserve">Vercel sirve el frontend y, por una regla de frontend/vercel.json, reenvía todo lo que empieza con </w:t>
-      </w:r>
-      <w:r>
-        <w:rPr>
-          <w:b/>
-          <w:i w:val="0"/>
-        </w:rPr>
-        <w:t>/api/</w:t>
-      </w:r>
-      <w:r>
-        <w:rPr>
-          <w:b w:val="0"/>
-          <w:i w:val="0"/>
-        </w:rPr>
-        <w:t xml:space="preserve"> al backend en Render. Así Postman le pega directo a </w:t>
-      </w:r>
-      <w:r>
-        <w:rPr>
-          <w:b/>
-          <w:i w:val="0"/>
-        </w:rPr>
-        <w:t>https://sistema-gestion-elsur.vercel.app/api/clientes</w:t>
-      </w:r>
-      <w:r>
-        <w:rPr>
-          <w:b w:val="0"/>
-          <w:i w:val="0"/>
-        </w:rPr>
-        <w:t>. Como Vercel y Render se despliegan solos con cada push a la rama lucas, Postman siempre prueba la última versión publicada.</w:t>
-      </w:r>
-    </w:p>
-    <w:p>
-      <w:pPr>
-        <w:pStyle w:val="Heading2"/>
-      </w:pPr>
-      <w:r>
-        <w:t>6.4 REST Assured desde IntelliJ (el mismo caso en Java)</w:t>
-      </w:r>
-    </w:p>
-    <w:p>
-      <w:pPr>
-        <w:spacing w:after="40"/>
-        <w:ind w:left="510" w:hanging="340"/>
-      </w:pPr>
-      <w:r>
-        <w:rPr>
-          <w:b/>
-        </w:rPr>
-        <w:t xml:space="preserve">1. </w:t>
-      </w:r>
-      <w:r>
-        <w:rPr>
-          <w:b w:val="0"/>
-        </w:rPr>
-        <w:t xml:space="preserve">Abrir </w:t>
-      </w:r>
-      <w:r>
-        <w:rPr>
-          <w:b/>
-        </w:rPr>
-        <w:t>src/test/java/com/elsur/sistema_gestion/api/RegistrarClienteRestAssuredTest.java</w:t>
-      </w:r>
-      <w:r>
-        <w:rPr>
-          <w:b w:val="0"/>
-        </w:rPr>
-        <w:t>. Está comentado línea por línea.</w:t>
-      </w:r>
-    </w:p>
-    <w:p>
-      <w:pPr>
-        <w:spacing w:after="40"/>
-        <w:ind w:left="510" w:hanging="340"/>
-      </w:pPr>
-      <w:r>
-        <w:rPr>
-          <w:b/>
-        </w:rPr>
-        <w:t xml:space="preserve">2. </w:t>
-      </w:r>
-      <w:r>
-        <w:rPr>
-          <w:b w:val="0"/>
-        </w:rPr>
-        <w:t xml:space="preserve">Mostrar las tres partes: </w:t>
-      </w:r>
-      <w:r>
-        <w:rPr>
-          <w:b/>
-        </w:rPr>
-        <w:t>@BeforeEach</w:t>
-      </w:r>
-      <w:r>
-        <w:rPr>
-          <w:b w:val="0"/>
-        </w:rPr>
-        <w:t xml:space="preserve"> (login = seguridad), </w:t>
-      </w:r>
-      <w:r>
-        <w:rPr>
-          <w:b/>
-        </w:rPr>
-        <w:t>given()</w:t>
-      </w:r>
-      <w:r>
-        <w:rPr>
-          <w:b w:val="0"/>
-        </w:rPr>
-        <w:t xml:space="preserve"> (cabeceras y body JSON), </w:t>
-      </w:r>
-      <w:r>
-        <w:rPr>
-          <w:b/>
-        </w:rPr>
-        <w:t>when()</w:t>
-      </w:r>
-      <w:r>
-        <w:rPr>
-          <w:b w:val="0"/>
-        </w:rPr>
-        <w:t xml:space="preserve"> (el POST) y </w:t>
-      </w:r>
-      <w:r>
-        <w:rPr>
-          <w:b/>
-        </w:rPr>
-        <w:t>then()</w:t>
-      </w:r>
-      <w:r>
-        <w:rPr>
-          <w:b w:val="0"/>
-        </w:rPr>
-        <w:t xml:space="preserve"> (las 10 comprobaciones).</w:t>
-      </w:r>
-    </w:p>
-    <w:p>
-      <w:pPr>
-        <w:spacing w:after="40"/>
-        <w:ind w:left="510" w:hanging="340"/>
-      </w:pPr>
-      <w:r>
-        <w:rPr>
-          <w:b/>
-        </w:rPr>
-        <w:t xml:space="preserve">3. </w:t>
-      </w:r>
-      <w:r>
-        <w:rPr>
-          <w:b w:val="0"/>
-        </w:rPr>
-        <w:t xml:space="preserve">Clic en el </w:t>
-      </w:r>
-      <w:r>
-        <w:rPr>
-          <w:b/>
-        </w:rPr>
-        <w:t>triángulo verde</w:t>
-      </w:r>
-      <w:r>
-        <w:rPr>
-          <w:b w:val="0"/>
-        </w:rPr>
-        <w:t xml:space="preserve"> al lado de la clase → </w:t>
-      </w:r>
-      <w:r>
-        <w:rPr>
-          <w:b/>
-        </w:rPr>
-        <w:t>Run</w:t>
-      </w:r>
-      <w:r>
-        <w:rPr>
-          <w:b w:val="0"/>
-        </w:rPr>
-        <w:t>. No hace falta tener el backend del paso 6.2: el test levanta el suyo.</w:t>
-      </w:r>
-    </w:p>
-    <w:p>
-      <w:pPr>
-        <w:spacing w:after="40"/>
-        <w:ind w:left="510" w:hanging="340"/>
-      </w:pPr>
-      <w:r>
-        <w:rPr>
-          <w:b/>
-        </w:rPr>
-        <w:t xml:space="preserve">4. </w:t>
-      </w:r>
-      <w:r>
-        <w:rPr>
-          <w:b w:val="0"/>
-        </w:rPr>
-        <w:t xml:space="preserve">Abajo aparece el árbol de JUnit con el test en </w:t>
-      </w:r>
-      <w:r>
-        <w:rPr>
-          <w:b/>
-        </w:rPr>
-        <w:t>verde</w:t>
-      </w:r>
-      <w:r>
-        <w:rPr>
-          <w:b w:val="0"/>
-        </w:rPr>
-        <w:t>.</w:t>
-      </w:r>
-    </w:p>
-    <w:p>
-      <w:pPr>
-        <w:spacing w:after="40"/>
-        <w:ind w:left="510" w:hanging="340"/>
-      </w:pPr>
-      <w:r>
-        <w:rPr>
-          <w:b/>
-        </w:rPr>
-        <w:t xml:space="preserve">5. </w:t>
-      </w:r>
-      <w:r>
-        <w:rPr>
-          <w:b w:val="0"/>
-        </w:rPr>
-        <w:t>En la consola se ven la petición (Request method: POST, Request URI, Headers con el token oculto como [ BLACKLISTED ], Body) y la respuesta (</w:t>
-      </w:r>
-      <w:r>
-        <w:rPr>
-          <w:b/>
-        </w:rPr>
-        <w:t>HTTP/1.1 201</w:t>
-      </w:r>
-      <w:r>
-        <w:rPr>
-          <w:b w:val="0"/>
-        </w:rPr>
-        <w:t xml:space="preserve"> y el JSON).</w:t>
-      </w:r>
-    </w:p>
-    <w:p>
-      <w:pPr>
-        <w:pStyle w:val="Heading2"/>
-      </w:pPr>
-      <w:r>
-        <w:t>6.5 Integración en automatizaciones (por consola, como lo haría un pipeline)</w:t>
+        <w:t>5.4 Integración en automatizaciones (por consola, como lo haría un pipeline)</w:t>
       </w:r>
     </w:p>
     <w:p>
@@ -4337,75 +5640,10 @@
     </w:p>
     <w:p>
       <w:pPr>
-        <w:spacing w:after="40"/>
-      </w:pPr>
-      <w:r>
-        <w:rPr>
-          <w:b/>
-          <w:i w:val="0"/>
-        </w:rPr>
-        <w:t>REST Assured contra la app publicada</w:t>
-      </w:r>
-      <w:r>
-        <w:rPr>
-          <w:b w:val="0"/>
-          <w:i w:val="0"/>
-        </w:rPr>
-        <w:t xml:space="preserve"> (PowerShell, las credenciales solo en variables de entorno):</w:t>
-      </w:r>
-    </w:p>
-    <w:tbl>
-      <w:tblPr>
-        <w:tblW w:type="auto" w:w="0"/>
-        <w:tblLook w:firstColumn="1" w:firstRow="1" w:lastColumn="0" w:lastRow="0" w:noHBand="0" w:noVBand="1" w:val="04A0"/>
-      </w:tblPr>
-      <w:tblGrid>
-        <w:gridCol w:w="9972"/>
-      </w:tblGrid>
-      <w:tr>
-        <w:tc>
-          <w:tcPr>
-            <w:tcW w:type="dxa" w:w="9972"/>
-            <w:shd w:val="clear" w:fill="F3F1F9"/>
-          </w:tcPr>
-          <w:p>
-            <w:pPr>
-              <w:spacing w:after="0"/>
-            </w:pPr>
-            <w:r>
-              <w:rPr>
-                <w:rFonts w:ascii="Consolas" w:hAnsi="Consolas" w:eastAsia="Consolas"/>
-                <w:sz w:val="17"/>
-              </w:rPr>
-              <w:t>$env:API_USUARIO = "su_usuario"; $env:API_PASSWORD = "su_contraseña"</w:t>
-            </w:r>
-          </w:p>
-          <w:p>
-            <w:pPr>
-              <w:spacing w:after="0"/>
-            </w:pPr>
-            <w:r>
-              <w:rPr>
-                <w:rFonts w:ascii="Consolas" w:hAnsi="Consolas" w:eastAsia="Consolas"/>
-                <w:sz w:val="17"/>
-              </w:rPr>
-              <w:t>.\mvnw.cmd test -Dtest=RegistrarClienteRestAssuredTest "-Dapi.url=https://sistema-gestion-elsur.vercel.app"</w:t>
-            </w:r>
-          </w:p>
-        </w:tc>
-      </w:tr>
-    </w:tbl>
-    <w:p>
-      <w:pPr>
-        <w:spacing w:after="40"/>
-      </w:pPr>
-    </w:p>
-    <w:p>
-      <w:pPr>
         <w:pStyle w:val="Heading2"/>
       </w:pPr>
       <w:r>
-        <w:t>6.6 Mostrar cómo informa una falla cada herramienta (opcional, suma en la demo)</w:t>
+        <w:t>5.5 Mostrar cómo informa una falla cada herramienta (opcional, suma en la demo)</w:t>
       </w:r>
     </w:p>
     <w:p>
@@ -4479,7 +5717,7 @@
         <w:pStyle w:val="Heading2"/>
       </w:pPr>
       <w:r>
-        <w:t>6.7 Probar la seguridad (opcional)</w:t>
+        <w:t>5.6 Probar la seguridad (opcional)</w:t>
       </w:r>
     </w:p>
     <w:p>
@@ -4577,7 +5815,7 @@
         <w:pStyle w:val="Heading2"/>
       </w:pPr>
       <w:r>
-        <w:t>6.8 Si algo falla en vivo</w:t>
+        <w:t>5.7 Si algo falla en vivo (plan B)</w:t>
       </w:r>
     </w:p>
     <w:tbl>
@@ -4786,7 +6024,7 @@
         <w:pStyle w:val="Heading1"/>
       </w:pPr>
       <w:r>
-        <w:t>7. Comparación final (minutos 9–10)</w:t>
+        <w:t>6. Comparación final (minutos 9–10)</w:t>
       </w:r>
     </w:p>
     <w:tbl>
@@ -5072,7 +6310,7 @@
         <w:pStyle w:val="Heading1"/>
       </w:pPr>
       <w:r>
-        <w:t>8. Guion de los 10 minutos (los dos participan)</w:t>
+        <w:t>7. Guion de los 10 minutos (los dos participan)</w:t>
       </w:r>
     </w:p>
     <w:tbl>
@@ -5501,7 +6739,7 @@
         <w:pStyle w:val="Heading1"/>
       </w:pPr>
       <w:r>
-        <w:t>9. Preguntas que nos pueden hacer</w:t>
+        <w:t>8. Preguntas que nos pueden hacer</w:t>
       </w:r>
     </w:p>
     <w:p>
@@ -5701,7 +6939,7 @@
         <w:pStyle w:val="Heading1"/>
       </w:pPr>
       <w:r>
-        <w:t>10. Guía de estudio para la Fase 1 (cuestionario individual)</w:t>
+        <w:t>9. Guía de estudio para la Fase 1 (cuestionario individual)</w:t>
       </w:r>
     </w:p>
     <w:p>

</xml_diff>

<commit_message>
Token de Postman en la pestana Authorization y cartel de resultado en REST Assured
- La peticion de Postman usa Authorization > Bearer Token con {{token}}; Headers
  queda solo con Content-Type.
- RegistrarClienteRestAssuredTest imprime al final PRUEBA APROBADA (verde) o
  PRUEBA FALLIDA (rojo, con el motivo).
- Documento de la IE2 actualizado con los pasos nuevos.
</commit_message>
<xml_diff>
--- a/docs/ie2/IE2_Equipo5_Mapa_Comparativo_y_Pruebas.docx
+++ b/docs/ie2/IE2_Equipo5_Mapa_Comparativo_y_Pruebas.docx
@@ -636,7 +636,7 @@
                 <w:b w:val="0"/>
                 <w:sz w:val="18"/>
               </w:rPr>
-              <w:t>Una sola petición, POST /api/clientes contra la app publicada en Vercel: pestañas Headers, Body, Status 201 y Test Results.</w:t>
+              <w:t>Una sola petición, POST /api/clientes contra la app publicada en Vercel: pestañas Authorization, Headers, Body, Status 201 y Test Results.</w:t>
             </w:r>
           </w:p>
         </w:tc>
@@ -2052,7 +2052,7 @@
                 <w:b w:val="0"/>
                 <w:sz w:val="18"/>
               </w:rPr>
-              <w:t xml:space="preserve"> Se ve todo en pantalla (Headers, Body, Status, Test Results) y no hace falta programar para mandar una petición.</w:t>
+              <w:t xml:space="preserve"> Se ve todo en pantalla (Authorization, Headers, Body, Status, Test Results) y no hace falta programar para mandar una petición.</w:t>
             </w:r>
           </w:p>
         </w:tc>
@@ -3857,7 +3857,7 @@
                 <w:b/>
                 <w:sz w:val="18"/>
               </w:rPr>
-              <w:t>Cabeceras</w:t>
+              <w:t>Token en la petición</w:t>
             </w:r>
           </w:p>
         </w:tc>
@@ -3878,14 +3878,14 @@
                 <w:b/>
                 <w:sz w:val="18"/>
               </w:rPr>
-              <w:t>Headers</w:t>
+              <w:t>Authorization</w:t>
             </w:r>
             <w:r>
               <w:rPr>
                 <w:b w:val="0"/>
                 <w:sz w:val="18"/>
               </w:rPr>
-              <w:t>: Authorization: Bearer {{token}} y Content-Type: application/json.</w:t>
+              <w:t>: Type Bearer Token, Token {{token}}.</w:t>
             </w:r>
           </w:p>
         </w:tc>
@@ -3899,7 +3899,65 @@
                 <w:b w:val="0"/>
                 <w:sz w:val="18"/>
               </w:rPr>
-              <w:t>.header("Authorization", "Bearer " + token) y .contentType(ContentType.JSON)</w:t>
+              <w:t>.header("Authorization", "Bearer " + token)</w:t>
+            </w:r>
+          </w:p>
+        </w:tc>
+      </w:tr>
+      <w:tr>
+        <w:tc>
+          <w:tcPr>
+            <w:tcW w:type="dxa" w:w="1814"/>
+          </w:tcPr>
+          <w:p>
+            <w:r>
+              <w:rPr>
+                <w:b/>
+                <w:sz w:val="18"/>
+              </w:rPr>
+              <w:t>Cabeceras</w:t>
+            </w:r>
+          </w:p>
+        </w:tc>
+        <w:tc>
+          <w:tcPr>
+            <w:tcW w:type="dxa" w:w="3969"/>
+          </w:tcPr>
+          <w:p>
+            <w:r>
+              <w:rPr>
+                <w:b w:val="0"/>
+                <w:sz w:val="18"/>
+              </w:rPr>
+              <w:t xml:space="preserve">Pestaña </w:t>
+            </w:r>
+            <w:r>
+              <w:rPr>
+                <w:b/>
+                <w:sz w:val="18"/>
+              </w:rPr>
+              <w:t>Headers</w:t>
+            </w:r>
+            <w:r>
+              <w:rPr>
+                <w:b w:val="0"/>
+                <w:sz w:val="18"/>
+              </w:rPr>
+              <w:t>: Content-Type: application/json (la de Authorization la agrega Postman sola).</w:t>
+            </w:r>
+          </w:p>
+        </w:tc>
+        <w:tc>
+          <w:tcPr>
+            <w:tcW w:type="dxa" w:w="3969"/>
+          </w:tcPr>
+          <w:p>
+            <w:r>
+              <w:rPr>
+                <w:b w:val="0"/>
+                <w:sz w:val="18"/>
+              </w:rPr>
+              <w:t>.contentType(ContentType.JSON)</w:t>
             </w:r>
           </w:p>
         </w:tc>
@@ -4907,7 +4965,7 @@
         <w:rPr>
           <w:b/>
         </w:rPr>
-        <w:t>Cabeceras de la petición:</w:t>
+        <w:t>Token:</w:t>
       </w:r>
       <w:r>
         <w:rPr>
@@ -4919,37 +4977,37 @@
         <w:rPr>
           <w:b/>
         </w:rPr>
-        <w:t>Headers</w:t>
+        <w:t>Authorization</w:t>
       </w:r>
       <w:r>
         <w:rPr>
           <w:b w:val="0"/>
         </w:rPr>
-        <w:t xml:space="preserve">. Mostrar </w:t>
+        <w:t xml:space="preserve"> → Type </w:t>
       </w:r>
       <w:r>
         <w:rPr>
           <w:b/>
         </w:rPr>
-        <w:t>Authorization: Bearer {{token}}</w:t>
+        <w:t>Bearer Token</w:t>
       </w:r>
       <w:r>
         <w:rPr>
           <w:b w:val="0"/>
         </w:rPr>
-        <w:t xml:space="preserve"> (el token que pide el backend) y </w:t>
+        <w:t xml:space="preserve"> → Token </w:t>
       </w:r>
       <w:r>
         <w:rPr>
           <w:b/>
         </w:rPr>
-        <w:t>Content-Type: application/json</w:t>
+        <w:t>{{token}}</w:t>
       </w:r>
       <w:r>
         <w:rPr>
           <w:b w:val="0"/>
         </w:rPr>
-        <w:t>.</w:t>
+        <w:t>. Es la llave que pide el backend: sin ella responde 401.</w:t>
       </w:r>
     </w:p>
     <w:p>
@@ -4967,7 +5025,7 @@
         <w:rPr>
           <w:b/>
         </w:rPr>
-        <w:t>Body JSON:</w:t>
+        <w:t>Cabeceras de la petición:</w:t>
       </w:r>
       <w:r>
         <w:rPr>
@@ -4979,13 +5037,49 @@
         <w:rPr>
           <w:b/>
         </w:rPr>
-        <w:t>Body</w:t>
+        <w:t>Headers</w:t>
       </w:r>
       <w:r>
         <w:rPr>
           <w:b w:val="0"/>
         </w:rPr>
-        <w:t xml:space="preserve"> (raw, JSON). Es el cliente con su persona y su dirección; {{documento}} se genera al azar en cada envío.</w:t>
+        <w:t xml:space="preserve"> → </w:t>
+      </w:r>
+      <w:r>
+        <w:rPr>
+          <w:b/>
+        </w:rPr>
+        <w:t>Content-Type: application/json</w:t>
+      </w:r>
+      <w:r>
+        <w:rPr>
+          <w:b w:val="0"/>
+        </w:rPr>
+        <w:t xml:space="preserve">. Tocando </w:t>
+      </w:r>
+      <w:r>
+        <w:rPr>
+          <w:b/>
+        </w:rPr>
+        <w:t>hidden</w:t>
+      </w:r>
+      <w:r>
+        <w:rPr>
+          <w:b w:val="0"/>
+        </w:rPr>
+        <w:t xml:space="preserve"> se ve también la cabecera </w:t>
+      </w:r>
+      <w:r>
+        <w:rPr>
+          <w:b/>
+        </w:rPr>
+        <w:t>Authorization: Bearer …</w:t>
+      </w:r>
+      <w:r>
+        <w:rPr>
+          <w:b w:val="0"/>
+        </w:rPr>
+        <w:t xml:space="preserve"> que arma Postman con el token.</w:t>
       </w:r>
     </w:p>
     <w:p>
@@ -5001,21 +5095,27 @@
       </w:r>
       <w:r>
         <w:rPr>
+          <w:b/>
+        </w:rPr>
+        <w:t>Body JSON:</w:t>
+      </w:r>
+      <w:r>
+        <w:rPr>
           <w:b w:val="0"/>
         </w:rPr>
-        <w:t xml:space="preserve">Apretar </w:t>
+        <w:t xml:space="preserve"> pestaña </w:t>
       </w:r>
       <w:r>
         <w:rPr>
           <w:b/>
         </w:rPr>
-        <w:t>Send</w:t>
+        <w:t>Body</w:t>
       </w:r>
       <w:r>
         <w:rPr>
           <w:b w:val="0"/>
         </w:rPr>
-        <w:t>.</w:t>
+        <w:t xml:space="preserve"> (raw, JSON). Es el cliente con su persona y su dirección; {{documento}} se genera al azar en cada envío.</w:t>
       </w:r>
     </w:p>
     <w:p>
@@ -5031,27 +5131,21 @@
       </w:r>
       <w:r>
         <w:rPr>
+          <w:b w:val="0"/>
+        </w:rPr>
+        <w:t xml:space="preserve">Apretar </w:t>
+      </w:r>
+      <w:r>
+        <w:rPr>
           <w:b/>
         </w:rPr>
-        <w:t>Estado HTTP:</w:t>
+        <w:t>Send</w:t>
       </w:r>
       <w:r>
         <w:rPr>
           <w:b w:val="0"/>
         </w:rPr>
-        <w:t xml:space="preserve"> arriba de la respuesta se ve </w:t>
-      </w:r>
-      <w:r>
-        <w:rPr>
-          <w:b/>
-        </w:rPr>
-        <w:t>201 Created</w:t>
-      </w:r>
-      <w:r>
-        <w:rPr>
-          <w:b w:val="0"/>
-        </w:rPr>
-        <w:t>, el tiempo en ms y el tamaño.</w:t>
+        <w:t>.</w:t>
       </w:r>
     </w:p>
     <w:p>
@@ -5069,25 +5163,25 @@
         <w:rPr>
           <w:b/>
         </w:rPr>
-        <w:t>Body de la respuesta:</w:t>
+        <w:t>Estado HTTP:</w:t>
       </w:r>
       <w:r>
         <w:rPr>
           <w:b w:val="0"/>
         </w:rPr>
-        <w:t xml:space="preserve"> el JSON del cliente creado con su </w:t>
+        <w:t xml:space="preserve"> arriba de la respuesta se ve </w:t>
       </w:r>
       <w:r>
         <w:rPr>
           <w:b/>
         </w:rPr>
-        <w:t>id_cliente</w:t>
+        <w:t>201 Created</w:t>
       </w:r>
       <w:r>
         <w:rPr>
           <w:b w:val="0"/>
         </w:rPr>
-        <w:t>, estado "Activo", límite 15000 y saldo 0.</w:t>
+        <w:t>, el tiempo en ms y el tamaño.</w:t>
       </w:r>
     </w:p>
     <w:p>
@@ -5105,37 +5199,25 @@
         <w:rPr>
           <w:b/>
         </w:rPr>
-        <w:t>Cabeceras de la respuesta:</w:t>
+        <w:t>Body de la respuesta:</w:t>
       </w:r>
       <w:r>
         <w:rPr>
           <w:b w:val="0"/>
         </w:rPr>
-        <w:t xml:space="preserve"> pestaña </w:t>
+        <w:t xml:space="preserve"> el JSON del cliente creado con su </w:t>
       </w:r>
       <w:r>
         <w:rPr>
           <w:b/>
         </w:rPr>
-        <w:t>Headers</w:t>
+        <w:t>id_cliente</w:t>
       </w:r>
       <w:r>
         <w:rPr>
           <w:b w:val="0"/>
         </w:rPr>
-        <w:t xml:space="preserve"> de la respuesta → </w:t>
-      </w:r>
-      <w:r>
-        <w:rPr>
-          <w:b/>
-        </w:rPr>
-        <w:t>Content-Type: application/json</w:t>
-      </w:r>
-      <w:r>
-        <w:rPr>
-          <w:b w:val="0"/>
-        </w:rPr>
-        <w:t xml:space="preserve"> (y las cabeceras de seguridad que agrega el backend, como X-Content-Type-Options).</w:t>
+        <w:t>, estado "Activo", límite 15000 y saldo 0.</w:t>
       </w:r>
     </w:p>
     <w:p>
@@ -5153,7 +5235,7 @@
         <w:rPr>
           <w:b/>
         </w:rPr>
-        <w:t>Comprobaciones:</w:t>
+        <w:t>Cabeceras de la respuesta:</w:t>
       </w:r>
       <w:r>
         <w:rPr>
@@ -5165,25 +5247,25 @@
         <w:rPr>
           <w:b/>
         </w:rPr>
-        <w:t>Test Results</w:t>
+        <w:t>Headers</w:t>
       </w:r>
       <w:r>
         <w:rPr>
           <w:b w:val="0"/>
         </w:rPr>
-        <w:t xml:space="preserve"> → las 10 en verde. El código está en </w:t>
+        <w:t xml:space="preserve"> de la respuesta → </w:t>
       </w:r>
       <w:r>
         <w:rPr>
           <w:b/>
         </w:rPr>
-        <w:t>Scripts → Post-response</w:t>
+        <w:t>Content-Type: application/json</w:t>
       </w:r>
       <w:r>
         <w:rPr>
           <w:b w:val="0"/>
         </w:rPr>
-        <w:t>, que al final borra el cliente de prueba.</w:t>
+        <w:t xml:space="preserve"> (y las cabeceras de seguridad que agrega el backend, como X-Content-Type-Options).</w:t>
       </w:r>
     </w:p>
     <w:p>
@@ -5199,77 +5281,39 @@
       </w:r>
       <w:r>
         <w:rPr>
+          <w:b/>
+        </w:rPr>
+        <w:t>Comprobaciones:</w:t>
+      </w:r>
+      <w:r>
+        <w:rPr>
           <w:b w:val="0"/>
         </w:rPr>
-        <w:t xml:space="preserve">(Opcional) Abrir la </w:t>
+        <w:t xml:space="preserve"> pestaña </w:t>
       </w:r>
       <w:r>
         <w:rPr>
           <w:b/>
         </w:rPr>
-        <w:t>Console</w:t>
+        <w:t>Test Results</w:t>
       </w:r>
       <w:r>
         <w:rPr>
           <w:b w:val="0"/>
         </w:rPr>
-        <w:t xml:space="preserve"> (abajo a la izquierda) para ver las 3 llamadas: el login, el POST y el DELETE de limpieza.</w:t>
-      </w:r>
-    </w:p>
-    <w:p>
-      <w:pPr>
-        <w:pStyle w:val="Heading2"/>
-      </w:pPr>
-      <w:r>
-        <w:t>5.2 ¿Cómo llega la petición de Vercel al backend?</w:t>
-      </w:r>
-    </w:p>
-    <w:p>
-      <w:pPr>
-        <w:spacing w:after="80"/>
-      </w:pPr>
+        <w:t xml:space="preserve"> → las 10 en verde. El código está en </w:t>
+      </w:r>
+      <w:r>
+        <w:rPr>
+          <w:b/>
+        </w:rPr>
+        <w:t>Scripts → Post-response</w:t>
+      </w:r>
       <w:r>
         <w:rPr>
           <w:b w:val="0"/>
-          <w:i w:val="0"/>
-        </w:rPr>
-        <w:t xml:space="preserve">Vercel sirve el frontend y, por una regla de frontend/vercel.json, reenvía todo lo que empieza con </w:t>
-      </w:r>
-      <w:r>
-        <w:rPr>
-          <w:b/>
-          <w:i w:val="0"/>
-        </w:rPr>
-        <w:t>/api/</w:t>
-      </w:r>
-      <w:r>
-        <w:rPr>
-          <w:b w:val="0"/>
-          <w:i w:val="0"/>
-        </w:rPr>
-        <w:t xml:space="preserve"> al backend en Render. Así Postman le pega directo a </w:t>
-      </w:r>
-      <w:r>
-        <w:rPr>
-          <w:b/>
-          <w:i w:val="0"/>
-        </w:rPr>
-        <w:t>https://sistema-gestion-elsur.vercel.app/api/clientes</w:t>
-      </w:r>
-      <w:r>
-        <w:rPr>
-          <w:b w:val="0"/>
-          <w:i w:val="0"/>
-        </w:rPr>
-        <w:t>. Como Vercel y Render se despliegan solos con cada push a la rama lucas, Postman siempre prueba la última versión publicada.</w:t>
-      </w:r>
-    </w:p>
-    <w:p>
-      <w:pPr>
-        <w:pStyle w:val="Heading2"/>
-      </w:pPr>
-      <w:r>
-        <w:t>5.3 REST Assured (Lucas): el mismo caso en Java, desde IntelliJ</w:t>
+        </w:rPr>
+        <w:t>, que al final borra el cliente de prueba.</w:t>
       </w:r>
     </w:p>
     <w:p>
@@ -5281,37 +5325,81 @@
         <w:rPr>
           <w:b/>
         </w:rPr>
-        <w:t xml:space="preserve">1. </w:t>
+        <w:t xml:space="preserve">12. </w:t>
       </w:r>
       <w:r>
         <w:rPr>
           <w:b w:val="0"/>
         </w:rPr>
-        <w:t xml:space="preserve">Abrir </w:t>
+        <w:t xml:space="preserve">(Opcional) Abrir la </w:t>
       </w:r>
       <w:r>
         <w:rPr>
           <w:b/>
         </w:rPr>
-        <w:t>src/test/java/com/elsur/sistema_gestion/api/RegistrarClienteRestAssuredTest.java</w:t>
+        <w:t>Console</w:t>
       </w:r>
       <w:r>
         <w:rPr>
           <w:b w:val="0"/>
         </w:rPr>
-        <w:t xml:space="preserve">. Está comentado para leerlo en voz alta: seguir los comentarios </w:t>
+        <w:t xml:space="preserve"> (abajo a la izquierda) para ver las 3 llamadas: el login, el POST y el DELETE de limpieza.</w:t>
+      </w:r>
+    </w:p>
+    <w:p>
+      <w:pPr>
+        <w:pStyle w:val="Heading2"/>
+      </w:pPr>
+      <w:r>
+        <w:t>5.2 ¿Cómo llega la petición de Vercel al backend?</w:t>
+      </w:r>
+    </w:p>
+    <w:p>
+      <w:pPr>
+        <w:spacing w:after="80"/>
+      </w:pPr>
+      <w:r>
+        <w:rPr>
+          <w:b w:val="0"/>
+          <w:i w:val="0"/>
+        </w:rPr>
+        <w:t xml:space="preserve">Vercel sirve el frontend y, por una regla de frontend/vercel.json, reenvía todo lo que empieza con </w:t>
       </w:r>
       <w:r>
         <w:rPr>
           <w:b/>
-        </w:rPr>
-        <w:t>PASO 1 a PASO 6</w:t>
+          <w:i w:val="0"/>
+        </w:rPr>
+        <w:t>/api/</w:t>
       </w:r>
       <w:r>
         <w:rPr>
           <w:b w:val="0"/>
-        </w:rPr>
-        <w:t>.</w:t>
+          <w:i w:val="0"/>
+        </w:rPr>
+        <w:t xml:space="preserve"> al backend en Render. Así Postman le pega directo a </w:t>
+      </w:r>
+      <w:r>
+        <w:rPr>
+          <w:b/>
+          <w:i w:val="0"/>
+        </w:rPr>
+        <w:t>https://sistema-gestion-elsur.vercel.app/api/clientes</w:t>
+      </w:r>
+      <w:r>
+        <w:rPr>
+          <w:b w:val="0"/>
+          <w:i w:val="0"/>
+        </w:rPr>
+        <w:t>. Como Vercel y Render se despliegan solos con cada push a la rama lucas, Postman siempre prueba la última versión publicada.</w:t>
+      </w:r>
+    </w:p>
+    <w:p>
+      <w:pPr>
+        <w:pStyle w:val="Heading2"/>
+      </w:pPr>
+      <w:r>
+        <w:t>5.3 REST Assured (Lucas): el mismo caso en Java, desde IntelliJ</w:t>
       </w:r>
     </w:p>
     <w:p>
@@ -5323,61 +5411,37 @@
         <w:rPr>
           <w:b/>
         </w:rPr>
-        <w:t xml:space="preserve">2. </w:t>
+        <w:t xml:space="preserve">1. </w:t>
       </w:r>
       <w:r>
         <w:rPr>
           <w:b w:val="0"/>
         </w:rPr>
-        <w:t xml:space="preserve">Mostrar las tres partes: </w:t>
+        <w:t xml:space="preserve">Abrir </w:t>
       </w:r>
       <w:r>
         <w:rPr>
           <w:b/>
         </w:rPr>
-        <w:t>@BeforeEach</w:t>
+        <w:t>src/test/java/com/elsur/sistema_gestion/api/RegistrarClienteRestAssuredTest.java</w:t>
       </w:r>
       <w:r>
         <w:rPr>
           <w:b w:val="0"/>
         </w:rPr>
-        <w:t xml:space="preserve"> (login = seguridad), </w:t>
+        <w:t xml:space="preserve">. Está comentado para leerlo en voz alta: seguir los comentarios </w:t>
       </w:r>
       <w:r>
         <w:rPr>
           <w:b/>
         </w:rPr>
-        <w:t>given()</w:t>
+        <w:t>PASO 1 a PASO 6</w:t>
       </w:r>
       <w:r>
         <w:rPr>
           <w:b w:val="0"/>
         </w:rPr>
-        <w:t xml:space="preserve"> (cabeceras y body JSON), </w:t>
-      </w:r>
-      <w:r>
-        <w:rPr>
-          <w:b/>
-        </w:rPr>
-        <w:t>when()</w:t>
-      </w:r>
-      <w:r>
-        <w:rPr>
-          <w:b w:val="0"/>
-        </w:rPr>
-        <w:t xml:space="preserve"> (el POST) y </w:t>
-      </w:r>
-      <w:r>
-        <w:rPr>
-          <w:b/>
-        </w:rPr>
-        <w:t>then()</w:t>
-      </w:r>
-      <w:r>
-        <w:rPr>
-          <w:b w:val="0"/>
-        </w:rPr>
-        <w:t xml:space="preserve"> (las 10 comprobaciones).</w:t>
+        <w:t>.</w:t>
       </w:r>
     </w:p>
     <w:p>
@@ -5389,37 +5453,61 @@
         <w:rPr>
           <w:b/>
         </w:rPr>
-        <w:t xml:space="preserve">3. </w:t>
+        <w:t xml:space="preserve">2. </w:t>
       </w:r>
       <w:r>
         <w:rPr>
           <w:b w:val="0"/>
         </w:rPr>
-        <w:t xml:space="preserve">Clic en el </w:t>
+        <w:t xml:space="preserve">Mostrar las tres partes: </w:t>
       </w:r>
       <w:r>
         <w:rPr>
           <w:b/>
         </w:rPr>
-        <w:t>triángulo verde</w:t>
+        <w:t>@BeforeEach</w:t>
       </w:r>
       <w:r>
         <w:rPr>
           <w:b w:val="0"/>
         </w:rPr>
-        <w:t xml:space="preserve"> al lado de la clase → </w:t>
+        <w:t xml:space="preserve"> (login = seguridad), </w:t>
       </w:r>
       <w:r>
         <w:rPr>
           <w:b/>
         </w:rPr>
-        <w:t>Run</w:t>
+        <w:t>given()</w:t>
       </w:r>
       <w:r>
         <w:rPr>
           <w:b w:val="0"/>
         </w:rPr>
-        <w:t>. El test levanta su propio backend (se ve el logo de Spring en la consola): no necesita internet ni nada prendido.</w:t>
+        <w:t xml:space="preserve"> (cabeceras y body JSON), </w:t>
+      </w:r>
+      <w:r>
+        <w:rPr>
+          <w:b/>
+        </w:rPr>
+        <w:t>when()</w:t>
+      </w:r>
+      <w:r>
+        <w:rPr>
+          <w:b w:val="0"/>
+        </w:rPr>
+        <w:t xml:space="preserve"> (el POST) y </w:t>
+      </w:r>
+      <w:r>
+        <w:rPr>
+          <w:b/>
+        </w:rPr>
+        <w:t>then()</w:t>
+      </w:r>
+      <w:r>
+        <w:rPr>
+          <w:b w:val="0"/>
+        </w:rPr>
+        <w:t xml:space="preserve"> (las 10 comprobaciones).</w:t>
       </w:r>
     </w:p>
     <w:p>
@@ -5431,25 +5519,37 @@
         <w:rPr>
           <w:b/>
         </w:rPr>
-        <w:t xml:space="preserve">4. </w:t>
+        <w:t xml:space="preserve">3. </w:t>
       </w:r>
       <w:r>
         <w:rPr>
           <w:b w:val="0"/>
         </w:rPr>
-        <w:t xml:space="preserve">Abajo aparece el árbol de JUnit con el test en </w:t>
+        <w:t xml:space="preserve">Clic en el </w:t>
       </w:r>
       <w:r>
         <w:rPr>
           <w:b/>
         </w:rPr>
-        <w:t>verde</w:t>
+        <w:t>triángulo verde</w:t>
       </w:r>
       <w:r>
         <w:rPr>
           <w:b w:val="0"/>
         </w:rPr>
-        <w:t>.</w:t>
+        <w:t xml:space="preserve"> al lado de la clase → </w:t>
+      </w:r>
+      <w:r>
+        <w:rPr>
+          <w:b/>
+        </w:rPr>
+        <w:t>Run</w:t>
+      </w:r>
+      <w:r>
+        <w:rPr>
+          <w:b w:val="0"/>
+        </w:rPr>
+        <w:t>. El test levanta su propio backend (se ve el logo de Spring en la consola): no necesita internet ni nada prendido.</w:t>
       </w:r>
     </w:p>
     <w:p>
@@ -5461,6 +5561,36 @@
         <w:rPr>
           <w:b/>
         </w:rPr>
+        <w:t xml:space="preserve">4. </w:t>
+      </w:r>
+      <w:r>
+        <w:rPr>
+          <w:b w:val="0"/>
+        </w:rPr>
+        <w:t xml:space="preserve">Abajo aparece el árbol de JUnit con el test en </w:t>
+      </w:r>
+      <w:r>
+        <w:rPr>
+          <w:b/>
+        </w:rPr>
+        <w:t>verde</w:t>
+      </w:r>
+      <w:r>
+        <w:rPr>
+          <w:b w:val="0"/>
+        </w:rPr>
+        <w:t>.</w:t>
+      </w:r>
+    </w:p>
+    <w:p>
+      <w:pPr>
+        <w:spacing w:after="40"/>
+        <w:ind w:left="510" w:hanging="340"/>
+      </w:pPr>
+      <w:r>
+        <w:rPr>
+          <w:b/>
+        </w:rPr>
         <w:t xml:space="preserve">5. </w:t>
       </w:r>
       <w:r>
@@ -5480,6 +5610,48 @@
           <w:b w:val="0"/>
         </w:rPr>
         <w:t xml:space="preserve"> y el JSON).</w:t>
+      </w:r>
+    </w:p>
+    <w:p>
+      <w:pPr>
+        <w:spacing w:after="40"/>
+        <w:ind w:left="510" w:hanging="340"/>
+      </w:pPr>
+      <w:r>
+        <w:rPr>
+          <w:b/>
+        </w:rPr>
+        <w:t xml:space="preserve">6. </w:t>
+      </w:r>
+      <w:r>
+        <w:rPr>
+          <w:b w:val="0"/>
+        </w:rPr>
+        <w:t xml:space="preserve">Al final de la consola aparece el cartel </w:t>
+      </w:r>
+      <w:r>
+        <w:rPr>
+          <w:b/>
+        </w:rPr>
+        <w:t>PRUEBA APROBADA: POST /api/clientes -&gt; 201 Created</w:t>
+      </w:r>
+      <w:r>
+        <w:rPr>
+          <w:b w:val="0"/>
+        </w:rPr>
+        <w:t xml:space="preserve"> (en verde). Si algo falla, sale </w:t>
+      </w:r>
+      <w:r>
+        <w:rPr>
+          <w:b/>
+        </w:rPr>
+        <w:t>PRUEBA FALLIDA</w:t>
+      </w:r>
+      <w:r>
+        <w:rPr>
+          <w:b w:val="0"/>
+        </w:rPr>
+        <w:t xml:space="preserve"> en rojo con el motivo.</w:t>
       </w:r>
     </w:p>
     <w:p>
@@ -5741,19 +5913,43 @@
         <w:rPr>
           <w:b w:val="0"/>
         </w:rPr>
-        <w:t xml:space="preserve"> en Headers, destildar la cabecera Authorization → Send → el backend responde </w:t>
+        <w:t xml:space="preserve"> en la pestaña Authorization, cambiar Type a </w:t>
       </w:r>
       <w:r>
         <w:rPr>
           <w:b/>
         </w:rPr>
+        <w:t>No Auth</w:t>
+      </w:r>
+      <w:r>
+        <w:rPr>
+          <w:b w:val="0"/>
+        </w:rPr>
+        <w:t xml:space="preserve"> → Send → el backend responde </w:t>
+      </w:r>
+      <w:r>
+        <w:rPr>
+          <w:b/>
+        </w:rPr>
         <w:t>401 Unauthorized</w:t>
       </w:r>
       <w:r>
         <w:rPr>
           <w:b w:val="0"/>
         </w:rPr>
-        <w:t xml:space="preserve"> ("Se requiere un token válido…"). Volver a tildarla.</w:t>
+        <w:t xml:space="preserve"> ("Se requiere un token válido…"). Volver a </w:t>
+      </w:r>
+      <w:r>
+        <w:rPr>
+          <w:b/>
+        </w:rPr>
+        <w:t>Bearer Token</w:t>
+      </w:r>
+      <w:r>
+        <w:rPr>
+          <w:b w:val="0"/>
+        </w:rPr>
+        <w:t>.</w:t>
       </w:r>
     </w:p>
     <w:p>
@@ -6131,7 +6327,7 @@
                 <w:b w:val="0"/>
                 <w:sz w:val="18"/>
               </w:rPr>
-              <w:t>Todo visual: Headers, Body, Status y Test Results con un clic.</w:t>
+              <w:t>Todo visual: Authorization, Headers, Body, Status y Test Results con un clic.</w:t>
             </w:r>
           </w:p>
         </w:tc>
@@ -6493,14 +6689,28 @@
                 <w:b/>
                 <w:sz w:val="18"/>
               </w:rPr>
-              <w:t>Headers</w:t>
+              <w:t>Authorization</w:t>
             </w:r>
             <w:r>
               <w:rPr>
                 <w:b w:val="0"/>
                 <w:sz w:val="18"/>
               </w:rPr>
-              <w:t xml:space="preserve"> (Authorization: Bearer y Content-Type), la pestaña </w:t>
+              <w:t xml:space="preserve"> (Bearer Token: la seguridad), </w:t>
+            </w:r>
+            <w:r>
+              <w:rPr>
+                <w:b/>
+                <w:sz w:val="18"/>
+              </w:rPr>
+              <w:t>Headers</w:t>
+            </w:r>
+            <w:r>
+              <w:rPr>
+                <w:b w:val="0"/>
+                <w:sz w:val="18"/>
+              </w:rPr>
+              <w:t xml:space="preserve"> (Content-Type) y </w:t>
             </w:r>
             <w:r>
               <w:rPr>

</xml_diff>